<commit_message>
Add Mermaid diagram pipeline and auto-numbered figure/table captions
- tools/render_diagrams.py: render assets/diagrams/*.mmd -> PNG via mermaid.ink
  (no Node/Chromium), with retry/backoff; commit both .mmd and .png so the
  docx build stays offline/deterministic
- assets/diagrams/alur-penelitian-dsr: DSR 6-stage research flow (Gambar 2.1)
- build_thesis_docx.py: embed ![](png) refs centered + fit-to-page (<=12cm wide,
  <=18cm tall); captions become Word SEQ fields (\s 1 per-bab reset) so Daftar
  Tabel/Gambar auto-populate; Gambar caption below+period, Tabel above
- bab-2: reference Gambar 2.1 in section 2.6 (DSR)
- Document diagram/figure workflow in .claude/CLAUDE.md

Co-Authored-By: Claude Opus 4.8 (1M context) <noreply@anthropic.com>
</commit_message>
<xml_diff>
--- a/draft/Draft-Tugas-Akhir-Muhammadridwan.docx
+++ b/draft/Draft-Tugas-Akhir-Muhammadridwan.docx
@@ -1093,7 +1093,7 @@
           <w:i/>
           <w:sz w:val="20"/>
         </w:rPr>
-        <w:t>Akan terisi otomatis bila setiap tabel diberi caption melalui fitur References &gt; Insert Caption (label: Tabel).</w:t>
+        <w:t>Terisi otomatis dari caption ber-SEQ; di Word tekan Ctrl+A lalu F9.</w:t>
       </w:r>
     </w:p>
     <w:p>
@@ -1137,7 +1137,7 @@
           <w:i/>
           <w:sz w:val="20"/>
         </w:rPr>
-        <w:t>Akan terisi otomatis bila setiap gambar diberi caption melalui fitur References &gt; Insert Caption (label: Gambar).</w:t>
+        <w:t>Terisi otomatis dari caption ber-SEQ; di Word tekan Ctrl+A lalu F9.</w:t>
       </w:r>
     </w:p>
     <w:p>
@@ -4221,11 +4221,69 @@
         <w:t>communication</w:t>
       </w:r>
       <w:r>
-        <w:t>).</w:t>
+        <w:t>). Alur tahapan tersebut beserta titik iterasi perbaikan diilustrasikan pada Gambar 2.1.</w:t>
       </w:r>
     </w:p>
     <w:p>
       <w:pPr>
+        <w:keepNext/>
+        <w:spacing w:before="120"/>
+        <w:jc w:val="center"/>
+      </w:pPr>
+      <w:r>
+        <w:drawing>
+          <wp:inline xmlns:a="http://schemas.openxmlformats.org/drawingml/2006/main" xmlns:pic="http://schemas.openxmlformats.org/drawingml/2006/picture">
+            <wp:extent cx="3718794" cy="6479999"/>
+            <wp:docPr id="2" name="Picture 2"/>
+            <wp:cNvGraphicFramePr>
+              <a:graphicFrameLocks noChangeAspect="1"/>
+            </wp:cNvGraphicFramePr>
+            <a:graphic>
+              <a:graphicData uri="http://schemas.openxmlformats.org/drawingml/2006/picture">
+                <pic:pic>
+                  <pic:nvPicPr>
+                    <pic:cNvPr id="0" name="alur-penelitian-dsr.png"/>
+                    <pic:cNvPicPr/>
+                  </pic:nvPicPr>
+                  <pic:blipFill>
+                    <a:blip r:embed="rId12"/>
+                    <a:stretch>
+                      <a:fillRect/>
+                    </a:stretch>
+                  </pic:blipFill>
+                  <pic:spPr>
+                    <a:xfrm>
+                      <a:off x="0" y="0"/>
+                      <a:ext cx="3718794" cy="6479999"/>
+                    </a:xfrm>
+                    <a:prstGeom prst="rect"/>
+                  </pic:spPr>
+                </pic:pic>
+              </a:graphicData>
+            </a:graphic>
+          </wp:inline>
+        </w:drawing>
+      </w:r>
+    </w:p>
+    <w:p>
+      <w:pPr>
+        <w:pStyle w:val="Caption"/>
+        <w:jc w:val="center"/>
+      </w:pPr>
+      <w:r>
+        <w:t>Gambar 2.</w:t>
+      </w:r>
+      <w:fldSimple w:instr=" SEQ Gambar \* ARABIC \s 1 ">
+        <w:r>
+          <w:t>1</w:t>
+        </w:r>
+      </w:fldSimple>
+      <w:r>
+        <w:t xml:space="preserve"> Tahapan Design Science Research pada Penelitian Ini.</w:t>
+      </w:r>
+    </w:p>
+    <w:p>
+      <w:pPr>
         <w:ind w:firstLine="720"/>
         <w:jc w:val="both"/>
       </w:pPr>
@@ -4441,23 +4499,20 @@
     </w:p>
     <w:p>
       <w:pPr>
+        <w:pStyle w:val="Caption"/>
         <w:keepNext/>
-        <w:keepLines/>
-        <w:spacing w:after="120"/>
         <w:jc w:val="center"/>
       </w:pPr>
       <w:r>
-        <w:rPr>
-          <w:b/>
-          <w:i w:val="0"/>
-          <w:sz w:val="24"/>
-        </w:rPr>
-      </w:r>
-      <w:r>
-        <w:rPr>
-          <w:b/>
-        </w:rPr>
-        <w:t>Tabel 2.1 Perbandingan Penelitian Terdahulu</w:t>
+        <w:t>Tabel 2.</w:t>
+      </w:r>
+      <w:fldSimple w:instr=" SEQ Tabel \* ARABIC \s 1 ">
+        <w:r>
+          <w:t>1</w:t>
+        </w:r>
+      </w:fldSimple>
+      <w:r>
+        <w:t xml:space="preserve"> Perbandingan Penelitian Terdahulu</w:t>
       </w:r>
     </w:p>
     <w:tbl>
@@ -7962,13 +8017,16 @@
     <w:qFormat/>
     <w:rsid w:val="00FC693F"/>
     <w:pPr>
-      <w:spacing w:line="240" w:lineRule="auto"/>
+      <w:spacing w:line="240" w:lineRule="auto" w:before="120" w:after="120"/>
+      <w:jc w:val="center"/>
     </w:pPr>
     <w:rPr>
-      <w:b/>
+      <w:rFonts w:ascii="Times New Roman" w:hAnsi="Times New Roman"/>
+      <w:b w:val="0"/>
       <w:bCs/>
-      <w:color w:val="4F81BD" w:themeColor="accent1"/>
-      <w:sz w:val="18"/>
+      <w:i w:val="0"/>
+      <w:color w:val="000000"/>
+      <w:sz w:val="24"/>
       <w:szCs w:val="18"/>
     </w:rPr>
   </w:style>

</xml_diff>

<commit_message>
Add Bab III draft with architecture diagrams, tables, and code listings
- bab/bab-3-implementasi-metode.md: 6 sub-bab implementasi metode usulan
  (analisis sistem eksisting, perancangan registry + eval framework,
  code walkthrough registry.py/runner.py, setup eksperimen terkendali)
- New Mermaid diagrams: arsitektur-tool-registry, alur-eval-runner
  (Gambar 3.1-3.2), rendered to committed PNGs
- Tabel 3.1-3.4 (metadata, skenario, dataset, parameter eksperimen)
- Kode Program 3.1-3.4 via new fenced-code-block support in the generator
  (shaded monospace + centered manual captions, kept out of Daftar)
- Wire Bab III into CHAPTERS; update context + docx-generator notes

Co-Authored-By: Claude Opus 4.8 (1M context) <noreply@anthropic.com>
</commit_message>
<xml_diff>
--- a/draft/Draft-Tugas-Akhir-Muhammadridwan.docx
+++ b/draft/Draft-Tugas-Akhir-Muhammadridwan.docx
@@ -6258,115 +6258,1396 @@
       </w:r>
     </w:p>
     <w:p>
-      <w:r>
-        <w:rPr>
-          <w:b/>
-          <w:i/>
-        </w:rPr>
-        <w:t>[BAB III BELUM DITULIS]</w:t>
+      <w:pPr>
+        <w:ind w:firstLine="720"/>
+        <w:jc w:val="both"/>
+      </w:pPr>
+      <w:r>
+        <w:t xml:space="preserve">Bab ini menguraikan rancangan dan implementasi artefak Tool Registry beserta kerangka evaluasinya, mengikuti tahap </w:t>
+      </w:r>
+      <w:r>
+        <w:rPr>
+          <w:i/>
+        </w:rPr>
+        <w:t>design and development</w:t>
+      </w:r>
+      <w:r>
+        <w:t xml:space="preserve"> pada kerangka </w:t>
+      </w:r>
+      <w:r>
+        <w:rPr>
+          <w:i/>
+        </w:rPr>
+        <w:t>Design Science Research</w:t>
+      </w:r>
+      <w:r>
+        <w:t xml:space="preserve"> [1]. Pembahasan dimulai dari analisis sistem eksisting zerlo.id sebagai sumber masalah, dilanjutkan dengan perancangan struktur metadata dan </w:t>
+      </w:r>
+      <w:r>
+        <w:rPr>
+          <w:i/>
+        </w:rPr>
+        <w:t>pipeline</w:t>
+      </w:r>
+      <w:r>
+        <w:t xml:space="preserve"> penyaringan, perancangan kerangka evaluasi, lalu penelusuran kode (</w:t>
+      </w:r>
+      <w:r>
+        <w:rPr>
+          <w:i/>
+        </w:rPr>
+        <w:t>code walkthrough</w:t>
+      </w:r>
+      <w:r>
+        <w:t xml:space="preserve">) atas implementasi Tool Registry dan </w:t>
+      </w:r>
+      <w:r>
+        <w:rPr>
+          <w:i/>
+        </w:rPr>
+        <w:t>eval runner</w:t>
+      </w:r>
+      <w:r>
+        <w:t>, dan ditutup dengan konfigurasi eksperimen yang dikendalikan.</w:t>
       </w:r>
     </w:p>
     <w:p>
       <w:pPr>
-        <w:jc w:val="both"/>
-      </w:pPr>
-      <w:r>
-        <w:t>Rencana sub-bab (mengikuti sistematika UNSIA untuk skema Tugas Akhir Prototype):</w:t>
+        <w:pStyle w:val="Heading2"/>
+      </w:pPr>
+      <w:r>
+        <w:t>3.1 Analisis Sistem Eksisting</w:t>
       </w:r>
     </w:p>
     <w:p>
       <w:pPr>
-        <w:pStyle w:val="Heading2"/>
-      </w:pPr>
-      <w:r>
-        <w:t>3.1 Analisis Sistem Eksisting</w:t>
+        <w:ind w:firstLine="720"/>
+        <w:jc w:val="both"/>
+      </w:pPr>
+      <w:r>
+        <w:t xml:space="preserve">Platform zerlo.id pada tahap </w:t>
+      </w:r>
+      <w:r>
+        <w:rPr>
+          <w:i/>
+        </w:rPr>
+        <w:t>beta testing</w:t>
+      </w:r>
+      <w:r>
+        <w:t xml:space="preserve"> mengoperasikan 38 modul bisnis dengan 1.176 </w:t>
+      </w:r>
+      <w:r>
+        <w:rPr>
+          <w:i/>
+        </w:rPr>
+        <w:t>endpoint</w:t>
+      </w:r>
+      <w:r>
+        <w:t xml:space="preserve">, 11 AI Agent aktif, dan lebih dari 60 </w:t>
+      </w:r>
+      <w:r>
+        <w:rPr>
+          <w:i/>
+        </w:rPr>
+        <w:t>tools</w:t>
+      </w:r>
+      <w:r>
+        <w:t xml:space="preserve"> produksi. Setiap </w:t>
+      </w:r>
+      <w:r>
+        <w:rPr>
+          <w:i/>
+        </w:rPr>
+        <w:t>tool</w:t>
+      </w:r>
+      <w:r>
+        <w:t xml:space="preserve"> didaftarkan ke agen secara statis melalui dekorator </w:t>
+      </w:r>
+      <w:r>
+        <w:rPr>
+          <w:i/>
+        </w:rPr>
+        <w:t>native</w:t>
+      </w:r>
+      <w:r>
+        <w:t xml:space="preserve"> Pydantic AI, sebagaimana pola </w:t>
+      </w:r>
+      <w:r>
+        <w:rPr>
+          <w:rFonts w:ascii="Courier New" w:hAnsi="Courier New"/>
+        </w:rPr>
+        <w:t>@agent.tool</w:t>
+      </w:r>
+      <w:r>
+        <w:t xml:space="preserve"> yang mendaftarkan seluruh fungsi ke dalam satu himpunan </w:t>
+      </w:r>
+      <w:r>
+        <w:rPr>
+          <w:i/>
+        </w:rPr>
+        <w:t>tool</w:t>
+      </w:r>
+      <w:r>
+        <w:t xml:space="preserve"> tunggal. Pada pola tersebut, seluruh definisi </w:t>
+      </w:r>
+      <w:r>
+        <w:rPr>
+          <w:i/>
+        </w:rPr>
+        <w:t>tool</w:t>
+      </w:r>
+      <w:r>
+        <w:t xml:space="preserve"> — nama, deskripsi, dan skema parameter — diserialisasi menjadi </w:t>
+      </w:r>
+      <w:r>
+        <w:rPr>
+          <w:i/>
+        </w:rPr>
+        <w:t>FunctionDeclaration</w:t>
+      </w:r>
+      <w:r>
+        <w:t xml:space="preserve"> dan diteruskan ke LLM pada setiap panggilan, tanpa memandang relevansinya terhadap permintaan pengguna.</w:t>
       </w:r>
     </w:p>
     <w:p>
       <w:pPr>
         <w:ind w:firstLine="720"/>
-      </w:pPr>
-      <w:r>
-        <w:rPr>
-          <w:i/>
-        </w:rPr>
-        <w:t>[konten belum ditulis]</w:t>
+        <w:jc w:val="both"/>
+      </w:pPr>
+      <w:r>
+        <w:t xml:space="preserve">Pendekatan statis ini menimbulkan </w:t>
+      </w:r>
+      <w:r>
+        <w:rPr>
+          <w:i/>
+        </w:rPr>
+        <w:t>bottleneck</w:t>
+      </w:r>
+      <w:r>
+        <w:t xml:space="preserve"> yang bersifat O(N) terhadap ukuran katalog: jumlah token input tumbuh proporsional terhadap jumlah </w:t>
+      </w:r>
+      <w:r>
+        <w:rPr>
+          <w:i/>
+        </w:rPr>
+        <w:t>tool</w:t>
+      </w:r>
+      <w:r>
+        <w:t xml:space="preserve"> yang terdaftar. Pengukuran awal pada penelitian ini menunjukkan bahwa katalog 300 </w:t>
+      </w:r>
+      <w:r>
+        <w:rPr>
+          <w:i/>
+        </w:rPr>
+        <w:t>tool</w:t>
+      </w:r>
+      <w:r>
+        <w:t xml:space="preserve"> (skenario S3) mengonsumsi rata-rata 23.893 token per kueri hanya untuk mendefinisikan </w:t>
+      </w:r>
+      <w:r>
+        <w:rPr>
+          <w:i/>
+        </w:rPr>
+        <w:t>tool</w:t>
+      </w:r>
+      <w:r>
+        <w:t xml:space="preserve"> yang tersedia, bahkan sebelum pertanyaan pengguna diproses. Konsumsi token sebesar ini berdampak langsung pada biaya inferensi, latensi respons, dan — sebagaimana dibuktikan oleh fenomena </w:t>
+      </w:r>
+      <w:r>
+        <w:rPr>
+          <w:i/>
+        </w:rPr>
+        <w:t>context rot</w:t>
+      </w:r>
+      <w:r>
+        <w:t xml:space="preserve"> yang diuraikan pada Bab II — penurunan akurasi pemilihan </w:t>
+      </w:r>
+      <w:r>
+        <w:rPr>
+          <w:i/>
+        </w:rPr>
+        <w:t>tool</w:t>
+      </w:r>
+      <w:r>
+        <w:t xml:space="preserve"> akibat sebagian definisi berada di posisi tengah konteks yang rawan diabaikan.</w:t>
       </w:r>
     </w:p>
     <w:p>
       <w:pPr>
-        <w:pStyle w:val="Heading2"/>
-      </w:pPr>
-      <w:r>
-        <w:t>3.2 Perancangan Tool Registry</w:t>
+        <w:ind w:firstLine="720"/>
+        <w:jc w:val="both"/>
+      </w:pPr>
+      <w:r>
+        <w:t xml:space="preserve">Kerangka Pydantic AI [2] menyediakan abstraksi </w:t>
+      </w:r>
+      <w:r>
+        <w:rPr>
+          <w:rFonts w:ascii="Courier New" w:hAnsi="Courier New"/>
+        </w:rPr>
+        <w:t>FilteredToolset</w:t>
+      </w:r>
+      <w:r>
+        <w:t xml:space="preserve"> yang memungkinkan penyaringan </w:t>
+      </w:r>
+      <w:r>
+        <w:rPr>
+          <w:i/>
+        </w:rPr>
+        <w:t>tool</w:t>
+      </w:r>
+      <w:r>
+        <w:t xml:space="preserve"> berdasarkan sebuah predikat tunggal. Namun antarmuka tersebut tidak dirancang untuk penyaringan multi-kriteria yang dibutuhkan platform ERP multi-modul, yakni penyaringan simultan berdasarkan modul, peran (</w:t>
+      </w:r>
+      <w:r>
+        <w:rPr>
+          <w:i/>
+        </w:rPr>
+        <w:t>role</w:t>
+      </w:r>
+      <w:r>
+        <w:t>), tingkat langganan (</w:t>
+      </w:r>
+      <w:r>
+        <w:rPr>
+          <w:i/>
+        </w:rPr>
+        <w:t>subscription tier</w:t>
+      </w:r>
+      <w:r>
+        <w:t>), dan anggaran token (</w:t>
+      </w:r>
+      <w:r>
+        <w:rPr>
+          <w:i/>
+        </w:rPr>
+        <w:t>token budget</w:t>
+      </w:r>
+      <w:r>
+        <w:t>). Kesenjangan antara kemampuan predikat tunggal dan kebutuhan penyaringan multi-kriteria inilah yang menjadi motivasi perancangan artefak Tool Registry pada penelitian ini.</w:t>
       </w:r>
     </w:p>
     <w:p>
       <w:pPr>
-        <w:ind w:firstLine="720"/>
-      </w:pPr>
-      <w:r>
-        <w:rPr>
-          <w:i/>
-        </w:rPr>
-        <w:t>[konten belum ditulis]</w:t>
+        <w:pStyle w:val="Heading2"/>
+      </w:pPr>
+      <w:r>
+        <w:t>3.2 Perancangan Tool Registry</w:t>
       </w:r>
     </w:p>
     <w:p>
       <w:pPr>
-        <w:pStyle w:val="Heading2"/>
-      </w:pPr>
-      <w:r>
-        <w:t>3.3 Perancangan Eval Framework</w:t>
+        <w:ind w:firstLine="720"/>
+        <w:jc w:val="both"/>
+      </w:pPr>
+      <w:r>
+        <w:t xml:space="preserve">Artefak utama yang dirancang adalah lapisan penyaringan deterministik berbasis metadata terstruktur yang ditempatkan di antara katalog </w:t>
+      </w:r>
+      <w:r>
+        <w:rPr>
+          <w:i/>
+        </w:rPr>
+        <w:t>tool</w:t>
+      </w:r>
+      <w:r>
+        <w:t xml:space="preserve"> dan LLM. Rancangan ini mengadaptasi prinsip </w:t>
+      </w:r>
+      <w:r>
+        <w:rPr>
+          <w:i/>
+        </w:rPr>
+        <w:t>smallest possible set of high-signal tokens</w:t>
+      </w:r>
+      <w:r>
+        <w:t xml:space="preserve"> dari rekayasa konteks Anthropic [3], yakni meneruskan hanya himpunan </w:t>
+      </w:r>
+      <w:r>
+        <w:rPr>
+          <w:i/>
+        </w:rPr>
+        <w:t>tool</w:t>
+      </w:r>
+      <w:r>
+        <w:t xml:space="preserve"> paling relevan dan sekecil mungkin kepada model.</w:t>
       </w:r>
     </w:p>
     <w:p>
       <w:pPr>
         <w:ind w:firstLine="720"/>
-      </w:pPr>
-      <w:r>
-        <w:rPr>
-          <w:i/>
-        </w:rPr>
-        <w:t>[konten belum ditulis]</w:t>
+        <w:jc w:val="both"/>
+      </w:pPr>
+      <w:r>
+        <w:t xml:space="preserve">Setiap </w:t>
+      </w:r>
+      <w:r>
+        <w:rPr>
+          <w:i/>
+        </w:rPr>
+        <w:t>tool</w:t>
+      </w:r>
+      <w:r>
+        <w:t xml:space="preserve"> direpresentasikan oleh skema metadata terstruktur yang menyimpan atribut penyaringan. Atribut-atribut tersebut dirangkum pada Tabel 3.1.</w:t>
       </w:r>
     </w:p>
     <w:p>
       <w:pPr>
-        <w:pStyle w:val="Heading2"/>
-      </w:pPr>
-      <w:r>
-        <w:t>3.4 Implementasi Tool Registry</w:t>
+        <w:pStyle w:val="Caption"/>
+        <w:keepNext/>
+        <w:jc w:val="center"/>
+      </w:pPr>
+      <w:r>
+        <w:t>Tabel 3.</w:t>
+      </w:r>
+      <w:fldSimple w:instr=" SEQ Tabel \* ARABIC \s 1 ">
+        <w:r>
+          <w:t>1</w:t>
+        </w:r>
+      </w:fldSimple>
+      <w:r>
+        <w:t xml:space="preserve"> Atribut Metadata Tool</w:t>
+      </w:r>
+    </w:p>
+    <w:tbl>
+      <w:tblPr>
+        <w:tblW w:type="auto" w:w="0"/>
+        <w:jc w:val="center"/>
+        <w:tblLook w:firstColumn="1" w:firstRow="1" w:lastColumn="0" w:lastRow="0" w:noHBand="0" w:noVBand="1" w:val="04A0"/>
+        <w:tblBorders>
+          <w:top w:val="single" w:sz="8" w:space="0" w:color="000000"/>
+          <w:bottom w:val="single" w:sz="8" w:space="0" w:color="000000"/>
+          <w:left w:val="none"/>
+          <w:right w:val="none"/>
+          <w:insideH w:val="none"/>
+          <w:insideV w:val="none"/>
+        </w:tblBorders>
+      </w:tblPr>
+      <w:tblGrid>
+        <w:gridCol w:w="2646"/>
+        <w:gridCol w:w="2646"/>
+        <w:gridCol w:w="2646"/>
+      </w:tblGrid>
+      <w:tr>
+        <w:trPr>
+          <w:cantSplit/>
+          <w:tblHeader/>
+        </w:trPr>
+        <w:tc>
+          <w:tcPr>
+            <w:tcW w:type="dxa" w:w="2646"/>
+            <w:tcBorders>
+              <w:top w:val="none"/>
+              <w:bottom w:val="single" w:sz="8" w:space="0" w:color="000000"/>
+              <w:left w:val="none"/>
+              <w:right w:val="none"/>
+            </w:tcBorders>
+          </w:tcPr>
+          <w:p>
+            <w:pPr>
+              <w:spacing w:line="240" w:lineRule="auto" w:after="0"/>
+            </w:pPr>
+            <w:r>
+              <w:rPr>
+                <w:b/>
+                <w:sz w:val="20"/>
+              </w:rPr>
+            </w:r>
+            <w:r>
+              <w:rPr>
+                <w:b/>
+                <w:sz w:val="20"/>
+              </w:rPr>
+              <w:t>Atribut</w:t>
+            </w:r>
+          </w:p>
+        </w:tc>
+        <w:tc>
+          <w:tcPr>
+            <w:tcW w:type="dxa" w:w="2646"/>
+            <w:tcBorders>
+              <w:top w:val="none"/>
+              <w:bottom w:val="single" w:sz="8" w:space="0" w:color="000000"/>
+              <w:left w:val="none"/>
+              <w:right w:val="none"/>
+            </w:tcBorders>
+          </w:tcPr>
+          <w:p>
+            <w:pPr>
+              <w:spacing w:line="240" w:lineRule="auto" w:after="0"/>
+            </w:pPr>
+            <w:r>
+              <w:rPr>
+                <w:b/>
+                <w:sz w:val="20"/>
+              </w:rPr>
+            </w:r>
+            <w:r>
+              <w:rPr>
+                <w:b/>
+                <w:sz w:val="20"/>
+              </w:rPr>
+              <w:t>Tipe</w:t>
+            </w:r>
+          </w:p>
+        </w:tc>
+        <w:tc>
+          <w:tcPr>
+            <w:tcW w:type="dxa" w:w="2646"/>
+            <w:tcBorders>
+              <w:top w:val="none"/>
+              <w:bottom w:val="single" w:sz="8" w:space="0" w:color="000000"/>
+              <w:left w:val="none"/>
+              <w:right w:val="none"/>
+            </w:tcBorders>
+          </w:tcPr>
+          <w:p>
+            <w:pPr>
+              <w:spacing w:line="240" w:lineRule="auto" w:after="0"/>
+            </w:pPr>
+            <w:r>
+              <w:rPr>
+                <w:b/>
+                <w:sz w:val="20"/>
+              </w:rPr>
+            </w:r>
+            <w:r>
+              <w:rPr>
+                <w:b/>
+                <w:sz w:val="20"/>
+              </w:rPr>
+              <w:t>Fungsi dalam Penyaringan</w:t>
+            </w:r>
+          </w:p>
+        </w:tc>
+      </w:tr>
+      <w:tr>
+        <w:trPr>
+          <w:cantSplit/>
+        </w:trPr>
+        <w:tc>
+          <w:tcPr>
+            <w:tcW w:type="dxa" w:w="2646"/>
+          </w:tcPr>
+          <w:p>
+            <w:pPr>
+              <w:spacing w:line="240" w:lineRule="auto" w:after="0"/>
+            </w:pPr>
+            <w:r>
+              <w:rPr>
+                <w:sz w:val="20"/>
+              </w:rPr>
+            </w:r>
+            <w:r>
+              <w:rPr>
+                <w:rFonts w:ascii="Courier New" w:hAnsi="Courier New"/>
+                <w:sz w:val="20"/>
+              </w:rPr>
+              <w:t>name</w:t>
+            </w:r>
+          </w:p>
+        </w:tc>
+        <w:tc>
+          <w:tcPr>
+            <w:tcW w:type="dxa" w:w="2646"/>
+          </w:tcPr>
+          <w:p>
+            <w:pPr>
+              <w:spacing w:line="240" w:lineRule="auto" w:after="0"/>
+            </w:pPr>
+            <w:r>
+              <w:rPr>
+                <w:sz w:val="20"/>
+              </w:rPr>
+            </w:r>
+            <w:r>
+              <w:rPr>
+                <w:i/>
+                <w:sz w:val="20"/>
+              </w:rPr>
+              <w:t>string</w:t>
+            </w:r>
+          </w:p>
+        </w:tc>
+        <w:tc>
+          <w:tcPr>
+            <w:tcW w:type="dxa" w:w="2646"/>
+          </w:tcPr>
+          <w:p>
+            <w:pPr>
+              <w:spacing w:line="240" w:lineRule="auto" w:after="0"/>
+            </w:pPr>
+            <w:r>
+              <w:rPr>
+                <w:sz w:val="20"/>
+              </w:rPr>
+            </w:r>
+            <w:r>
+              <w:rPr>
+                <w:sz w:val="20"/>
+              </w:rPr>
+              <w:t xml:space="preserve">Pengenal unik </w:t>
+            </w:r>
+            <w:r>
+              <w:rPr>
+                <w:i/>
+                <w:sz w:val="20"/>
+              </w:rPr>
+              <w:t>tool</w:t>
+            </w:r>
+            <w:r>
+              <w:rPr>
+                <w:sz w:val="20"/>
+              </w:rPr>
+              <w:t xml:space="preserve"> yang dipanggil LLM</w:t>
+            </w:r>
+          </w:p>
+        </w:tc>
+      </w:tr>
+      <w:tr>
+        <w:trPr>
+          <w:cantSplit/>
+        </w:trPr>
+        <w:tc>
+          <w:tcPr>
+            <w:tcW w:type="dxa" w:w="2646"/>
+          </w:tcPr>
+          <w:p>
+            <w:pPr>
+              <w:spacing w:line="240" w:lineRule="auto" w:after="0"/>
+            </w:pPr>
+            <w:r>
+              <w:rPr>
+                <w:sz w:val="20"/>
+              </w:rPr>
+            </w:r>
+            <w:r>
+              <w:rPr>
+                <w:rFonts w:ascii="Courier New" w:hAnsi="Courier New"/>
+                <w:sz w:val="20"/>
+              </w:rPr>
+              <w:t>module</w:t>
+            </w:r>
+          </w:p>
+        </w:tc>
+        <w:tc>
+          <w:tcPr>
+            <w:tcW w:type="dxa" w:w="2646"/>
+          </w:tcPr>
+          <w:p>
+            <w:pPr>
+              <w:spacing w:line="240" w:lineRule="auto" w:after="0"/>
+            </w:pPr>
+            <w:r>
+              <w:rPr>
+                <w:sz w:val="20"/>
+              </w:rPr>
+            </w:r>
+            <w:r>
+              <w:rPr>
+                <w:i/>
+                <w:sz w:val="20"/>
+              </w:rPr>
+              <w:t>string</w:t>
+            </w:r>
+          </w:p>
+        </w:tc>
+        <w:tc>
+          <w:tcPr>
+            <w:tcW w:type="dxa" w:w="2646"/>
+          </w:tcPr>
+          <w:p>
+            <w:pPr>
+              <w:spacing w:line="240" w:lineRule="auto" w:after="0"/>
+            </w:pPr>
+            <w:r>
+              <w:rPr>
+                <w:sz w:val="20"/>
+              </w:rPr>
+            </w:r>
+            <w:r>
+              <w:rPr>
+                <w:sz w:val="20"/>
+              </w:rPr>
+              <w:t xml:space="preserve">Modul pemilik </w:t>
+            </w:r>
+            <w:r>
+              <w:rPr>
+                <w:i/>
+                <w:sz w:val="20"/>
+              </w:rPr>
+              <w:t>tool</w:t>
+            </w:r>
+            <w:r>
+              <w:rPr>
+                <w:sz w:val="20"/>
+              </w:rPr>
+              <w:t>; difilter terhadap modul kueri</w:t>
+            </w:r>
+          </w:p>
+        </w:tc>
+      </w:tr>
+      <w:tr>
+        <w:trPr>
+          <w:cantSplit/>
+        </w:trPr>
+        <w:tc>
+          <w:tcPr>
+            <w:tcW w:type="dxa" w:w="2646"/>
+          </w:tcPr>
+          <w:p>
+            <w:pPr>
+              <w:spacing w:line="240" w:lineRule="auto" w:after="0"/>
+            </w:pPr>
+            <w:r>
+              <w:rPr>
+                <w:sz w:val="20"/>
+              </w:rPr>
+            </w:r>
+            <w:r>
+              <w:rPr>
+                <w:rFonts w:ascii="Courier New" w:hAnsi="Courier New"/>
+                <w:sz w:val="20"/>
+              </w:rPr>
+              <w:t>op_type</w:t>
+            </w:r>
+          </w:p>
+        </w:tc>
+        <w:tc>
+          <w:tcPr>
+            <w:tcW w:type="dxa" w:w="2646"/>
+          </w:tcPr>
+          <w:p>
+            <w:pPr>
+              <w:spacing w:line="240" w:lineRule="auto" w:after="0"/>
+            </w:pPr>
+            <w:r>
+              <w:rPr>
+                <w:sz w:val="20"/>
+              </w:rPr>
+            </w:r>
+            <w:r>
+              <w:rPr>
+                <w:i/>
+                <w:sz w:val="20"/>
+              </w:rPr>
+              <w:t>string</w:t>
+            </w:r>
+          </w:p>
+        </w:tc>
+        <w:tc>
+          <w:tcPr>
+            <w:tcW w:type="dxa" w:w="2646"/>
+          </w:tcPr>
+          <w:p>
+            <w:pPr>
+              <w:spacing w:line="240" w:lineRule="auto" w:after="0"/>
+            </w:pPr>
+            <w:r>
+              <w:rPr>
+                <w:sz w:val="20"/>
+              </w:rPr>
+            </w:r>
+            <w:r>
+              <w:rPr>
+                <w:sz w:val="20"/>
+              </w:rPr>
+              <w:t>Tipe operasi (</w:t>
+            </w:r>
+            <w:r>
+              <w:rPr>
+                <w:i/>
+                <w:sz w:val="20"/>
+              </w:rPr>
+              <w:t>read</w:t>
+            </w:r>
+            <w:r>
+              <w:rPr>
+                <w:sz w:val="20"/>
+              </w:rPr>
+              <w:t xml:space="preserve">, </w:t>
+            </w:r>
+            <w:r>
+              <w:rPr>
+                <w:i/>
+                <w:sz w:val="20"/>
+              </w:rPr>
+              <w:t>analytical</w:t>
+            </w:r>
+            <w:r>
+              <w:rPr>
+                <w:sz w:val="20"/>
+              </w:rPr>
+              <w:t xml:space="preserve">, </w:t>
+            </w:r>
+            <w:r>
+              <w:rPr>
+                <w:i/>
+                <w:sz w:val="20"/>
+              </w:rPr>
+              <w:t>write</w:t>
+            </w:r>
+            <w:r>
+              <w:rPr>
+                <w:sz w:val="20"/>
+              </w:rPr>
+              <w:t xml:space="preserve">, </w:t>
+            </w:r>
+            <w:r>
+              <w:rPr>
+                <w:i/>
+                <w:sz w:val="20"/>
+              </w:rPr>
+              <w:t>admin</w:t>
+            </w:r>
+            <w:r>
+              <w:rPr>
+                <w:sz w:val="20"/>
+              </w:rPr>
+              <w:t>)</w:t>
+            </w:r>
+          </w:p>
+        </w:tc>
+      </w:tr>
+      <w:tr>
+        <w:trPr>
+          <w:cantSplit/>
+        </w:trPr>
+        <w:tc>
+          <w:tcPr>
+            <w:tcW w:type="dxa" w:w="2646"/>
+          </w:tcPr>
+          <w:p>
+            <w:pPr>
+              <w:spacing w:line="240" w:lineRule="auto" w:after="0"/>
+            </w:pPr>
+            <w:r>
+              <w:rPr>
+                <w:sz w:val="20"/>
+              </w:rPr>
+            </w:r>
+            <w:r>
+              <w:rPr>
+                <w:rFonts w:ascii="Courier New" w:hAnsi="Courier New"/>
+                <w:sz w:val="20"/>
+              </w:rPr>
+              <w:t>roles</w:t>
+            </w:r>
+          </w:p>
+        </w:tc>
+        <w:tc>
+          <w:tcPr>
+            <w:tcW w:type="dxa" w:w="2646"/>
+          </w:tcPr>
+          <w:p>
+            <w:pPr>
+              <w:spacing w:line="240" w:lineRule="auto" w:after="0"/>
+            </w:pPr>
+            <w:r>
+              <w:rPr>
+                <w:sz w:val="20"/>
+              </w:rPr>
+            </w:r>
+            <w:r>
+              <w:rPr>
+                <w:i/>
+                <w:sz w:val="20"/>
+              </w:rPr>
+              <w:t>list</w:t>
+            </w:r>
+          </w:p>
+        </w:tc>
+        <w:tc>
+          <w:tcPr>
+            <w:tcW w:type="dxa" w:w="2646"/>
+          </w:tcPr>
+          <w:p>
+            <w:pPr>
+              <w:spacing w:line="240" w:lineRule="auto" w:after="0"/>
+            </w:pPr>
+            <w:r>
+              <w:rPr>
+                <w:sz w:val="20"/>
+              </w:rPr>
+            </w:r>
+            <w:r>
+              <w:rPr>
+                <w:sz w:val="20"/>
+              </w:rPr>
+              <w:t>Peran yang diizinkan; difilter terhadap peran kueri</w:t>
+            </w:r>
+          </w:p>
+        </w:tc>
+      </w:tr>
+      <w:tr>
+        <w:trPr>
+          <w:cantSplit/>
+        </w:trPr>
+        <w:tc>
+          <w:tcPr>
+            <w:tcW w:type="dxa" w:w="2646"/>
+          </w:tcPr>
+          <w:p>
+            <w:pPr>
+              <w:spacing w:line="240" w:lineRule="auto" w:after="0"/>
+            </w:pPr>
+            <w:r>
+              <w:rPr>
+                <w:sz w:val="20"/>
+              </w:rPr>
+            </w:r>
+            <w:r>
+              <w:rPr>
+                <w:rFonts w:ascii="Courier New" w:hAnsi="Courier New"/>
+                <w:sz w:val="20"/>
+              </w:rPr>
+              <w:t>tiers</w:t>
+            </w:r>
+          </w:p>
+        </w:tc>
+        <w:tc>
+          <w:tcPr>
+            <w:tcW w:type="dxa" w:w="2646"/>
+          </w:tcPr>
+          <w:p>
+            <w:pPr>
+              <w:spacing w:line="240" w:lineRule="auto" w:after="0"/>
+            </w:pPr>
+            <w:r>
+              <w:rPr>
+                <w:sz w:val="20"/>
+              </w:rPr>
+            </w:r>
+            <w:r>
+              <w:rPr>
+                <w:i/>
+                <w:sz w:val="20"/>
+              </w:rPr>
+              <w:t>list</w:t>
+            </w:r>
+          </w:p>
+        </w:tc>
+        <w:tc>
+          <w:tcPr>
+            <w:tcW w:type="dxa" w:w="2646"/>
+          </w:tcPr>
+          <w:p>
+            <w:pPr>
+              <w:spacing w:line="240" w:lineRule="auto" w:after="0"/>
+            </w:pPr>
+            <w:r>
+              <w:rPr>
+                <w:sz w:val="20"/>
+              </w:rPr>
+            </w:r>
+            <w:r>
+              <w:rPr>
+                <w:sz w:val="20"/>
+              </w:rPr>
+              <w:t>Tingkat langganan yang diizinkan; difilter terhadap tier kueri</w:t>
+            </w:r>
+          </w:p>
+        </w:tc>
+      </w:tr>
+      <w:tr>
+        <w:trPr>
+          <w:cantSplit/>
+        </w:trPr>
+        <w:tc>
+          <w:tcPr>
+            <w:tcW w:type="dxa" w:w="2646"/>
+          </w:tcPr>
+          <w:p>
+            <w:pPr>
+              <w:spacing w:line="240" w:lineRule="auto" w:after="0"/>
+            </w:pPr>
+            <w:r>
+              <w:rPr>
+                <w:sz w:val="20"/>
+              </w:rPr>
+            </w:r>
+            <w:r>
+              <w:rPr>
+                <w:rFonts w:ascii="Courier New" w:hAnsi="Courier New"/>
+                <w:sz w:val="20"/>
+              </w:rPr>
+              <w:t>keywords</w:t>
+            </w:r>
+          </w:p>
+        </w:tc>
+        <w:tc>
+          <w:tcPr>
+            <w:tcW w:type="dxa" w:w="2646"/>
+          </w:tcPr>
+          <w:p>
+            <w:pPr>
+              <w:spacing w:line="240" w:lineRule="auto" w:after="0"/>
+            </w:pPr>
+            <w:r>
+              <w:rPr>
+                <w:sz w:val="20"/>
+              </w:rPr>
+            </w:r>
+            <w:r>
+              <w:rPr>
+                <w:i/>
+                <w:sz w:val="20"/>
+              </w:rPr>
+              <w:t>list</w:t>
+            </w:r>
+          </w:p>
+        </w:tc>
+        <w:tc>
+          <w:tcPr>
+            <w:tcW w:type="dxa" w:w="2646"/>
+          </w:tcPr>
+          <w:p>
+            <w:pPr>
+              <w:spacing w:line="240" w:lineRule="auto" w:after="0"/>
+            </w:pPr>
+            <w:r>
+              <w:rPr>
+                <w:sz w:val="20"/>
+              </w:rPr>
+            </w:r>
+            <w:r>
+              <w:rPr>
+                <w:sz w:val="20"/>
+              </w:rPr>
+              <w:t>Kata kunci untuk skoring relevansi terhadap teks kueri</w:t>
+            </w:r>
+          </w:p>
+        </w:tc>
+      </w:tr>
+      <w:tr>
+        <w:trPr>
+          <w:cantSplit/>
+        </w:trPr>
+        <w:tc>
+          <w:tcPr>
+            <w:tcW w:type="dxa" w:w="2646"/>
+          </w:tcPr>
+          <w:p>
+            <w:pPr>
+              <w:spacing w:line="240" w:lineRule="auto" w:after="0"/>
+            </w:pPr>
+            <w:r>
+              <w:rPr>
+                <w:sz w:val="20"/>
+              </w:rPr>
+            </w:r>
+            <w:r>
+              <w:rPr>
+                <w:rFonts w:ascii="Courier New" w:hAnsi="Courier New"/>
+                <w:sz w:val="20"/>
+              </w:rPr>
+              <w:t>priority</w:t>
+            </w:r>
+          </w:p>
+        </w:tc>
+        <w:tc>
+          <w:tcPr>
+            <w:tcW w:type="dxa" w:w="2646"/>
+          </w:tcPr>
+          <w:p>
+            <w:pPr>
+              <w:spacing w:line="240" w:lineRule="auto" w:after="0"/>
+            </w:pPr>
+            <w:r>
+              <w:rPr>
+                <w:sz w:val="20"/>
+              </w:rPr>
+            </w:r>
+            <w:r>
+              <w:rPr>
+                <w:i/>
+                <w:sz w:val="20"/>
+              </w:rPr>
+              <w:t>int</w:t>
+            </w:r>
+          </w:p>
+        </w:tc>
+        <w:tc>
+          <w:tcPr>
+            <w:tcW w:type="dxa" w:w="2646"/>
+          </w:tcPr>
+          <w:p>
+            <w:pPr>
+              <w:spacing w:line="240" w:lineRule="auto" w:after="0"/>
+            </w:pPr>
+            <w:r>
+              <w:rPr>
+                <w:sz w:val="20"/>
+              </w:rPr>
+            </w:r>
+            <w:r>
+              <w:rPr>
+                <w:sz w:val="20"/>
+              </w:rPr>
+              <w:t>Bobot prioritas untuk pengurutan saat skor kata kunci seri</w:t>
+            </w:r>
+          </w:p>
+        </w:tc>
+      </w:tr>
+      <w:tr>
+        <w:trPr>
+          <w:cantSplit/>
+        </w:trPr>
+        <w:tc>
+          <w:tcPr>
+            <w:tcW w:type="dxa" w:w="2646"/>
+          </w:tcPr>
+          <w:p>
+            <w:pPr>
+              <w:spacing w:line="240" w:lineRule="auto" w:after="0"/>
+            </w:pPr>
+            <w:r>
+              <w:rPr>
+                <w:sz w:val="20"/>
+              </w:rPr>
+            </w:r>
+            <w:r>
+              <w:rPr>
+                <w:rFonts w:ascii="Courier New" w:hAnsi="Courier New"/>
+                <w:sz w:val="20"/>
+              </w:rPr>
+              <w:t>schema_tokens</w:t>
+            </w:r>
+          </w:p>
+        </w:tc>
+        <w:tc>
+          <w:tcPr>
+            <w:tcW w:type="dxa" w:w="2646"/>
+          </w:tcPr>
+          <w:p>
+            <w:pPr>
+              <w:spacing w:line="240" w:lineRule="auto" w:after="0"/>
+            </w:pPr>
+            <w:r>
+              <w:rPr>
+                <w:sz w:val="20"/>
+              </w:rPr>
+            </w:r>
+            <w:r>
+              <w:rPr>
+                <w:i/>
+                <w:sz w:val="20"/>
+              </w:rPr>
+              <w:t>int</w:t>
+            </w:r>
+          </w:p>
+        </w:tc>
+        <w:tc>
+          <w:tcPr>
+            <w:tcW w:type="dxa" w:w="2646"/>
+          </w:tcPr>
+          <w:p>
+            <w:pPr>
+              <w:spacing w:line="240" w:lineRule="auto" w:after="0"/>
+            </w:pPr>
+            <w:r>
+              <w:rPr>
+                <w:sz w:val="20"/>
+              </w:rPr>
+            </w:r>
+            <w:r>
+              <w:rPr>
+                <w:sz w:val="20"/>
+              </w:rPr>
+              <w:t xml:space="preserve">Estimasi biaya token skema </w:t>
+            </w:r>
+            <w:r>
+              <w:rPr>
+                <w:i/>
+                <w:sz w:val="20"/>
+              </w:rPr>
+              <w:t>tool</w:t>
+            </w:r>
+            <w:r>
+              <w:rPr>
+                <w:sz w:val="20"/>
+              </w:rPr>
+              <w:t xml:space="preserve"> untuk perhitungan anggaran</w:t>
+            </w:r>
+          </w:p>
+        </w:tc>
+      </w:tr>
+      <w:tr>
+        <w:trPr>
+          <w:cantSplit/>
+        </w:trPr>
+        <w:tc>
+          <w:tcPr>
+            <w:tcW w:type="dxa" w:w="2646"/>
+          </w:tcPr>
+          <w:p>
+            <w:pPr>
+              <w:spacing w:line="240" w:lineRule="auto" w:after="0"/>
+            </w:pPr>
+            <w:r>
+              <w:rPr>
+                <w:sz w:val="20"/>
+              </w:rPr>
+            </w:r>
+            <w:r>
+              <w:rPr>
+                <w:rFonts w:ascii="Courier New" w:hAnsi="Courier New"/>
+                <w:sz w:val="20"/>
+              </w:rPr>
+              <w:t>intent</w:t>
+            </w:r>
+          </w:p>
+        </w:tc>
+        <w:tc>
+          <w:tcPr>
+            <w:tcW w:type="dxa" w:w="2646"/>
+          </w:tcPr>
+          <w:p>
+            <w:pPr>
+              <w:spacing w:line="240" w:lineRule="auto" w:after="0"/>
+            </w:pPr>
+            <w:r>
+              <w:rPr>
+                <w:sz w:val="20"/>
+              </w:rPr>
+            </w:r>
+            <w:r>
+              <w:rPr>
+                <w:i/>
+                <w:sz w:val="20"/>
+              </w:rPr>
+              <w:t>string</w:t>
+            </w:r>
+          </w:p>
+        </w:tc>
+        <w:tc>
+          <w:tcPr>
+            <w:tcW w:type="dxa" w:w="2646"/>
+          </w:tcPr>
+          <w:p>
+            <w:pPr>
+              <w:spacing w:line="240" w:lineRule="auto" w:after="0"/>
+            </w:pPr>
+            <w:r>
+              <w:rPr>
+                <w:sz w:val="20"/>
+              </w:rPr>
+            </w:r>
+            <w:r>
+              <w:rPr>
+                <w:sz w:val="20"/>
+              </w:rPr>
+              <w:t xml:space="preserve">Deskripsi </w:t>
+            </w:r>
+            <w:r>
+              <w:rPr>
+                <w:i/>
+                <w:sz w:val="20"/>
+              </w:rPr>
+              <w:t>docstring</w:t>
+            </w:r>
+            <w:r>
+              <w:rPr>
+                <w:sz w:val="20"/>
+              </w:rPr>
+              <w:t xml:space="preserve"> singkat: fungsi dan kapan </w:t>
+            </w:r>
+            <w:r>
+              <w:rPr>
+                <w:i/>
+                <w:sz w:val="20"/>
+              </w:rPr>
+              <w:t>tool</w:t>
+            </w:r>
+            <w:r>
+              <w:rPr>
+                <w:sz w:val="20"/>
+              </w:rPr>
+              <w:t xml:space="preserve"> dipakai</w:t>
+            </w:r>
+          </w:p>
+        </w:tc>
+      </w:tr>
+    </w:tbl>
+    <w:p>
+      <w:pPr>
+        <w:ind w:firstLine="720"/>
+        <w:jc w:val="both"/>
+      </w:pPr>
+      <w:r>
+        <w:t xml:space="preserve">Proses penyaringan dirancang sebagai </w:t>
+      </w:r>
+      <w:r>
+        <w:rPr>
+          <w:i/>
+        </w:rPr>
+        <w:t>pipeline</w:t>
+      </w:r>
+      <w:r>
+        <w:t xml:space="preserve"> lima tahap berurutan. Tiga tahap pertama bersifat </w:t>
+      </w:r>
+      <w:r>
+        <w:rPr>
+          <w:i/>
+        </w:rPr>
+        <w:t>hard filter</w:t>
+      </w:r>
+      <w:r>
+        <w:t xml:space="preserve"> yang menggugurkan </w:t>
+      </w:r>
+      <w:r>
+        <w:rPr>
+          <w:i/>
+        </w:rPr>
+        <w:t>tool</w:t>
+      </w:r>
+      <w:r>
+        <w:t xml:space="preserve"> tidak memenuhi syarat (modul, peran, dan tier), sedangkan dua tahap terakhir melakukan skoring relevansi dan pembatasan jumlah keluaran. Arsitektur lengkap </w:t>
+      </w:r>
+      <w:r>
+        <w:rPr>
+          <w:i/>
+        </w:rPr>
+        <w:t>pipeline</w:t>
+      </w:r>
+      <w:r>
+        <w:t xml:space="preserve"> tersebut, mulai dari permintaan pengguna hingga keluaran </w:t>
+      </w:r>
+      <w:r>
+        <w:rPr>
+          <w:i/>
+        </w:rPr>
+        <w:t>tool</w:t>
+      </w:r>
+      <w:r>
+        <w:t xml:space="preserve"> yang dipanggil LLM, diilustrasikan pada Gambar 3.1.</w:t>
       </w:r>
     </w:p>
     <w:p>
       <w:pPr>
-        <w:ind w:firstLine="720"/>
-      </w:pPr>
-      <w:r>
-        <w:rPr>
-          <w:i/>
-        </w:rPr>
-        <w:t>[konten belum ditulis]</w:t>
+        <w:keepNext/>
+        <w:spacing w:before="120"/>
+        <w:jc w:val="center"/>
+      </w:pPr>
+      <w:r>
+        <w:drawing>
+          <wp:inline xmlns:a="http://schemas.openxmlformats.org/drawingml/2006/main" xmlns:pic="http://schemas.openxmlformats.org/drawingml/2006/picture">
+            <wp:extent cx="4320000" cy="2335886"/>
+            <wp:docPr id="3" name="Picture 3"/>
+            <wp:cNvGraphicFramePr>
+              <a:graphicFrameLocks noChangeAspect="1"/>
+            </wp:cNvGraphicFramePr>
+            <a:graphic>
+              <a:graphicData uri="http://schemas.openxmlformats.org/drawingml/2006/picture">
+                <pic:pic>
+                  <pic:nvPicPr>
+                    <pic:cNvPr id="0" name="arsitektur-tool-registry.png"/>
+                    <pic:cNvPicPr/>
+                  </pic:nvPicPr>
+                  <pic:blipFill>
+                    <a:blip r:embed="rId13"/>
+                    <a:stretch>
+                      <a:fillRect/>
+                    </a:stretch>
+                  </pic:blipFill>
+                  <pic:spPr>
+                    <a:xfrm>
+                      <a:off x="0" y="0"/>
+                      <a:ext cx="4320000" cy="2335886"/>
+                    </a:xfrm>
+                    <a:prstGeom prst="rect"/>
+                  </pic:spPr>
+                </pic:pic>
+              </a:graphicData>
+            </a:graphic>
+          </wp:inline>
+        </w:drawing>
       </w:r>
     </w:p>
     <w:p>
       <w:pPr>
-        <w:pStyle w:val="Heading2"/>
-      </w:pPr>
-      <w:r>
-        <w:t>3.5 Implementasi Eval Runner</w:t>
+        <w:pStyle w:val="Caption"/>
+        <w:jc w:val="center"/>
+      </w:pPr>
+      <w:r>
+        <w:t>Gambar 3.</w:t>
+      </w:r>
+      <w:fldSimple w:instr=" SEQ Gambar \* ARABIC \s 1 ">
+        <w:r>
+          <w:t>1</w:t>
+        </w:r>
+      </w:fldSimple>
+      <w:r>
+        <w:t xml:space="preserve"> Arsitektur Pipeline Penyaringan Tool Registry.</w:t>
       </w:r>
     </w:p>
     <w:p>
       <w:pPr>
         <w:ind w:firstLine="720"/>
-      </w:pPr>
-      <w:r>
-        <w:rPr>
-          <w:i/>
-        </w:rPr>
-        <w:t>[konten belum ditulis]</w:t>
+        <w:jc w:val="both"/>
+      </w:pPr>
+      <w:r>
+        <w:t xml:space="preserve">Sebagaimana ditunjukkan pada Gambar 3.1, katalog </w:t>
+      </w:r>
+      <w:r>
+        <w:rPr>
+          <w:rFonts w:ascii="Courier New" w:hAnsi="Courier New"/>
+        </w:rPr>
+        <w:t>ToolMeta</w:t>
+      </w:r>
+      <w:r>
+        <w:t xml:space="preserve"> disaring secara berurutan terhadap konteks kueri, lalu sisa kandidat diurutkan berdasarkan tumpang-tindih kata kunci, prioritas, dan </w:t>
+      </w:r>
+      <w:r>
+        <w:rPr>
+          <w:i/>
+        </w:rPr>
+        <w:t>hash</w:t>
+      </w:r>
+      <w:r>
+        <w:t xml:space="preserve"> stabil sebagai pemecah seri yang deterministik. Hasil akhir dibatasi oleh </w:t>
+      </w:r>
+      <w:r>
+        <w:rPr>
+          <w:i/>
+        </w:rPr>
+        <w:t>budget cap</w:t>
+      </w:r>
+      <w:r>
+        <w:t xml:space="preserve"> sebesar 15 </w:t>
+      </w:r>
+      <w:r>
+        <w:rPr>
+          <w:i/>
+        </w:rPr>
+        <w:t>tool</w:t>
+      </w:r>
+      <w:r>
+        <w:t xml:space="preserve"> sebelum diserialisasi menjadi </w:t>
+      </w:r>
+      <w:r>
+        <w:rPr>
+          <w:i/>
+        </w:rPr>
+        <w:t>FunctionDeclaration</w:t>
+      </w:r>
+      <w:r>
+        <w:t xml:space="preserve">. Dengan demikian, jumlah </w:t>
+      </w:r>
+      <w:r>
+        <w:rPr>
+          <w:i/>
+        </w:rPr>
+        <w:t>tool</w:t>
+      </w:r>
+      <w:r>
+        <w:t xml:space="preserve"> yang terlihat oleh LLM bersifat konstan (O(1) terhadap anggaran) meskipun ukuran katalog bertambah — properti yang menjadi dasar pengujian skalabilitas </w:t>
+      </w:r>
+      <w:r>
+        <w:rPr>
+          <w:i/>
+        </w:rPr>
+        <w:t>sub-linear</w:t>
+      </w:r>
+      <w:r>
+        <w:t xml:space="preserve"> pada Bab IV.</w:t>
       </w:r>
     </w:p>
     <w:p>
@@ -6374,18 +7655,3257 @@
         <w:pStyle w:val="Heading2"/>
       </w:pPr>
       <w:r>
-        <w:t>3.6 Setup Eksperimen</w:t>
+        <w:t>3.3 Perancangan Eval Framework</w:t>
       </w:r>
     </w:p>
     <w:p>
       <w:pPr>
         <w:ind w:firstLine="720"/>
-      </w:pPr>
-      <w:r>
-        <w:rPr>
-          <w:i/>
-        </w:rPr>
-        <w:t>[konten belum ditulis]</w:t>
+        <w:jc w:val="both"/>
+      </w:pPr>
+      <w:r>
+        <w:t xml:space="preserve">Untuk mengukur dampak Tool Registry secara kuantitatif, dirancang kerangka evaluasi yang membandingkan dua mode pada katalog identik: mode </w:t>
+      </w:r>
+      <w:r>
+        <w:rPr>
+          <w:i/>
+        </w:rPr>
+        <w:t>baseline</w:t>
+      </w:r>
+      <w:r>
+        <w:t xml:space="preserve"> yang meneruskan seluruh </w:t>
+      </w:r>
+      <w:r>
+        <w:rPr>
+          <w:i/>
+        </w:rPr>
+        <w:t>tool</w:t>
+      </w:r>
+      <w:r>
+        <w:t xml:space="preserve"> katalog ke LLM, dan mode </w:t>
+      </w:r>
+      <w:r>
+        <w:rPr>
+          <w:i/>
+        </w:rPr>
+        <w:t>registry</w:t>
+      </w:r>
+      <w:r>
+        <w:t xml:space="preserve"> yang menerapkan </w:t>
+      </w:r>
+      <w:r>
+        <w:rPr>
+          <w:i/>
+        </w:rPr>
+        <w:t>pipeline</w:t>
+      </w:r>
+      <w:r>
+        <w:t xml:space="preserve"> penyaringan terlebih dahulu. Perbandingan berpasangan ini memastikan bahwa selisih metrik yang teramati murni disebabkan oleh perlakuan penyaringan, bukan oleh perbedaan kueri atau katalog.</w:t>
+      </w:r>
+    </w:p>
+    <w:p>
+      <w:pPr>
+        <w:ind w:firstLine="720"/>
+        <w:jc w:val="both"/>
+      </w:pPr>
+      <w:r>
+        <w:t>Evaluasi dijalankan pada empat skenario katalog dengan ukuran bertingkat untuk menguji perilaku penskalaan. Definisi tiap skenario dirangkum pada Tabel 3.2.</w:t>
+      </w:r>
+    </w:p>
+    <w:p>
+      <w:pPr>
+        <w:pStyle w:val="Caption"/>
+        <w:keepNext/>
+        <w:jc w:val="center"/>
+      </w:pPr>
+      <w:r>
+        <w:t>Tabel 3.</w:t>
+      </w:r>
+      <w:fldSimple w:instr=" SEQ Tabel \* ARABIC \s 1 ">
+        <w:r>
+          <w:t>1</w:t>
+        </w:r>
+      </w:fldSimple>
+      <w:r>
+        <w:t xml:space="preserve"> Definisi Skenario Eksperimen</w:t>
+      </w:r>
+    </w:p>
+    <w:tbl>
+      <w:tblPr>
+        <w:tblW w:type="auto" w:w="0"/>
+        <w:jc w:val="center"/>
+        <w:tblLook w:firstColumn="1" w:firstRow="1" w:lastColumn="0" w:lastRow="0" w:noHBand="0" w:noVBand="1" w:val="04A0"/>
+        <w:tblBorders>
+          <w:top w:val="single" w:sz="8" w:space="0" w:color="000000"/>
+          <w:bottom w:val="single" w:sz="8" w:space="0" w:color="000000"/>
+          <w:left w:val="none"/>
+          <w:right w:val="none"/>
+          <w:insideH w:val="none"/>
+          <w:insideV w:val="none"/>
+        </w:tblBorders>
+      </w:tblPr>
+      <w:tblGrid>
+        <w:gridCol w:w="1587"/>
+        <w:gridCol w:w="1587"/>
+        <w:gridCol w:w="1587"/>
+        <w:gridCol w:w="1587"/>
+        <w:gridCol w:w="1587"/>
+      </w:tblGrid>
+      <w:tr>
+        <w:trPr>
+          <w:cantSplit/>
+          <w:tblHeader/>
+        </w:trPr>
+        <w:tc>
+          <w:tcPr>
+            <w:tcW w:type="dxa" w:w="1587"/>
+            <w:tcBorders>
+              <w:top w:val="none"/>
+              <w:bottom w:val="single" w:sz="8" w:space="0" w:color="000000"/>
+              <w:left w:val="none"/>
+              <w:right w:val="none"/>
+            </w:tcBorders>
+          </w:tcPr>
+          <w:p>
+            <w:pPr>
+              <w:spacing w:line="240" w:lineRule="auto" w:after="0"/>
+            </w:pPr>
+            <w:r>
+              <w:rPr>
+                <w:b/>
+                <w:sz w:val="20"/>
+              </w:rPr>
+            </w:r>
+            <w:r>
+              <w:rPr>
+                <w:b/>
+                <w:sz w:val="20"/>
+              </w:rPr>
+              <w:t>Skenario</w:t>
+            </w:r>
+          </w:p>
+        </w:tc>
+        <w:tc>
+          <w:tcPr>
+            <w:tcW w:type="dxa" w:w="1587"/>
+            <w:tcBorders>
+              <w:top w:val="none"/>
+              <w:bottom w:val="single" w:sz="8" w:space="0" w:color="000000"/>
+              <w:left w:val="none"/>
+              <w:right w:val="none"/>
+            </w:tcBorders>
+          </w:tcPr>
+          <w:p>
+            <w:pPr>
+              <w:spacing w:line="240" w:lineRule="auto" w:after="0"/>
+            </w:pPr>
+            <w:r>
+              <w:rPr>
+                <w:b/>
+                <w:sz w:val="20"/>
+              </w:rPr>
+            </w:r>
+            <w:r>
+              <w:rPr>
+                <w:b/>
+                <w:sz w:val="20"/>
+              </w:rPr>
+              <w:t>Jumlah Modul</w:t>
+            </w:r>
+          </w:p>
+        </w:tc>
+        <w:tc>
+          <w:tcPr>
+            <w:tcW w:type="dxa" w:w="1587"/>
+            <w:tcBorders>
+              <w:top w:val="none"/>
+              <w:bottom w:val="single" w:sz="8" w:space="0" w:color="000000"/>
+              <w:left w:val="none"/>
+              <w:right w:val="none"/>
+            </w:tcBorders>
+          </w:tcPr>
+          <w:p>
+            <w:pPr>
+              <w:spacing w:line="240" w:lineRule="auto" w:after="0"/>
+            </w:pPr>
+            <w:r>
+              <w:rPr>
+                <w:b/>
+                <w:sz w:val="20"/>
+              </w:rPr>
+            </w:r>
+            <w:r>
+              <w:rPr>
+                <w:b/>
+                <w:sz w:val="20"/>
+              </w:rPr>
+              <w:t>Tool per Modul</w:t>
+            </w:r>
+          </w:p>
+        </w:tc>
+        <w:tc>
+          <w:tcPr>
+            <w:tcW w:type="dxa" w:w="1587"/>
+            <w:tcBorders>
+              <w:top w:val="none"/>
+              <w:bottom w:val="single" w:sz="8" w:space="0" w:color="000000"/>
+              <w:left w:val="none"/>
+              <w:right w:val="none"/>
+            </w:tcBorders>
+          </w:tcPr>
+          <w:p>
+            <w:pPr>
+              <w:spacing w:line="240" w:lineRule="auto" w:after="0"/>
+            </w:pPr>
+            <w:r>
+              <w:rPr>
+                <w:b/>
+                <w:sz w:val="20"/>
+              </w:rPr>
+            </w:r>
+            <w:r>
+              <w:rPr>
+                <w:b/>
+                <w:sz w:val="20"/>
+              </w:rPr>
+              <w:t>Total Tool</w:t>
+            </w:r>
+          </w:p>
+        </w:tc>
+        <w:tc>
+          <w:tcPr>
+            <w:tcW w:type="dxa" w:w="1587"/>
+            <w:tcBorders>
+              <w:top w:val="none"/>
+              <w:bottom w:val="single" w:sz="8" w:space="0" w:color="000000"/>
+              <w:left w:val="none"/>
+              <w:right w:val="none"/>
+            </w:tcBorders>
+          </w:tcPr>
+          <w:p>
+            <w:pPr>
+              <w:spacing w:line="240" w:lineRule="auto" w:after="0"/>
+            </w:pPr>
+            <w:r>
+              <w:rPr>
+                <w:b/>
+                <w:sz w:val="20"/>
+              </w:rPr>
+            </w:r>
+            <w:r>
+              <w:rPr>
+                <w:b/>
+                <w:sz w:val="20"/>
+              </w:rPr>
+              <w:t>Status Eksekusi</w:t>
+            </w:r>
+          </w:p>
+        </w:tc>
+      </w:tr>
+      <w:tr>
+        <w:trPr>
+          <w:cantSplit/>
+        </w:trPr>
+        <w:tc>
+          <w:tcPr>
+            <w:tcW w:type="dxa" w:w="1587"/>
+          </w:tcPr>
+          <w:p>
+            <w:pPr>
+              <w:spacing w:line="240" w:lineRule="auto" w:after="0"/>
+            </w:pPr>
+            <w:r>
+              <w:rPr>
+                <w:sz w:val="20"/>
+              </w:rPr>
+            </w:r>
+            <w:r>
+              <w:rPr>
+                <w:sz w:val="20"/>
+              </w:rPr>
+              <w:t>S1</w:t>
+            </w:r>
+          </w:p>
+        </w:tc>
+        <w:tc>
+          <w:tcPr>
+            <w:tcW w:type="dxa" w:w="1587"/>
+          </w:tcPr>
+          <w:p>
+            <w:pPr>
+              <w:spacing w:line="240" w:lineRule="auto" w:after="0"/>
+            </w:pPr>
+            <w:r>
+              <w:rPr>
+                <w:sz w:val="20"/>
+              </w:rPr>
+            </w:r>
+            <w:r>
+              <w:rPr>
+                <w:sz w:val="20"/>
+              </w:rPr>
+              <w:t>3</w:t>
+            </w:r>
+          </w:p>
+        </w:tc>
+        <w:tc>
+          <w:tcPr>
+            <w:tcW w:type="dxa" w:w="1587"/>
+          </w:tcPr>
+          <w:p>
+            <w:pPr>
+              <w:spacing w:line="240" w:lineRule="auto" w:after="0"/>
+            </w:pPr>
+            <w:r>
+              <w:rPr>
+                <w:sz w:val="20"/>
+              </w:rPr>
+            </w:r>
+            <w:r>
+              <w:rPr>
+                <w:sz w:val="20"/>
+              </w:rPr>
+              <w:t>10</w:t>
+            </w:r>
+          </w:p>
+        </w:tc>
+        <w:tc>
+          <w:tcPr>
+            <w:tcW w:type="dxa" w:w="1587"/>
+          </w:tcPr>
+          <w:p>
+            <w:pPr>
+              <w:spacing w:line="240" w:lineRule="auto" w:after="0"/>
+            </w:pPr>
+            <w:r>
+              <w:rPr>
+                <w:sz w:val="20"/>
+              </w:rPr>
+            </w:r>
+            <w:r>
+              <w:rPr>
+                <w:sz w:val="20"/>
+              </w:rPr>
+              <w:t>30</w:t>
+            </w:r>
+          </w:p>
+        </w:tc>
+        <w:tc>
+          <w:tcPr>
+            <w:tcW w:type="dxa" w:w="1587"/>
+          </w:tcPr>
+          <w:p>
+            <w:pPr>
+              <w:spacing w:line="240" w:lineRule="auto" w:after="0"/>
+            </w:pPr>
+            <w:r>
+              <w:rPr>
+                <w:sz w:val="20"/>
+              </w:rPr>
+            </w:r>
+            <w:r>
+              <w:rPr>
+                <w:i/>
+                <w:sz w:val="20"/>
+              </w:rPr>
+              <w:t>Live</w:t>
+            </w:r>
+            <w:r>
+              <w:rPr>
+                <w:sz w:val="20"/>
+              </w:rPr>
+              <w:t xml:space="preserve"> (Gemini)</w:t>
+            </w:r>
+          </w:p>
+        </w:tc>
+      </w:tr>
+      <w:tr>
+        <w:trPr>
+          <w:cantSplit/>
+        </w:trPr>
+        <w:tc>
+          <w:tcPr>
+            <w:tcW w:type="dxa" w:w="1587"/>
+          </w:tcPr>
+          <w:p>
+            <w:pPr>
+              <w:spacing w:line="240" w:lineRule="auto" w:after="0"/>
+            </w:pPr>
+            <w:r>
+              <w:rPr>
+                <w:sz w:val="20"/>
+              </w:rPr>
+            </w:r>
+            <w:r>
+              <w:rPr>
+                <w:sz w:val="20"/>
+              </w:rPr>
+              <w:t>S2</w:t>
+            </w:r>
+          </w:p>
+        </w:tc>
+        <w:tc>
+          <w:tcPr>
+            <w:tcW w:type="dxa" w:w="1587"/>
+          </w:tcPr>
+          <w:p>
+            <w:pPr>
+              <w:spacing w:line="240" w:lineRule="auto" w:after="0"/>
+            </w:pPr>
+            <w:r>
+              <w:rPr>
+                <w:sz w:val="20"/>
+              </w:rPr>
+            </w:r>
+            <w:r>
+              <w:rPr>
+                <w:sz w:val="20"/>
+              </w:rPr>
+              <w:t>5</w:t>
+            </w:r>
+          </w:p>
+        </w:tc>
+        <w:tc>
+          <w:tcPr>
+            <w:tcW w:type="dxa" w:w="1587"/>
+          </w:tcPr>
+          <w:p>
+            <w:pPr>
+              <w:spacing w:line="240" w:lineRule="auto" w:after="0"/>
+            </w:pPr>
+            <w:r>
+              <w:rPr>
+                <w:sz w:val="20"/>
+              </w:rPr>
+            </w:r>
+            <w:r>
+              <w:rPr>
+                <w:sz w:val="20"/>
+              </w:rPr>
+              <w:t>20</w:t>
+            </w:r>
+          </w:p>
+        </w:tc>
+        <w:tc>
+          <w:tcPr>
+            <w:tcW w:type="dxa" w:w="1587"/>
+          </w:tcPr>
+          <w:p>
+            <w:pPr>
+              <w:spacing w:line="240" w:lineRule="auto" w:after="0"/>
+            </w:pPr>
+            <w:r>
+              <w:rPr>
+                <w:sz w:val="20"/>
+              </w:rPr>
+            </w:r>
+            <w:r>
+              <w:rPr>
+                <w:sz w:val="20"/>
+              </w:rPr>
+              <w:t>100</w:t>
+            </w:r>
+          </w:p>
+        </w:tc>
+        <w:tc>
+          <w:tcPr>
+            <w:tcW w:type="dxa" w:w="1587"/>
+          </w:tcPr>
+          <w:p>
+            <w:pPr>
+              <w:spacing w:line="240" w:lineRule="auto" w:after="0"/>
+            </w:pPr>
+            <w:r>
+              <w:rPr>
+                <w:sz w:val="20"/>
+              </w:rPr>
+            </w:r>
+            <w:r>
+              <w:rPr>
+                <w:i/>
+                <w:sz w:val="20"/>
+              </w:rPr>
+              <w:t>Live</w:t>
+            </w:r>
+            <w:r>
+              <w:rPr>
+                <w:sz w:val="20"/>
+              </w:rPr>
+              <w:t xml:space="preserve"> (Gemini)</w:t>
+            </w:r>
+          </w:p>
+        </w:tc>
+      </w:tr>
+      <w:tr>
+        <w:trPr>
+          <w:cantSplit/>
+        </w:trPr>
+        <w:tc>
+          <w:tcPr>
+            <w:tcW w:type="dxa" w:w="1587"/>
+          </w:tcPr>
+          <w:p>
+            <w:pPr>
+              <w:spacing w:line="240" w:lineRule="auto" w:after="0"/>
+            </w:pPr>
+            <w:r>
+              <w:rPr>
+                <w:sz w:val="20"/>
+              </w:rPr>
+            </w:r>
+            <w:r>
+              <w:rPr>
+                <w:sz w:val="20"/>
+              </w:rPr>
+              <w:t>S3</w:t>
+            </w:r>
+          </w:p>
+        </w:tc>
+        <w:tc>
+          <w:tcPr>
+            <w:tcW w:type="dxa" w:w="1587"/>
+          </w:tcPr>
+          <w:p>
+            <w:pPr>
+              <w:spacing w:line="240" w:lineRule="auto" w:after="0"/>
+            </w:pPr>
+            <w:r>
+              <w:rPr>
+                <w:sz w:val="20"/>
+              </w:rPr>
+            </w:r>
+            <w:r>
+              <w:rPr>
+                <w:sz w:val="20"/>
+              </w:rPr>
+              <w:t>10</w:t>
+            </w:r>
+          </w:p>
+        </w:tc>
+        <w:tc>
+          <w:tcPr>
+            <w:tcW w:type="dxa" w:w="1587"/>
+          </w:tcPr>
+          <w:p>
+            <w:pPr>
+              <w:spacing w:line="240" w:lineRule="auto" w:after="0"/>
+            </w:pPr>
+            <w:r>
+              <w:rPr>
+                <w:sz w:val="20"/>
+              </w:rPr>
+            </w:r>
+            <w:r>
+              <w:rPr>
+                <w:sz w:val="20"/>
+              </w:rPr>
+              <w:t>30</w:t>
+            </w:r>
+          </w:p>
+        </w:tc>
+        <w:tc>
+          <w:tcPr>
+            <w:tcW w:type="dxa" w:w="1587"/>
+          </w:tcPr>
+          <w:p>
+            <w:pPr>
+              <w:spacing w:line="240" w:lineRule="auto" w:after="0"/>
+            </w:pPr>
+            <w:r>
+              <w:rPr>
+                <w:sz w:val="20"/>
+              </w:rPr>
+            </w:r>
+            <w:r>
+              <w:rPr>
+                <w:sz w:val="20"/>
+              </w:rPr>
+              <w:t>300</w:t>
+            </w:r>
+          </w:p>
+        </w:tc>
+        <w:tc>
+          <w:tcPr>
+            <w:tcW w:type="dxa" w:w="1587"/>
+          </w:tcPr>
+          <w:p>
+            <w:pPr>
+              <w:spacing w:line="240" w:lineRule="auto" w:after="0"/>
+            </w:pPr>
+            <w:r>
+              <w:rPr>
+                <w:sz w:val="20"/>
+              </w:rPr>
+            </w:r>
+            <w:r>
+              <w:rPr>
+                <w:i/>
+                <w:sz w:val="20"/>
+              </w:rPr>
+              <w:t>Live</w:t>
+            </w:r>
+            <w:r>
+              <w:rPr>
+                <w:sz w:val="20"/>
+              </w:rPr>
+              <w:t xml:space="preserve"> (Gemini)</w:t>
+            </w:r>
+          </w:p>
+        </w:tc>
+      </w:tr>
+      <w:tr>
+        <w:trPr>
+          <w:cantSplit/>
+        </w:trPr>
+        <w:tc>
+          <w:tcPr>
+            <w:tcW w:type="dxa" w:w="1587"/>
+          </w:tcPr>
+          <w:p>
+            <w:pPr>
+              <w:spacing w:line="240" w:lineRule="auto" w:after="0"/>
+            </w:pPr>
+            <w:r>
+              <w:rPr>
+                <w:sz w:val="20"/>
+              </w:rPr>
+            </w:r>
+            <w:r>
+              <w:rPr>
+                <w:sz w:val="20"/>
+              </w:rPr>
+              <w:t>S4</w:t>
+            </w:r>
+          </w:p>
+        </w:tc>
+        <w:tc>
+          <w:tcPr>
+            <w:tcW w:type="dxa" w:w="1587"/>
+          </w:tcPr>
+          <w:p>
+            <w:pPr>
+              <w:spacing w:line="240" w:lineRule="auto" w:after="0"/>
+            </w:pPr>
+            <w:r>
+              <w:rPr>
+                <w:sz w:val="20"/>
+              </w:rPr>
+            </w:r>
+            <w:r>
+              <w:rPr>
+                <w:sz w:val="20"/>
+              </w:rPr>
+              <w:t>20</w:t>
+            </w:r>
+          </w:p>
+        </w:tc>
+        <w:tc>
+          <w:tcPr>
+            <w:tcW w:type="dxa" w:w="1587"/>
+          </w:tcPr>
+          <w:p>
+            <w:pPr>
+              <w:spacing w:line="240" w:lineRule="auto" w:after="0"/>
+            </w:pPr>
+            <w:r>
+              <w:rPr>
+                <w:sz w:val="20"/>
+              </w:rPr>
+            </w:r>
+            <w:r>
+              <w:rPr>
+                <w:sz w:val="20"/>
+              </w:rPr>
+              <w:t>50</w:t>
+            </w:r>
+          </w:p>
+        </w:tc>
+        <w:tc>
+          <w:tcPr>
+            <w:tcW w:type="dxa" w:w="1587"/>
+          </w:tcPr>
+          <w:p>
+            <w:pPr>
+              <w:spacing w:line="240" w:lineRule="auto" w:after="0"/>
+            </w:pPr>
+            <w:r>
+              <w:rPr>
+                <w:sz w:val="20"/>
+              </w:rPr>
+            </w:r>
+            <w:r>
+              <w:rPr>
+                <w:sz w:val="20"/>
+              </w:rPr>
+              <w:t>1.000</w:t>
+            </w:r>
+          </w:p>
+        </w:tc>
+        <w:tc>
+          <w:tcPr>
+            <w:tcW w:type="dxa" w:w="1587"/>
+          </w:tcPr>
+          <w:p>
+            <w:pPr>
+              <w:spacing w:line="240" w:lineRule="auto" w:after="0"/>
+            </w:pPr>
+            <w:r>
+              <w:rPr>
+                <w:sz w:val="20"/>
+              </w:rPr>
+            </w:r>
+            <w:r>
+              <w:rPr>
+                <w:sz w:val="20"/>
+              </w:rPr>
+              <w:t>Simulasi deterministik</w:t>
+            </w:r>
+          </w:p>
+        </w:tc>
+      </w:tr>
+    </w:tbl>
+    <w:p>
+      <w:pPr>
+        <w:ind w:firstLine="720"/>
+        <w:jc w:val="both"/>
+      </w:pPr>
+      <w:r>
+        <w:t xml:space="preserve">Skenario S1–S3 dijalankan secara </w:t>
+      </w:r>
+      <w:r>
+        <w:rPr>
+          <w:i/>
+        </w:rPr>
+        <w:t>live</w:t>
+      </w:r>
+      <w:r>
+        <w:t xml:space="preserve"> terhadap LLM, sedangkan S4 (1.000 </w:t>
+      </w:r>
+      <w:r>
+        <w:rPr>
+          <w:i/>
+        </w:rPr>
+        <w:t>tool</w:t>
+      </w:r>
+      <w:r>
+        <w:t>) hanya disimulasikan secara deterministik untuk mengilustrasikan tren penskalaan tanpa membebani kuota inferensi. Dataset evaluasi terdiri dari 100 kueri berbahasa Indonesia yang dirancang menyerupai permintaan operasional restoran nyata, dengan komposisi sebagaimana disajikan pada Tabel 3.3.</w:t>
+      </w:r>
+    </w:p>
+    <w:p>
+      <w:pPr>
+        <w:pStyle w:val="Caption"/>
+        <w:keepNext/>
+        <w:jc w:val="center"/>
+      </w:pPr>
+      <w:r>
+        <w:t>Tabel 3.</w:t>
+      </w:r>
+      <w:fldSimple w:instr=" SEQ Tabel \* ARABIC \s 1 ">
+        <w:r>
+          <w:t>1</w:t>
+        </w:r>
+      </w:fldSimple>
+      <w:r>
+        <w:t xml:space="preserve"> Komposisi Dataset 100 Kueri</w:t>
+      </w:r>
+    </w:p>
+    <w:tbl>
+      <w:tblPr>
+        <w:tblW w:type="auto" w:w="0"/>
+        <w:jc w:val="center"/>
+        <w:tblLook w:firstColumn="1" w:firstRow="1" w:lastColumn="0" w:lastRow="0" w:noHBand="0" w:noVBand="1" w:val="04A0"/>
+        <w:tblBorders>
+          <w:top w:val="single" w:sz="8" w:space="0" w:color="000000"/>
+          <w:bottom w:val="single" w:sz="8" w:space="0" w:color="000000"/>
+          <w:left w:val="none"/>
+          <w:right w:val="none"/>
+          <w:insideH w:val="none"/>
+          <w:insideV w:val="none"/>
+        </w:tblBorders>
+      </w:tblPr>
+      <w:tblGrid>
+        <w:gridCol w:w="2646"/>
+        <w:gridCol w:w="2646"/>
+        <w:gridCol w:w="2646"/>
+      </w:tblGrid>
+      <w:tr>
+        <w:trPr>
+          <w:cantSplit/>
+          <w:tblHeader/>
+        </w:trPr>
+        <w:tc>
+          <w:tcPr>
+            <w:tcW w:type="dxa" w:w="2646"/>
+            <w:tcBorders>
+              <w:top w:val="none"/>
+              <w:bottom w:val="single" w:sz="8" w:space="0" w:color="000000"/>
+              <w:left w:val="none"/>
+              <w:right w:val="none"/>
+            </w:tcBorders>
+          </w:tcPr>
+          <w:p>
+            <w:pPr>
+              <w:spacing w:line="240" w:lineRule="auto" w:after="0"/>
+            </w:pPr>
+            <w:r>
+              <w:rPr>
+                <w:b/>
+                <w:sz w:val="20"/>
+              </w:rPr>
+            </w:r>
+            <w:r>
+              <w:rPr>
+                <w:b/>
+                <w:sz w:val="20"/>
+              </w:rPr>
+              <w:t>Kategori Kueri</w:t>
+            </w:r>
+          </w:p>
+        </w:tc>
+        <w:tc>
+          <w:tcPr>
+            <w:tcW w:type="dxa" w:w="2646"/>
+            <w:tcBorders>
+              <w:top w:val="none"/>
+              <w:bottom w:val="single" w:sz="8" w:space="0" w:color="000000"/>
+              <w:left w:val="none"/>
+              <w:right w:val="none"/>
+            </w:tcBorders>
+          </w:tcPr>
+          <w:p>
+            <w:pPr>
+              <w:spacing w:line="240" w:lineRule="auto" w:after="0"/>
+            </w:pPr>
+            <w:r>
+              <w:rPr>
+                <w:b/>
+                <w:sz w:val="20"/>
+              </w:rPr>
+            </w:r>
+            <w:r>
+              <w:rPr>
+                <w:b/>
+                <w:sz w:val="20"/>
+              </w:rPr>
+              <w:t>Jumlah</w:t>
+            </w:r>
+          </w:p>
+        </w:tc>
+        <w:tc>
+          <w:tcPr>
+            <w:tcW w:type="dxa" w:w="2646"/>
+            <w:tcBorders>
+              <w:top w:val="none"/>
+              <w:bottom w:val="single" w:sz="8" w:space="0" w:color="000000"/>
+              <w:left w:val="none"/>
+              <w:right w:val="none"/>
+            </w:tcBorders>
+          </w:tcPr>
+          <w:p>
+            <w:pPr>
+              <w:spacing w:line="240" w:lineRule="auto" w:after="0"/>
+            </w:pPr>
+            <w:r>
+              <w:rPr>
+                <w:b/>
+                <w:sz w:val="20"/>
+              </w:rPr>
+            </w:r>
+            <w:r>
+              <w:rPr>
+                <w:b/>
+                <w:sz w:val="20"/>
+              </w:rPr>
+              <w:t>Tujuan Pengujian</w:t>
+            </w:r>
+          </w:p>
+        </w:tc>
+      </w:tr>
+      <w:tr>
+        <w:trPr>
+          <w:cantSplit/>
+        </w:trPr>
+        <w:tc>
+          <w:tcPr>
+            <w:tcW w:type="dxa" w:w="2646"/>
+          </w:tcPr>
+          <w:p>
+            <w:pPr>
+              <w:spacing w:line="240" w:lineRule="auto" w:after="0"/>
+            </w:pPr>
+            <w:r>
+              <w:rPr>
+                <w:sz w:val="20"/>
+              </w:rPr>
+            </w:r>
+            <w:r>
+              <w:rPr>
+                <w:i/>
+                <w:sz w:val="20"/>
+              </w:rPr>
+              <w:t>Single-domain</w:t>
+            </w:r>
+          </w:p>
+        </w:tc>
+        <w:tc>
+          <w:tcPr>
+            <w:tcW w:type="dxa" w:w="2646"/>
+          </w:tcPr>
+          <w:p>
+            <w:pPr>
+              <w:spacing w:line="240" w:lineRule="auto" w:after="0"/>
+            </w:pPr>
+            <w:r>
+              <w:rPr>
+                <w:sz w:val="20"/>
+              </w:rPr>
+            </w:r>
+            <w:r>
+              <w:rPr>
+                <w:sz w:val="20"/>
+              </w:rPr>
+              <w:t>50</w:t>
+            </w:r>
+          </w:p>
+        </w:tc>
+        <w:tc>
+          <w:tcPr>
+            <w:tcW w:type="dxa" w:w="2646"/>
+          </w:tcPr>
+          <w:p>
+            <w:pPr>
+              <w:spacing w:line="240" w:lineRule="auto" w:after="0"/>
+            </w:pPr>
+            <w:r>
+              <w:rPr>
+                <w:sz w:val="20"/>
+              </w:rPr>
+            </w:r>
+            <w:r>
+              <w:rPr>
+                <w:sz w:val="20"/>
+              </w:rPr>
+              <w:t xml:space="preserve">Pemilihan </w:t>
+            </w:r>
+            <w:r>
+              <w:rPr>
+                <w:i/>
+                <w:sz w:val="20"/>
+              </w:rPr>
+              <w:t>tool</w:t>
+            </w:r>
+            <w:r>
+              <w:rPr>
+                <w:sz w:val="20"/>
+              </w:rPr>
+              <w:t xml:space="preserve"> pada satu modul tunggal</w:t>
+            </w:r>
+          </w:p>
+        </w:tc>
+      </w:tr>
+      <w:tr>
+        <w:trPr>
+          <w:cantSplit/>
+        </w:trPr>
+        <w:tc>
+          <w:tcPr>
+            <w:tcW w:type="dxa" w:w="2646"/>
+          </w:tcPr>
+          <w:p>
+            <w:pPr>
+              <w:spacing w:line="240" w:lineRule="auto" w:after="0"/>
+            </w:pPr>
+            <w:r>
+              <w:rPr>
+                <w:sz w:val="20"/>
+              </w:rPr>
+            </w:r>
+            <w:r>
+              <w:rPr>
+                <w:i/>
+                <w:sz w:val="20"/>
+              </w:rPr>
+              <w:t>Cross-domain</w:t>
+            </w:r>
+          </w:p>
+        </w:tc>
+        <w:tc>
+          <w:tcPr>
+            <w:tcW w:type="dxa" w:w="2646"/>
+          </w:tcPr>
+          <w:p>
+            <w:pPr>
+              <w:spacing w:line="240" w:lineRule="auto" w:after="0"/>
+            </w:pPr>
+            <w:r>
+              <w:rPr>
+                <w:sz w:val="20"/>
+              </w:rPr>
+            </w:r>
+            <w:r>
+              <w:rPr>
+                <w:sz w:val="20"/>
+              </w:rPr>
+              <w:t>30</w:t>
+            </w:r>
+          </w:p>
+        </w:tc>
+        <w:tc>
+          <w:tcPr>
+            <w:tcW w:type="dxa" w:w="2646"/>
+          </w:tcPr>
+          <w:p>
+            <w:pPr>
+              <w:spacing w:line="240" w:lineRule="auto" w:after="0"/>
+            </w:pPr>
+            <w:r>
+              <w:rPr>
+                <w:sz w:val="20"/>
+              </w:rPr>
+            </w:r>
+            <w:r>
+              <w:rPr>
+                <w:sz w:val="20"/>
+              </w:rPr>
+              <w:t>Disambiguasi antar-dua modul terkait</w:t>
+            </w:r>
+          </w:p>
+        </w:tc>
+      </w:tr>
+      <w:tr>
+        <w:trPr>
+          <w:cantSplit/>
+        </w:trPr>
+        <w:tc>
+          <w:tcPr>
+            <w:tcW w:type="dxa" w:w="2646"/>
+          </w:tcPr>
+          <w:p>
+            <w:pPr>
+              <w:spacing w:line="240" w:lineRule="auto" w:after="0"/>
+            </w:pPr>
+            <w:r>
+              <w:rPr>
+                <w:sz w:val="20"/>
+              </w:rPr>
+            </w:r>
+            <w:r>
+              <w:rPr>
+                <w:i/>
+                <w:sz w:val="20"/>
+              </w:rPr>
+              <w:t>Adversarial</w:t>
+            </w:r>
+          </w:p>
+        </w:tc>
+        <w:tc>
+          <w:tcPr>
+            <w:tcW w:type="dxa" w:w="2646"/>
+          </w:tcPr>
+          <w:p>
+            <w:pPr>
+              <w:spacing w:line="240" w:lineRule="auto" w:after="0"/>
+            </w:pPr>
+            <w:r>
+              <w:rPr>
+                <w:sz w:val="20"/>
+              </w:rPr>
+            </w:r>
+            <w:r>
+              <w:rPr>
+                <w:sz w:val="20"/>
+              </w:rPr>
+              <w:t>20</w:t>
+            </w:r>
+          </w:p>
+        </w:tc>
+        <w:tc>
+          <w:tcPr>
+            <w:tcW w:type="dxa" w:w="2646"/>
+          </w:tcPr>
+          <w:p>
+            <w:pPr>
+              <w:spacing w:line="240" w:lineRule="auto" w:after="0"/>
+            </w:pPr>
+            <w:r>
+              <w:rPr>
+                <w:sz w:val="20"/>
+              </w:rPr>
+            </w:r>
+            <w:r>
+              <w:rPr>
+                <w:sz w:val="20"/>
+              </w:rPr>
+              <w:t xml:space="preserve">Ketahanan terhadap </w:t>
+            </w:r>
+            <w:r>
+              <w:rPr>
+                <w:i/>
+                <w:sz w:val="20"/>
+              </w:rPr>
+              <w:t>prompt injection</w:t>
+            </w:r>
+            <w:r>
+              <w:rPr>
+                <w:sz w:val="20"/>
+              </w:rPr>
+              <w:t xml:space="preserve"> dan instruksi menyesatkan</w:t>
+            </w:r>
+          </w:p>
+        </w:tc>
+      </w:tr>
+      <w:tr>
+        <w:trPr>
+          <w:cantSplit/>
+        </w:trPr>
+        <w:tc>
+          <w:tcPr>
+            <w:tcW w:type="dxa" w:w="2646"/>
+          </w:tcPr>
+          <w:p>
+            <w:pPr>
+              <w:spacing w:line="240" w:lineRule="auto" w:after="0"/>
+            </w:pPr>
+            <w:r>
+              <w:rPr>
+                <w:sz w:val="20"/>
+              </w:rPr>
+            </w:r>
+            <w:r>
+              <w:rPr>
+                <w:b/>
+                <w:sz w:val="20"/>
+              </w:rPr>
+              <w:t>Total</w:t>
+            </w:r>
+          </w:p>
+        </w:tc>
+        <w:tc>
+          <w:tcPr>
+            <w:tcW w:type="dxa" w:w="2646"/>
+          </w:tcPr>
+          <w:p>
+            <w:pPr>
+              <w:spacing w:line="240" w:lineRule="auto" w:after="0"/>
+            </w:pPr>
+            <w:r>
+              <w:rPr>
+                <w:sz w:val="20"/>
+              </w:rPr>
+            </w:r>
+            <w:r>
+              <w:rPr>
+                <w:b/>
+                <w:sz w:val="20"/>
+              </w:rPr>
+              <w:t>100</w:t>
+            </w:r>
+          </w:p>
+        </w:tc>
+        <w:tc>
+          <w:tcPr>
+            <w:tcW w:type="dxa" w:w="2646"/>
+          </w:tcPr>
+          <w:p>
+            <w:pPr>
+              <w:spacing w:line="240" w:lineRule="auto" w:after="0"/>
+            </w:pPr>
+            <w:r>
+              <w:rPr>
+                <w:sz w:val="20"/>
+              </w:rPr>
+            </w:r>
+            <w:r>
+              <w:rPr>
+                <w:sz w:val="20"/>
+              </w:rPr>
+              <w:t>—</w:t>
+            </w:r>
+          </w:p>
+        </w:tc>
+      </w:tr>
+    </w:tbl>
+    <w:p>
+      <w:pPr>
+        <w:ind w:firstLine="720"/>
+        <w:jc w:val="both"/>
+      </w:pPr>
+      <w:r>
+        <w:t xml:space="preserve">Setiap kueri dilengkapi metadata konteks (modul, peran, tier) serta </w:t>
+      </w:r>
+      <w:r>
+        <w:rPr>
+          <w:rFonts w:ascii="Courier New" w:hAnsi="Courier New"/>
+        </w:rPr>
+        <w:t>expected_tool</w:t>
+      </w:r>
+      <w:r>
+        <w:t xml:space="preserve"> sebagai </w:t>
+      </w:r>
+      <w:r>
+        <w:rPr>
+          <w:i/>
+        </w:rPr>
+        <w:t>ground truth</w:t>
+      </w:r>
+      <w:r>
+        <w:t xml:space="preserve"> untuk penilaian akurasi. Pada </w:t>
+      </w:r>
+      <w:r>
+        <w:rPr>
+          <w:i/>
+        </w:rPr>
+        <w:t>backend</w:t>
+      </w:r>
+      <w:r>
+        <w:t xml:space="preserve"> LLM, setiap kueri diulang sebanyak tiga kali (</w:t>
+      </w:r>
+      <w:r>
+        <w:rPr>
+          <w:i/>
+        </w:rPr>
+        <w:t>repeat runs</w:t>
+      </w:r>
+      <w:r>
+        <w:t>) per skenario guna menangkap variabilitas keluaran model. Alur kerja kerangka evaluasi secara keseluruhan — dari pembangkitan dataset, percabangan mode, pemanggilan LLM, hingga pencatatan metrik dan uji statistik — diilustrasikan pada Gambar 3.2.</w:t>
+      </w:r>
+    </w:p>
+    <w:p>
+      <w:pPr>
+        <w:keepNext/>
+        <w:spacing w:before="120"/>
+        <w:jc w:val="center"/>
+      </w:pPr>
+      <w:r>
+        <w:drawing>
+          <wp:inline xmlns:a="http://schemas.openxmlformats.org/drawingml/2006/main" xmlns:pic="http://schemas.openxmlformats.org/drawingml/2006/picture">
+            <wp:extent cx="3966768" cy="6479999"/>
+            <wp:docPr id="4" name="Picture 4"/>
+            <wp:cNvGraphicFramePr>
+              <a:graphicFrameLocks noChangeAspect="1"/>
+            </wp:cNvGraphicFramePr>
+            <a:graphic>
+              <a:graphicData uri="http://schemas.openxmlformats.org/drawingml/2006/picture">
+                <pic:pic>
+                  <pic:nvPicPr>
+                    <pic:cNvPr id="0" name="alur-eval-runner.png"/>
+                    <pic:cNvPicPr/>
+                  </pic:nvPicPr>
+                  <pic:blipFill>
+                    <a:blip r:embed="rId14"/>
+                    <a:stretch>
+                      <a:fillRect/>
+                    </a:stretch>
+                  </pic:blipFill>
+                  <pic:spPr>
+                    <a:xfrm>
+                      <a:off x="0" y="0"/>
+                      <a:ext cx="3966768" cy="6479999"/>
+                    </a:xfrm>
+                    <a:prstGeom prst="rect"/>
+                  </pic:spPr>
+                </pic:pic>
+              </a:graphicData>
+            </a:graphic>
+          </wp:inline>
+        </w:drawing>
+      </w:r>
+    </w:p>
+    <w:p>
+      <w:pPr>
+        <w:pStyle w:val="Caption"/>
+        <w:jc w:val="center"/>
+      </w:pPr>
+      <w:r>
+        <w:t>Gambar 3.</w:t>
+      </w:r>
+      <w:fldSimple w:instr=" SEQ Gambar \* ARABIC \s 1 ">
+        <w:r>
+          <w:t>1</w:t>
+        </w:r>
+      </w:fldSimple>
+      <w:r>
+        <w:t xml:space="preserve"> Alur Kerja Kerangka Evaluasi Baseline dan Registry.</w:t>
+      </w:r>
+    </w:p>
+    <w:p>
+      <w:pPr>
+        <w:ind w:firstLine="720"/>
+        <w:jc w:val="both"/>
+      </w:pPr>
+      <w:r>
+        <w:t xml:space="preserve">Empat metrik dicatat pada setiap pemanggilan: jumlah token (input dan output), latensi respons, </w:t>
+      </w:r>
+      <w:r>
+        <w:rPr>
+          <w:i/>
+        </w:rPr>
+        <w:t>tool</w:t>
+      </w:r>
+      <w:r>
+        <w:t xml:space="preserve"> yang terpilih beserta status kebenarannya terhadap </w:t>
+      </w:r>
+      <w:r>
+        <w:rPr>
+          <w:rFonts w:ascii="Courier New" w:hAnsi="Courier New"/>
+        </w:rPr>
+        <w:t>expected_tool</w:t>
+      </w:r>
+      <w:r>
+        <w:t xml:space="preserve">, dan jumlah </w:t>
+      </w:r>
+      <w:r>
+        <w:rPr>
+          <w:i/>
+        </w:rPr>
+        <w:t>tool</w:t>
+      </w:r>
+      <w:r>
+        <w:t xml:space="preserve"> yang terlihat oleh model. Seluruh metrik disimpan dalam format JSONL inkremental sebagaimana diuraikan pada Sub-bab 3.5.</w:t>
+      </w:r>
+    </w:p>
+    <w:p>
+      <w:pPr>
+        <w:pStyle w:val="Heading2"/>
+      </w:pPr>
+      <w:r>
+        <w:t>3.4 Implementasi Tool Registry</w:t>
+      </w:r>
+    </w:p>
+    <w:p>
+      <w:pPr>
+        <w:ind w:firstLine="720"/>
+        <w:jc w:val="both"/>
+      </w:pPr>
+      <w:r>
+        <w:t xml:space="preserve">Skema metadata diimplementasikan sebagai </w:t>
+      </w:r>
+      <w:r>
+        <w:rPr>
+          <w:i/>
+        </w:rPr>
+        <w:t>dataclass</w:t>
+      </w:r>
+      <w:r>
+        <w:t xml:space="preserve"> </w:t>
+      </w:r>
+      <w:r>
+        <w:rPr>
+          <w:rFonts w:ascii="Courier New" w:hAnsi="Courier New"/>
+        </w:rPr>
+        <w:t>ToolDef</w:t>
+      </w:r>
+      <w:r>
+        <w:t xml:space="preserve"> yang bersifat </w:t>
+      </w:r>
+      <w:r>
+        <w:rPr>
+          <w:i/>
+        </w:rPr>
+        <w:t>immutable</w:t>
+      </w:r>
+      <w:r>
+        <w:t xml:space="preserve"> (</w:t>
+      </w:r>
+      <w:r>
+        <w:rPr>
+          <w:rFonts w:ascii="Courier New" w:hAnsi="Courier New"/>
+        </w:rPr>
+        <w:t>frozen=True</w:t>
+      </w:r>
+      <w:r>
+        <w:t>) untuk menjamin determinisme katalog selama eksekusi. Implementasi skema tersebut disajikan pada Kode Program 3.1.</w:t>
+      </w:r>
+    </w:p>
+    <w:p>
+      <w:pPr>
+        <w:pStyle w:val="Caption"/>
+        <w:keepNext/>
+        <w:jc w:val="center"/>
+      </w:pPr>
+      <w:r>
+        <w:t xml:space="preserve">Kode Program 3.1 Skema Metadata </w:t>
+      </w:r>
+      <w:r>
+        <w:rPr>
+          <w:rFonts w:ascii="Courier New" w:hAnsi="Courier New"/>
+        </w:rPr>
+        <w:t>ToolDef</w:t>
+      </w:r>
+    </w:p>
+    <w:p>
+      <w:pPr>
+        <w:keepLines/>
+        <w:spacing w:line="240" w:lineRule="auto" w:before="120" w:after="120"/>
+        <w:ind w:left="283" w:right="113"/>
+        <w:jc w:val="left"/>
+        <w:shd w:val="clear" w:color="auto" w:fill="F2F2F2"/>
+      </w:pPr>
+      <w:r>
+        <w:rPr>
+          <w:rFonts w:ascii="Courier New" w:hAnsi="Courier New" w:cs="Courier New"/>
+          <w:sz w:val="18"/>
+        </w:rPr>
+        <w:t>@dataclass(frozen=True)</w:t>
+        <w:br/>
+      </w:r>
+      <w:r>
+        <w:rPr>
+          <w:rFonts w:ascii="Courier New" w:hAnsi="Courier New" w:cs="Courier New"/>
+          <w:sz w:val="18"/>
+        </w:rPr>
+        <w:t>class ToolDef:</w:t>
+        <w:br/>
+      </w:r>
+      <w:r>
+        <w:rPr>
+          <w:rFonts w:ascii="Courier New" w:hAnsi="Courier New" w:cs="Courier New"/>
+          <w:sz w:val="18"/>
+        </w:rPr>
+        <w:t xml:space="preserve">    name: str</w:t>
+        <w:br/>
+      </w:r>
+      <w:r>
+        <w:rPr>
+          <w:rFonts w:ascii="Courier New" w:hAnsi="Courier New" w:cs="Courier New"/>
+          <w:sz w:val="18"/>
+        </w:rPr>
+        <w:t xml:space="preserve">    module: str</w:t>
+        <w:br/>
+      </w:r>
+      <w:r>
+        <w:rPr>
+          <w:rFonts w:ascii="Courier New" w:hAnsi="Courier New" w:cs="Courier New"/>
+          <w:sz w:val="18"/>
+        </w:rPr>
+        <w:t xml:space="preserve">    op_type: str</w:t>
+        <w:br/>
+      </w:r>
+      <w:r>
+        <w:rPr>
+          <w:rFonts w:ascii="Courier New" w:hAnsi="Courier New" w:cs="Courier New"/>
+          <w:sz w:val="18"/>
+        </w:rPr>
+        <w:t xml:space="preserve">    roles: list[str]</w:t>
+        <w:br/>
+      </w:r>
+      <w:r>
+        <w:rPr>
+          <w:rFonts w:ascii="Courier New" w:hAnsi="Courier New" w:cs="Courier New"/>
+          <w:sz w:val="18"/>
+        </w:rPr>
+        <w:t xml:space="preserve">    tiers: list[str]</w:t>
+        <w:br/>
+      </w:r>
+      <w:r>
+        <w:rPr>
+          <w:rFonts w:ascii="Courier New" w:hAnsi="Courier New" w:cs="Courier New"/>
+          <w:sz w:val="18"/>
+        </w:rPr>
+        <w:t xml:space="preserve">    keywords: list[str]</w:t>
+        <w:br/>
+      </w:r>
+      <w:r>
+        <w:rPr>
+          <w:rFonts w:ascii="Courier New" w:hAnsi="Courier New" w:cs="Courier New"/>
+          <w:sz w:val="18"/>
+        </w:rPr>
+        <w:t xml:space="preserve">    priority: int</w:t>
+        <w:br/>
+      </w:r>
+      <w:r>
+        <w:rPr>
+          <w:rFonts w:ascii="Courier New" w:hAnsi="Courier New" w:cs="Courier New"/>
+          <w:sz w:val="18"/>
+        </w:rPr>
+        <w:t xml:space="preserve">    schema_tokens: int</w:t>
+        <w:br/>
+      </w:r>
+      <w:r>
+        <w:rPr>
+          <w:rFonts w:ascii="Courier New" w:hAnsi="Courier New" w:cs="Courier New"/>
+          <w:sz w:val="18"/>
+        </w:rPr>
+        <w:t xml:space="preserve">    intent: str = ""  # docstring-style: what this tool does and when to use it</w:t>
+      </w:r>
+    </w:p>
+    <w:p>
+      <w:pPr>
+        <w:ind w:firstLine="720"/>
+        <w:jc w:val="both"/>
+      </w:pPr>
+      <w:r>
+        <w:t xml:space="preserve">Inti dari artefak adalah fungsi </w:t>
+      </w:r>
+      <w:r>
+        <w:rPr>
+          <w:rFonts w:ascii="Courier New" w:hAnsi="Courier New"/>
+        </w:rPr>
+        <w:t>registry_filter()</w:t>
+      </w:r>
+      <w:r>
+        <w:t xml:space="preserve"> yang merealisasikan </w:t>
+      </w:r>
+      <w:r>
+        <w:rPr>
+          <w:i/>
+        </w:rPr>
+        <w:t>pipeline</w:t>
+      </w:r>
+      <w:r>
+        <w:t xml:space="preserve"> lima tahap pada Gambar 3.1. Fungsi ini menerima objek kueri, daftar </w:t>
+      </w:r>
+      <w:r>
+        <w:rPr>
+          <w:i/>
+        </w:rPr>
+        <w:t>tool</w:t>
+      </w:r>
+      <w:r>
+        <w:t xml:space="preserve"> skenario, dan anggaran (</w:t>
+      </w:r>
+      <w:r>
+        <w:rPr>
+          <w:i/>
+        </w:rPr>
+        <w:t>budget</w:t>
+      </w:r>
+      <w:r>
+        <w:t xml:space="preserve">), lalu mengembalikan subset </w:t>
+      </w:r>
+      <w:r>
+        <w:rPr>
+          <w:i/>
+        </w:rPr>
+        <w:t>tool</w:t>
+      </w:r>
+      <w:r>
+        <w:t xml:space="preserve"> terurut yang dibatasi oleh anggaran. Implementasinya disajikan pada Kode Program 3.2.</w:t>
+      </w:r>
+    </w:p>
+    <w:p>
+      <w:pPr>
+        <w:pStyle w:val="Caption"/>
+        <w:keepNext/>
+        <w:jc w:val="center"/>
+      </w:pPr>
+      <w:r>
+        <w:t xml:space="preserve">Kode Program 3.2 Fungsi </w:t>
+      </w:r>
+      <w:r>
+        <w:rPr>
+          <w:rFonts w:ascii="Courier New" w:hAnsi="Courier New"/>
+        </w:rPr>
+        <w:t>registry_filter()</w:t>
+      </w:r>
+    </w:p>
+    <w:p>
+      <w:pPr>
+        <w:keepLines/>
+        <w:spacing w:line="240" w:lineRule="auto" w:before="120" w:after="120"/>
+        <w:ind w:left="283" w:right="113"/>
+        <w:jc w:val="left"/>
+        <w:shd w:val="clear" w:color="auto" w:fill="F2F2F2"/>
+      </w:pPr>
+      <w:r>
+        <w:rPr>
+          <w:rFonts w:ascii="Courier New" w:hAnsi="Courier New" w:cs="Courier New"/>
+          <w:sz w:val="18"/>
+        </w:rPr>
+        <w:t>def registry_filter(query: QueryDef, tools: list[ToolDef], budget: int) -&gt; list[ToolDef]:</w:t>
+        <w:br/>
+      </w:r>
+      <w:r>
+        <w:rPr>
+          <w:rFonts w:ascii="Courier New" w:hAnsi="Courier New" w:cs="Courier New"/>
+          <w:sz w:val="18"/>
+        </w:rPr>
+        <w:t xml:space="preserve">    query_terms = set(query.text.lower().replace(".", "").replace(",", "").split())</w:t>
+        <w:br/>
+      </w:r>
+      <w:r>
+        <w:rPr>
+          <w:rFonts w:ascii="Courier New" w:hAnsi="Courier New" w:cs="Courier New"/>
+          <w:sz w:val="18"/>
+        </w:rPr>
+        <w:t xml:space="preserve">    ranked: list[tuple[int, int, float, ToolDef]] = []</w:t>
+        <w:br/>
+      </w:r>
+      <w:r>
+        <w:rPr>
+          <w:rFonts w:ascii="Courier New" w:hAnsi="Courier New" w:cs="Courier New"/>
+          <w:sz w:val="18"/>
+        </w:rPr>
+        <w:t xml:space="preserve">    for tool in tools:</w:t>
+        <w:br/>
+      </w:r>
+      <w:r>
+        <w:rPr>
+          <w:rFonts w:ascii="Courier New" w:hAnsi="Courier New" w:cs="Courier New"/>
+          <w:sz w:val="18"/>
+        </w:rPr>
+        <w:t xml:space="preserve">        if tool.module not in query.modules:</w:t>
+        <w:br/>
+      </w:r>
+      <w:r>
+        <w:rPr>
+          <w:rFonts w:ascii="Courier New" w:hAnsi="Courier New" w:cs="Courier New"/>
+          <w:sz w:val="18"/>
+        </w:rPr>
+        <w:t xml:space="preserve">            continue</w:t>
+        <w:br/>
+      </w:r>
+      <w:r>
+        <w:rPr>
+          <w:rFonts w:ascii="Courier New" w:hAnsi="Courier New" w:cs="Courier New"/>
+          <w:sz w:val="18"/>
+        </w:rPr>
+        <w:t xml:space="preserve">        if query.role not in tool.roles:</w:t>
+        <w:br/>
+      </w:r>
+      <w:r>
+        <w:rPr>
+          <w:rFonts w:ascii="Courier New" w:hAnsi="Courier New" w:cs="Courier New"/>
+          <w:sz w:val="18"/>
+        </w:rPr>
+        <w:t xml:space="preserve">            continue</w:t>
+        <w:br/>
+      </w:r>
+      <w:r>
+        <w:rPr>
+          <w:rFonts w:ascii="Courier New" w:hAnsi="Courier New" w:cs="Courier New"/>
+          <w:sz w:val="18"/>
+        </w:rPr>
+        <w:t xml:space="preserve">        if query.tier not in tool.tiers:</w:t>
+        <w:br/>
+      </w:r>
+      <w:r>
+        <w:rPr>
+          <w:rFonts w:ascii="Courier New" w:hAnsi="Courier New" w:cs="Courier New"/>
+          <w:sz w:val="18"/>
+        </w:rPr>
+        <w:t xml:space="preserve">            continue</w:t>
+        <w:br/>
+      </w:r>
+      <w:r>
+        <w:rPr>
+          <w:rFonts w:ascii="Courier New" w:hAnsi="Courier New" w:cs="Courier New"/>
+          <w:sz w:val="18"/>
+        </w:rPr>
+        <w:t xml:space="preserve">        overlap = len(query_terms.intersection(tool.keywords))</w:t>
+        <w:br/>
+      </w:r>
+      <w:r>
+        <w:rPr>
+          <w:rFonts w:ascii="Courier New" w:hAnsi="Courier New" w:cs="Courier New"/>
+          <w:sz w:val="18"/>
+        </w:rPr>
+        <w:t xml:space="preserve">        ranked.append((overlap, -tool.priority, -stable_unit(query.query_id, tool.name), tool))</w:t>
+        <w:br/>
+      </w:r>
+      <w:r>
+        <w:rPr>
+          <w:rFonts w:ascii="Courier New" w:hAnsi="Courier New" w:cs="Courier New"/>
+          <w:sz w:val="18"/>
+        </w:rPr>
+        <w:t xml:space="preserve">    ranked.sort(reverse=True)</w:t>
+        <w:br/>
+      </w:r>
+      <w:r>
+        <w:rPr>
+          <w:rFonts w:ascii="Courier New" w:hAnsi="Courier New" w:cs="Courier New"/>
+          <w:sz w:val="18"/>
+        </w:rPr>
+        <w:t xml:space="preserve">    return [tool for *_unused, tool in ranked[:budget]]</w:t>
+      </w:r>
+    </w:p>
+    <w:p>
+      <w:pPr>
+        <w:ind w:firstLine="720"/>
+        <w:jc w:val="both"/>
+      </w:pPr>
+      <w:r>
+        <w:t xml:space="preserve">Tiga pernyataan </w:t>
+      </w:r>
+      <w:r>
+        <w:rPr>
+          <w:rFonts w:ascii="Courier New" w:hAnsi="Courier New"/>
+        </w:rPr>
+        <w:t>continue</w:t>
+      </w:r>
+      <w:r>
+        <w:t xml:space="preserve"> pada Kode Program 3.2 merealisasikan </w:t>
+      </w:r>
+      <w:r>
+        <w:rPr>
+          <w:i/>
+        </w:rPr>
+        <w:t>hard filter</w:t>
+      </w:r>
+      <w:r>
+        <w:t xml:space="preserve"> modul, peran, dan tier; </w:t>
+      </w:r>
+      <w:r>
+        <w:rPr>
+          <w:i/>
+        </w:rPr>
+        <w:t>tool</w:t>
+      </w:r>
+      <w:r>
+        <w:t xml:space="preserve"> yang gugur tidak ikut diperingkat. Kandidat yang lolos diberi skor berupa </w:t>
+      </w:r>
+      <w:r>
+        <w:rPr>
+          <w:i/>
+        </w:rPr>
+        <w:t>tuple</w:t>
+      </w:r>
+      <w:r>
+        <w:t xml:space="preserve"> </w:t>
+      </w:r>
+      <w:r>
+        <w:rPr>
+          <w:rFonts w:ascii="Courier New" w:hAnsi="Courier New"/>
+        </w:rPr>
+        <w:t>(overlap, -priority, -hash)</w:t>
+      </w:r>
+      <w:r>
+        <w:t xml:space="preserve"> yang diurutkan secara menurun: jumlah tumpang-tindih kata kunci menjadi kunci utama, prioritas </w:t>
+      </w:r>
+      <w:r>
+        <w:rPr>
+          <w:i/>
+        </w:rPr>
+        <w:t>tool</w:t>
+      </w:r>
+      <w:r>
+        <w:t xml:space="preserve"> menjadi pemecah seri pertama, dan nilai </w:t>
+      </w:r>
+      <w:r>
+        <w:rPr>
+          <w:i/>
+        </w:rPr>
+        <w:t>hash</w:t>
+      </w:r>
+      <w:r>
+        <w:t xml:space="preserve"> stabil dari pasangan </w:t>
+      </w:r>
+      <w:r>
+        <w:rPr>
+          <w:rFonts w:ascii="Courier New" w:hAnsi="Courier New"/>
+        </w:rPr>
+        <w:t>(query_id, tool.name)</w:t>
+      </w:r>
+      <w:r>
+        <w:t xml:space="preserve"> menjadi pemecah seri terakhir. Penggunaan </w:t>
+      </w:r>
+      <w:r>
+        <w:rPr>
+          <w:i/>
+        </w:rPr>
+        <w:t>hash</w:t>
+      </w:r>
+      <w:r>
+        <w:t xml:space="preserve"> deterministik — bukan urutan acak — memastikan bahwa keluaran </w:t>
+      </w:r>
+      <w:r>
+        <w:rPr>
+          <w:i/>
+        </w:rPr>
+        <w:t>pipeline</w:t>
+      </w:r>
+      <w:r>
+        <w:t xml:space="preserve"> dapat direproduksi secara identik pada setiap eksekusi, sebuah syarat penting bagi validitas eksperimen. Akhirnya, </w:t>
+      </w:r>
+      <w:r>
+        <w:rPr>
+          <w:i/>
+        </w:rPr>
+        <w:t>slicing</w:t>
+      </w:r>
+      <w:r>
+        <w:t xml:space="preserve"> </w:t>
+      </w:r>
+      <w:r>
+        <w:rPr>
+          <w:rFonts w:ascii="Courier New" w:hAnsi="Courier New"/>
+        </w:rPr>
+        <w:t>[:budget]</w:t>
+      </w:r>
+      <w:r>
+        <w:t xml:space="preserve"> menerapkan </w:t>
+      </w:r>
+      <w:r>
+        <w:rPr>
+          <w:i/>
+        </w:rPr>
+        <w:t>budget cap</w:t>
+      </w:r>
+      <w:r>
+        <w:t xml:space="preserve"> yang menjamin jumlah keluaran tidak pernah melampaui 15 </w:t>
+      </w:r>
+      <w:r>
+        <w:rPr>
+          <w:i/>
+        </w:rPr>
+        <w:t>tool</w:t>
+      </w:r>
+      <w:r>
+        <w:t>.</w:t>
+      </w:r>
+    </w:p>
+    <w:p>
+      <w:pPr>
+        <w:ind w:firstLine="720"/>
+        <w:jc w:val="both"/>
+      </w:pPr>
+      <w:r>
+        <w:t xml:space="preserve">Selain penyaringan, dirancang pula fungsi </w:t>
+      </w:r>
+      <w:r>
+        <w:rPr>
+          <w:rFonts w:ascii="Courier New" w:hAnsi="Courier New"/>
+        </w:rPr>
+        <w:t>registry_memory()</w:t>
+      </w:r>
+      <w:r>
+        <w:t xml:space="preserve"> untuk mengukur jejak memori (</w:t>
+      </w:r>
+      <w:r>
+        <w:rPr>
+          <w:i/>
+        </w:rPr>
+        <w:t>memory footprint</w:t>
+      </w:r>
+      <w:r>
+        <w:t xml:space="preserve">) katalog metadata. Fungsi tersebut membangun representasi </w:t>
+      </w:r>
+      <w:r>
+        <w:rPr>
+          <w:i/>
+        </w:rPr>
+        <w:t>dictionary</w:t>
+      </w:r>
+      <w:r>
+        <w:t xml:space="preserve"> dari seluruh </w:t>
+      </w:r>
+      <w:r>
+        <w:rPr>
+          <w:i/>
+        </w:rPr>
+        <w:t>tool</w:t>
+      </w:r>
+      <w:r>
+        <w:t xml:space="preserve"> lalu menghitung ukuran totalnya secara rekursif menggunakan </w:t>
+      </w:r>
+      <w:r>
+        <w:rPr>
+          <w:rFonts w:ascii="Courier New" w:hAnsi="Courier New"/>
+        </w:rPr>
+        <w:t>deep_size()</w:t>
+      </w:r>
+      <w:r>
+        <w:t xml:space="preserve">, sehingga </w:t>
+      </w:r>
+      <w:r>
+        <w:rPr>
+          <w:i/>
+        </w:rPr>
+        <w:t>overhead</w:t>
+      </w:r>
+      <w:r>
+        <w:t xml:space="preserve"> memori registry dapat dianalisis pada Bab IV.</w:t>
+      </w:r>
+    </w:p>
+    <w:p>
+      <w:pPr>
+        <w:pStyle w:val="Heading2"/>
+      </w:pPr>
+      <w:r>
+        <w:t>3.5 Implementasi Eval Runner</w:t>
+      </w:r>
+    </w:p>
+    <w:p>
+      <w:pPr>
+        <w:ind w:firstLine="720"/>
+        <w:jc w:val="both"/>
+      </w:pPr>
+      <w:r>
+        <w:rPr>
+          <w:i/>
+        </w:rPr>
+        <w:t>Eval runner</w:t>
+      </w:r>
+      <w:r>
+        <w:t xml:space="preserve"> bertanggung jawab menjalankan matriks eksperimen (skenario × mode × kueri × pengulangan) dan mencatat hasilnya. Untuk menjamin reprodusibilitas dan ketahanan terhadap gangguan jaringan saat memanggil LLM, </w:t>
+      </w:r>
+      <w:r>
+        <w:rPr>
+          <w:i/>
+        </w:rPr>
+        <w:t>runner</w:t>
+      </w:r>
+      <w:r>
+        <w:t xml:space="preserve"> dirancang bersifat </w:t>
+      </w:r>
+      <w:r>
+        <w:rPr>
+          <w:i/>
+        </w:rPr>
+        <w:t>resume-safe</w:t>
+      </w:r>
+      <w:r>
+        <w:t>: setiap hasil ditulis segera (</w:t>
+      </w:r>
+      <w:r>
+        <w:rPr>
+          <w:i/>
+        </w:rPr>
+        <w:t>append</w:t>
+      </w:r>
+      <w:r>
+        <w:t xml:space="preserve">) ke berkas JSONL, dan eksekusi yang terputus dapat dilanjutkan tanpa mengulang panggilan yang telah selesai. Mekanisme ini diwujudkan dengan memuat kunci </w:t>
+      </w:r>
+      <w:r>
+        <w:rPr>
+          <w:rFonts w:ascii="Courier New" w:hAnsi="Courier New"/>
+        </w:rPr>
+        <w:t>(scenario, mode, query_id, repeat_idx)</w:t>
+      </w:r>
+      <w:r>
+        <w:t xml:space="preserve"> yang telah ada di disk, lalu melewati kombinasi yang sudah tercatat, sebagaimana disajikan pada Kode Program 3.3.</w:t>
+      </w:r>
+    </w:p>
+    <w:p>
+      <w:pPr>
+        <w:pStyle w:val="Caption"/>
+        <w:keepNext/>
+        <w:jc w:val="center"/>
+      </w:pPr>
+      <w:r>
+        <w:t xml:space="preserve">Kode Program 3.3 Mekanisme </w:t>
+      </w:r>
+      <w:r>
+        <w:rPr>
+          <w:i/>
+        </w:rPr>
+        <w:t>Resume</w:t>
+      </w:r>
+      <w:r>
+        <w:t xml:space="preserve"> pada Eval Runner</w:t>
+      </w:r>
+    </w:p>
+    <w:p>
+      <w:pPr>
+        <w:keepLines/>
+        <w:spacing w:line="240" w:lineRule="auto" w:before="120" w:after="120"/>
+        <w:ind w:left="283" w:right="113"/>
+        <w:jc w:val="left"/>
+        <w:shd w:val="clear" w:color="auto" w:fill="F2F2F2"/>
+      </w:pPr>
+      <w:r>
+        <w:rPr>
+          <w:rFonts w:ascii="Courier New" w:hAnsi="Courier New" w:cs="Courier New"/>
+          <w:sz w:val="18"/>
+        </w:rPr>
+        <w:t>for mode in modes:</w:t>
+        <w:br/>
+      </w:r>
+      <w:r>
+        <w:rPr>
+          <w:rFonts w:ascii="Courier New" w:hAnsi="Courier New" w:cs="Courier New"/>
+          <w:sz w:val="18"/>
+        </w:rPr>
+        <w:t xml:space="preserve">    for query in queries_for_scenario:</w:t>
+        <w:br/>
+      </w:r>
+      <w:r>
+        <w:rPr>
+          <w:rFonts w:ascii="Courier New" w:hAnsi="Courier New" w:cs="Courier New"/>
+          <w:sz w:val="18"/>
+        </w:rPr>
+        <w:t xml:space="preserve">        for repeat_idx in range(n_repeats):</w:t>
+        <w:br/>
+      </w:r>
+      <w:r>
+        <w:rPr>
+          <w:rFonts w:ascii="Courier New" w:hAnsi="Courier New" w:cs="Courier New"/>
+          <w:sz w:val="18"/>
+        </w:rPr>
+        <w:t xml:space="preserve">            key = (scenario, mode, query.query_id, repeat_idx)</w:t>
+        <w:br/>
+      </w:r>
+      <w:r>
+        <w:rPr>
+          <w:rFonts w:ascii="Courier New" w:hAnsi="Courier New" w:cs="Courier New"/>
+          <w:sz w:val="18"/>
+        </w:rPr>
+        <w:t xml:space="preserve">            if key in done_keys:</w:t>
+        <w:br/>
+      </w:r>
+      <w:r>
+        <w:rPr>
+          <w:rFonts w:ascii="Courier New" w:hAnsi="Courier New" w:cs="Courier New"/>
+          <w:sz w:val="18"/>
+        </w:rPr>
+        <w:t xml:space="preserve">                continue  # sudah ada di disk — lewati</w:t>
+        <w:br/>
+      </w:r>
+      <w:r>
+        <w:rPr>
+          <w:rFonts w:ascii="Courier New" w:hAnsi="Courier New" w:cs="Courier New"/>
+          <w:sz w:val="18"/>
+        </w:rPr>
+        <w:t xml:space="preserve">            row = backend.call(</w:t>
+        <w:br/>
+      </w:r>
+      <w:r>
+        <w:rPr>
+          <w:rFonts w:ascii="Courier New" w:hAnsi="Courier New" w:cs="Courier New"/>
+          <w:sz w:val="18"/>
+        </w:rPr>
+        <w:t xml:space="preserve">                mode=mode, scenario=scenario, query=query,</w:t>
+        <w:br/>
+      </w:r>
+      <w:r>
+        <w:rPr>
+          <w:rFonts w:ascii="Courier New" w:hAnsi="Courier New" w:cs="Courier New"/>
+          <w:sz w:val="18"/>
+        </w:rPr>
+        <w:t xml:space="preserve">                tools_for_scenario=tools_for_scenario,</w:t>
+        <w:br/>
+      </w:r>
+      <w:r>
+        <w:rPr>
+          <w:rFonts w:ascii="Courier New" w:hAnsi="Courier New" w:cs="Courier New"/>
+          <w:sz w:val="18"/>
+        </w:rPr>
+        <w:t xml:space="preserve">                registry_memory_bytes=memory_bytes,</w:t>
+        <w:br/>
+      </w:r>
+      <w:r>
+        <w:rPr>
+          <w:rFonts w:ascii="Courier New" w:hAnsi="Courier New" w:cs="Courier New"/>
+          <w:sz w:val="18"/>
+        </w:rPr>
+        <w:t xml:space="preserve">                config=config, repeat_idx=repeat_idx,</w:t>
+        <w:br/>
+      </w:r>
+      <w:r>
+        <w:rPr>
+          <w:rFonts w:ascii="Courier New" w:hAnsi="Courier New" w:cs="Courier New"/>
+          <w:sz w:val="18"/>
+        </w:rPr>
+        <w:t xml:space="preserve">            )</w:t>
+        <w:br/>
+      </w:r>
+      <w:r>
+        <w:rPr>
+          <w:rFonts w:ascii="Courier New" w:hAnsi="Courier New" w:cs="Courier New"/>
+          <w:sz w:val="18"/>
+        </w:rPr>
+        <w:t xml:space="preserve">            rows.append(row)</w:t>
+        <w:br/>
+      </w:r>
+      <w:r>
+        <w:rPr>
+          <w:rFonts w:ascii="Courier New" w:hAnsi="Courier New" w:cs="Courier New"/>
+          <w:sz w:val="18"/>
+        </w:rPr>
+        <w:t xml:space="preserve">            _flush(row)  # tulis segera ke JSONL (append)</w:t>
+      </w:r>
+    </w:p>
+    <w:p>
+      <w:pPr>
+        <w:ind w:firstLine="720"/>
+        <w:jc w:val="both"/>
+      </w:pPr>
+      <w:r>
+        <w:t xml:space="preserve">Pemanggilan </w:t>
+      </w:r>
+      <w:r>
+        <w:rPr>
+          <w:rFonts w:ascii="Courier New" w:hAnsi="Courier New"/>
+        </w:rPr>
+        <w:t>_flush(row)</w:t>
+      </w:r>
+      <w:r>
+        <w:t xml:space="preserve"> setelah setiap panggilan memastikan bahwa data tidak hilang apabila proses terhenti, sehingga eksperimen panjang yang melibatkan ratusan panggilan LLM dapat dijalankan secara bertahap. Setelah seluruh baris terkumpul, </w:t>
+      </w:r>
+      <w:r>
+        <w:rPr>
+          <w:i/>
+        </w:rPr>
+        <w:t>runner</w:t>
+      </w:r>
+      <w:r>
+        <w:t xml:space="preserve"> memanggil modul </w:t>
+      </w:r>
+      <w:r>
+        <w:rPr>
+          <w:rFonts w:ascii="Courier New" w:hAnsi="Courier New"/>
+        </w:rPr>
+        <w:t>summarize()</w:t>
+      </w:r>
+      <w:r>
+        <w:t xml:space="preserve"> untuk menghasilkan </w:t>
+      </w:r>
+      <w:r>
+        <w:rPr>
+          <w:rFonts w:ascii="Courier New" w:hAnsi="Courier New"/>
+        </w:rPr>
+        <w:t>summary.csv</w:t>
+      </w:r>
+      <w:r>
+        <w:t xml:space="preserve">, modul uji statistik untuk menghasilkan </w:t>
+      </w:r>
+      <w:r>
+        <w:rPr>
+          <w:rFonts w:ascii="Courier New" w:hAnsi="Courier New"/>
+        </w:rPr>
+        <w:t>statistical_tests.csv</w:t>
+      </w:r>
+      <w:r>
+        <w:t xml:space="preserve">, dan </w:t>
+      </w:r>
+      <w:r>
+        <w:rPr>
+          <w:i/>
+        </w:rPr>
+        <w:t>report generator</w:t>
+      </w:r>
+      <w:r>
+        <w:t xml:space="preserve"> untuk menyusun laporan Markdown. Arsitektur </w:t>
+      </w:r>
+      <w:r>
+        <w:rPr>
+          <w:i/>
+        </w:rPr>
+        <w:t>append-only</w:t>
+      </w:r>
+      <w:r>
+        <w:t xml:space="preserve"> ini juga memungkinkan agregasi lintas-eksekusi: berkas JSONL dari beberapa sesi dapat digabungkan menjadi satu ringkasan yang konsisten.</w:t>
+      </w:r>
+    </w:p>
+    <w:p>
+      <w:pPr>
+        <w:pStyle w:val="Heading2"/>
+      </w:pPr>
+      <w:r>
+        <w:t>3.6 Setup Eksperimen</w:t>
+      </w:r>
+    </w:p>
+    <w:p>
+      <w:pPr>
+        <w:ind w:firstLine="720"/>
+        <w:jc w:val="both"/>
+      </w:pPr>
+      <w:r>
+        <w:t xml:space="preserve">Eksperimen resmi menggunakan model Gemini 2.5 Flash Lite melalui Google Gen AI SDK dengan mekanisme </w:t>
+      </w:r>
+      <w:r>
+        <w:rPr>
+          <w:i/>
+        </w:rPr>
+        <w:t>native function calling</w:t>
+      </w:r>
+      <w:r>
+        <w:t xml:space="preserve"> [4]. Seluruh parameter inferensi dikendalikan untuk meminimalkan variabel pengganggu (</w:t>
+      </w:r>
+      <w:r>
+        <w:rPr>
+          <w:i/>
+        </w:rPr>
+        <w:t>confounding variable</w:t>
+      </w:r>
+      <w:r>
+        <w:t>), sebagaimana dirangkum pada Tabel 3.4.</w:t>
+      </w:r>
+    </w:p>
+    <w:p>
+      <w:pPr>
+        <w:pStyle w:val="Caption"/>
+        <w:keepNext/>
+        <w:jc w:val="center"/>
+      </w:pPr>
+      <w:r>
+        <w:t>Tabel 3.</w:t>
+      </w:r>
+      <w:fldSimple w:instr=" SEQ Tabel \* ARABIC \s 1 ">
+        <w:r>
+          <w:t>1</w:t>
+        </w:r>
+      </w:fldSimple>
+      <w:r>
+        <w:t xml:space="preserve"> Parameter Setup Eksperimen</w:t>
+      </w:r>
+    </w:p>
+    <w:tbl>
+      <w:tblPr>
+        <w:tblW w:type="auto" w:w="0"/>
+        <w:jc w:val="center"/>
+        <w:tblLook w:firstColumn="1" w:firstRow="1" w:lastColumn="0" w:lastRow="0" w:noHBand="0" w:noVBand="1" w:val="04A0"/>
+        <w:tblBorders>
+          <w:top w:val="single" w:sz="8" w:space="0" w:color="000000"/>
+          <w:bottom w:val="single" w:sz="8" w:space="0" w:color="000000"/>
+          <w:left w:val="none"/>
+          <w:right w:val="none"/>
+          <w:insideH w:val="none"/>
+          <w:insideV w:val="none"/>
+        </w:tblBorders>
+      </w:tblPr>
+      <w:tblGrid>
+        <w:gridCol w:w="2646"/>
+        <w:gridCol w:w="2646"/>
+        <w:gridCol w:w="2646"/>
+      </w:tblGrid>
+      <w:tr>
+        <w:trPr>
+          <w:cantSplit/>
+          <w:tblHeader/>
+        </w:trPr>
+        <w:tc>
+          <w:tcPr>
+            <w:tcW w:type="dxa" w:w="2646"/>
+            <w:tcBorders>
+              <w:top w:val="none"/>
+              <w:bottom w:val="single" w:sz="8" w:space="0" w:color="000000"/>
+              <w:left w:val="none"/>
+              <w:right w:val="none"/>
+            </w:tcBorders>
+          </w:tcPr>
+          <w:p>
+            <w:pPr>
+              <w:spacing w:line="240" w:lineRule="auto" w:after="0"/>
+            </w:pPr>
+            <w:r>
+              <w:rPr>
+                <w:b/>
+                <w:sz w:val="20"/>
+              </w:rPr>
+            </w:r>
+            <w:r>
+              <w:rPr>
+                <w:b/>
+                <w:sz w:val="20"/>
+              </w:rPr>
+              <w:t>Parameter</w:t>
+            </w:r>
+          </w:p>
+        </w:tc>
+        <w:tc>
+          <w:tcPr>
+            <w:tcW w:type="dxa" w:w="2646"/>
+            <w:tcBorders>
+              <w:top w:val="none"/>
+              <w:bottom w:val="single" w:sz="8" w:space="0" w:color="000000"/>
+              <w:left w:val="none"/>
+              <w:right w:val="none"/>
+            </w:tcBorders>
+          </w:tcPr>
+          <w:p>
+            <w:pPr>
+              <w:spacing w:line="240" w:lineRule="auto" w:after="0"/>
+            </w:pPr>
+            <w:r>
+              <w:rPr>
+                <w:b/>
+                <w:sz w:val="20"/>
+              </w:rPr>
+            </w:r>
+            <w:r>
+              <w:rPr>
+                <w:b/>
+                <w:sz w:val="20"/>
+              </w:rPr>
+              <w:t>Nilai</w:t>
+            </w:r>
+          </w:p>
+        </w:tc>
+        <w:tc>
+          <w:tcPr>
+            <w:tcW w:type="dxa" w:w="2646"/>
+            <w:tcBorders>
+              <w:top w:val="none"/>
+              <w:bottom w:val="single" w:sz="8" w:space="0" w:color="000000"/>
+              <w:left w:val="none"/>
+              <w:right w:val="none"/>
+            </w:tcBorders>
+          </w:tcPr>
+          <w:p>
+            <w:pPr>
+              <w:spacing w:line="240" w:lineRule="auto" w:after="0"/>
+            </w:pPr>
+            <w:r>
+              <w:rPr>
+                <w:b/>
+                <w:sz w:val="20"/>
+              </w:rPr>
+            </w:r>
+            <w:r>
+              <w:rPr>
+                <w:b/>
+                <w:sz w:val="20"/>
+              </w:rPr>
+              <w:t>Justifikasi</w:t>
+            </w:r>
+          </w:p>
+        </w:tc>
+      </w:tr>
+      <w:tr>
+        <w:trPr>
+          <w:cantSplit/>
+        </w:trPr>
+        <w:tc>
+          <w:tcPr>
+            <w:tcW w:type="dxa" w:w="2646"/>
+          </w:tcPr>
+          <w:p>
+            <w:pPr>
+              <w:spacing w:line="240" w:lineRule="auto" w:after="0"/>
+            </w:pPr>
+            <w:r>
+              <w:rPr>
+                <w:sz w:val="20"/>
+              </w:rPr>
+            </w:r>
+            <w:r>
+              <w:rPr>
+                <w:sz w:val="20"/>
+              </w:rPr>
+              <w:t>Model</w:t>
+            </w:r>
+          </w:p>
+        </w:tc>
+        <w:tc>
+          <w:tcPr>
+            <w:tcW w:type="dxa" w:w="2646"/>
+          </w:tcPr>
+          <w:p>
+            <w:pPr>
+              <w:spacing w:line="240" w:lineRule="auto" w:after="0"/>
+            </w:pPr>
+            <w:r>
+              <w:rPr>
+                <w:sz w:val="20"/>
+              </w:rPr>
+            </w:r>
+            <w:r>
+              <w:rPr>
+                <w:rFonts w:ascii="Courier New" w:hAnsi="Courier New"/>
+                <w:sz w:val="20"/>
+              </w:rPr>
+              <w:t>gemini-2.5-flash-lite</w:t>
+            </w:r>
+          </w:p>
+        </w:tc>
+        <w:tc>
+          <w:tcPr>
+            <w:tcW w:type="dxa" w:w="2646"/>
+          </w:tcPr>
+          <w:p>
+            <w:pPr>
+              <w:spacing w:line="240" w:lineRule="auto" w:after="0"/>
+            </w:pPr>
+            <w:r>
+              <w:rPr>
+                <w:sz w:val="20"/>
+              </w:rPr>
+            </w:r>
+            <w:r>
+              <w:rPr>
+                <w:sz w:val="20"/>
+              </w:rPr>
+              <w:t>Model produksi zerlo.id, biaya rendah</w:t>
+            </w:r>
+          </w:p>
+        </w:tc>
+      </w:tr>
+      <w:tr>
+        <w:trPr>
+          <w:cantSplit/>
+        </w:trPr>
+        <w:tc>
+          <w:tcPr>
+            <w:tcW w:type="dxa" w:w="2646"/>
+          </w:tcPr>
+          <w:p>
+            <w:pPr>
+              <w:spacing w:line="240" w:lineRule="auto" w:after="0"/>
+            </w:pPr>
+            <w:r>
+              <w:rPr>
+                <w:sz w:val="20"/>
+              </w:rPr>
+            </w:r>
+            <w:r>
+              <w:rPr>
+                <w:rFonts w:ascii="Courier New" w:hAnsi="Courier New"/>
+                <w:sz w:val="20"/>
+              </w:rPr>
+              <w:t>temperature</w:t>
+            </w:r>
+          </w:p>
+        </w:tc>
+        <w:tc>
+          <w:tcPr>
+            <w:tcW w:type="dxa" w:w="2646"/>
+          </w:tcPr>
+          <w:p>
+            <w:pPr>
+              <w:spacing w:line="240" w:lineRule="auto" w:after="0"/>
+            </w:pPr>
+            <w:r>
+              <w:rPr>
+                <w:sz w:val="20"/>
+              </w:rPr>
+            </w:r>
+            <w:r>
+              <w:rPr>
+                <w:sz w:val="20"/>
+              </w:rPr>
+              <w:t>0</w:t>
+            </w:r>
+          </w:p>
+        </w:tc>
+        <w:tc>
+          <w:tcPr>
+            <w:tcW w:type="dxa" w:w="2646"/>
+          </w:tcPr>
+          <w:p>
+            <w:pPr>
+              <w:spacing w:line="240" w:lineRule="auto" w:after="0"/>
+            </w:pPr>
+            <w:r>
+              <w:rPr>
+                <w:sz w:val="20"/>
+              </w:rPr>
+            </w:r>
+            <w:r>
+              <w:rPr>
+                <w:sz w:val="20"/>
+              </w:rPr>
+              <w:t>Determinisme maksimal keluaran model</w:t>
+            </w:r>
+          </w:p>
+        </w:tc>
+      </w:tr>
+      <w:tr>
+        <w:trPr>
+          <w:cantSplit/>
+        </w:trPr>
+        <w:tc>
+          <w:tcPr>
+            <w:tcW w:type="dxa" w:w="2646"/>
+          </w:tcPr>
+          <w:p>
+            <w:pPr>
+              <w:spacing w:line="240" w:lineRule="auto" w:after="0"/>
+            </w:pPr>
+            <w:r>
+              <w:rPr>
+                <w:sz w:val="20"/>
+              </w:rPr>
+            </w:r>
+            <w:r>
+              <w:rPr>
+                <w:rFonts w:ascii="Courier New" w:hAnsi="Courier New"/>
+                <w:sz w:val="20"/>
+              </w:rPr>
+              <w:t>mode</w:t>
+            </w:r>
+            <w:r>
+              <w:rPr>
+                <w:sz w:val="20"/>
+              </w:rPr>
+              <w:t xml:space="preserve"> (</w:t>
+            </w:r>
+            <w:r>
+              <w:rPr>
+                <w:i/>
+                <w:sz w:val="20"/>
+              </w:rPr>
+              <w:t>function calling</w:t>
+            </w:r>
+            <w:r>
+              <w:rPr>
+                <w:sz w:val="20"/>
+              </w:rPr>
+              <w:t>)</w:t>
+            </w:r>
+          </w:p>
+        </w:tc>
+        <w:tc>
+          <w:tcPr>
+            <w:tcW w:type="dxa" w:w="2646"/>
+          </w:tcPr>
+          <w:p>
+            <w:pPr>
+              <w:spacing w:line="240" w:lineRule="auto" w:after="0"/>
+            </w:pPr>
+            <w:r>
+              <w:rPr>
+                <w:sz w:val="20"/>
+              </w:rPr>
+            </w:r>
+            <w:r>
+              <w:rPr>
+                <w:sz w:val="20"/>
+              </w:rPr>
+              <w:t>ANY</w:t>
+            </w:r>
+          </w:p>
+        </w:tc>
+        <w:tc>
+          <w:tcPr>
+            <w:tcW w:type="dxa" w:w="2646"/>
+          </w:tcPr>
+          <w:p>
+            <w:pPr>
+              <w:spacing w:line="240" w:lineRule="auto" w:after="0"/>
+            </w:pPr>
+            <w:r>
+              <w:rPr>
+                <w:sz w:val="20"/>
+              </w:rPr>
+            </w:r>
+            <w:r>
+              <w:rPr>
+                <w:sz w:val="20"/>
+              </w:rPr>
+              <w:t xml:space="preserve">Memaksa model selalu memanggil satu </w:t>
+            </w:r>
+            <w:r>
+              <w:rPr>
+                <w:i/>
+                <w:sz w:val="20"/>
+              </w:rPr>
+              <w:t>tool</w:t>
+            </w:r>
+          </w:p>
+        </w:tc>
+      </w:tr>
+      <w:tr>
+        <w:trPr>
+          <w:cantSplit/>
+        </w:trPr>
+        <w:tc>
+          <w:tcPr>
+            <w:tcW w:type="dxa" w:w="2646"/>
+          </w:tcPr>
+          <w:p>
+            <w:pPr>
+              <w:spacing w:line="240" w:lineRule="auto" w:after="0"/>
+            </w:pPr>
+            <w:r>
+              <w:rPr>
+                <w:sz w:val="20"/>
+              </w:rPr>
+            </w:r>
+            <w:r>
+              <w:rPr>
+                <w:rFonts w:ascii="Courier New" w:hAnsi="Courier New"/>
+                <w:sz w:val="20"/>
+              </w:rPr>
+              <w:t>max_output_tokens</w:t>
+            </w:r>
+          </w:p>
+        </w:tc>
+        <w:tc>
+          <w:tcPr>
+            <w:tcW w:type="dxa" w:w="2646"/>
+          </w:tcPr>
+          <w:p>
+            <w:pPr>
+              <w:spacing w:line="240" w:lineRule="auto" w:after="0"/>
+            </w:pPr>
+            <w:r>
+              <w:rPr>
+                <w:sz w:val="20"/>
+              </w:rPr>
+            </w:r>
+            <w:r>
+              <w:rPr>
+                <w:sz w:val="20"/>
+              </w:rPr>
+              <w:t>32</w:t>
+            </w:r>
+          </w:p>
+        </w:tc>
+        <w:tc>
+          <w:tcPr>
+            <w:tcW w:type="dxa" w:w="2646"/>
+          </w:tcPr>
+          <w:p>
+            <w:pPr>
+              <w:spacing w:line="240" w:lineRule="auto" w:after="0"/>
+            </w:pPr>
+            <w:r>
+              <w:rPr>
+                <w:sz w:val="20"/>
+              </w:rPr>
+            </w:r>
+            <w:r>
+              <w:rPr>
+                <w:sz w:val="20"/>
+              </w:rPr>
+              <w:t xml:space="preserve">Cukup untuk satu pemanggilan </w:t>
+            </w:r>
+            <w:r>
+              <w:rPr>
+                <w:i/>
+                <w:sz w:val="20"/>
+              </w:rPr>
+              <w:t>tool</w:t>
+            </w:r>
+          </w:p>
+        </w:tc>
+      </w:tr>
+      <w:tr>
+        <w:trPr>
+          <w:cantSplit/>
+        </w:trPr>
+        <w:tc>
+          <w:tcPr>
+            <w:tcW w:type="dxa" w:w="2646"/>
+          </w:tcPr>
+          <w:p>
+            <w:pPr>
+              <w:spacing w:line="240" w:lineRule="auto" w:after="0"/>
+            </w:pPr>
+            <w:r>
+              <w:rPr>
+                <w:sz w:val="20"/>
+              </w:rPr>
+            </w:r>
+            <w:r>
+              <w:rPr>
+                <w:i/>
+                <w:sz w:val="20"/>
+              </w:rPr>
+              <w:t>Tool budget</w:t>
+            </w:r>
+            <w:r>
+              <w:rPr>
+                <w:sz w:val="20"/>
+              </w:rPr>
+              <w:t xml:space="preserve"> (registry)</w:t>
+            </w:r>
+          </w:p>
+        </w:tc>
+        <w:tc>
+          <w:tcPr>
+            <w:tcW w:type="dxa" w:w="2646"/>
+          </w:tcPr>
+          <w:p>
+            <w:pPr>
+              <w:spacing w:line="240" w:lineRule="auto" w:after="0"/>
+            </w:pPr>
+            <w:r>
+              <w:rPr>
+                <w:sz w:val="20"/>
+              </w:rPr>
+            </w:r>
+            <w:r>
+              <w:rPr>
+                <w:sz w:val="20"/>
+              </w:rPr>
+              <w:t>15</w:t>
+            </w:r>
+          </w:p>
+        </w:tc>
+        <w:tc>
+          <w:tcPr>
+            <w:tcW w:type="dxa" w:w="2646"/>
+          </w:tcPr>
+          <w:p>
+            <w:pPr>
+              <w:spacing w:line="240" w:lineRule="auto" w:after="0"/>
+            </w:pPr>
+            <w:r>
+              <w:rPr>
+                <w:sz w:val="20"/>
+              </w:rPr>
+            </w:r>
+            <w:r>
+              <w:rPr>
+                <w:sz w:val="20"/>
+              </w:rPr>
+              <w:t xml:space="preserve">Batas maksimal </w:t>
+            </w:r>
+            <w:r>
+              <w:rPr>
+                <w:i/>
+                <w:sz w:val="20"/>
+              </w:rPr>
+              <w:t>tool</w:t>
+            </w:r>
+            <w:r>
+              <w:rPr>
+                <w:sz w:val="20"/>
+              </w:rPr>
+              <w:t xml:space="preserve"> yang diteruskan</w:t>
+            </w:r>
+          </w:p>
+        </w:tc>
+      </w:tr>
+      <w:tr>
+        <w:trPr>
+          <w:cantSplit/>
+        </w:trPr>
+        <w:tc>
+          <w:tcPr>
+            <w:tcW w:type="dxa" w:w="2646"/>
+          </w:tcPr>
+          <w:p>
+            <w:pPr>
+              <w:spacing w:line="240" w:lineRule="auto" w:after="0"/>
+            </w:pPr>
+            <w:r>
+              <w:rPr>
+                <w:sz w:val="20"/>
+              </w:rPr>
+            </w:r>
+            <w:r>
+              <w:rPr>
+                <w:i/>
+                <w:sz w:val="20"/>
+              </w:rPr>
+              <w:t>Repeat runs</w:t>
+            </w:r>
+          </w:p>
+        </w:tc>
+        <w:tc>
+          <w:tcPr>
+            <w:tcW w:type="dxa" w:w="2646"/>
+          </w:tcPr>
+          <w:p>
+            <w:pPr>
+              <w:spacing w:line="240" w:lineRule="auto" w:after="0"/>
+            </w:pPr>
+            <w:r>
+              <w:rPr>
+                <w:sz w:val="20"/>
+              </w:rPr>
+            </w:r>
+            <w:r>
+              <w:rPr>
+                <w:sz w:val="20"/>
+              </w:rPr>
+              <w:t>3</w:t>
+            </w:r>
+          </w:p>
+        </w:tc>
+        <w:tc>
+          <w:tcPr>
+            <w:tcW w:type="dxa" w:w="2646"/>
+          </w:tcPr>
+          <w:p>
+            <w:pPr>
+              <w:spacing w:line="240" w:lineRule="auto" w:after="0"/>
+            </w:pPr>
+            <w:r>
+              <w:rPr>
+                <w:sz w:val="20"/>
+              </w:rPr>
+            </w:r>
+            <w:r>
+              <w:rPr>
+                <w:sz w:val="20"/>
+              </w:rPr>
+              <w:t>Menangkap variabilitas keluaran model</w:t>
+            </w:r>
+          </w:p>
+        </w:tc>
+      </w:tr>
+      <w:tr>
+        <w:trPr>
+          <w:cantSplit/>
+        </w:trPr>
+        <w:tc>
+          <w:tcPr>
+            <w:tcW w:type="dxa" w:w="2646"/>
+          </w:tcPr>
+          <w:p>
+            <w:pPr>
+              <w:spacing w:line="240" w:lineRule="auto" w:after="0"/>
+            </w:pPr>
+            <w:r>
+              <w:rPr>
+                <w:sz w:val="20"/>
+              </w:rPr>
+            </w:r>
+            <w:r>
+              <w:rPr>
+                <w:sz w:val="20"/>
+              </w:rPr>
+              <w:t>Total rekaman</w:t>
+            </w:r>
+          </w:p>
+        </w:tc>
+        <w:tc>
+          <w:tcPr>
+            <w:tcW w:type="dxa" w:w="2646"/>
+          </w:tcPr>
+          <w:p>
+            <w:pPr>
+              <w:spacing w:line="240" w:lineRule="auto" w:after="0"/>
+            </w:pPr>
+            <w:r>
+              <w:rPr>
+                <w:sz w:val="20"/>
+              </w:rPr>
+            </w:r>
+            <w:r>
+              <w:rPr>
+                <w:sz w:val="20"/>
+              </w:rPr>
+              <w:t>558</w:t>
+            </w:r>
+          </w:p>
+        </w:tc>
+        <w:tc>
+          <w:tcPr>
+            <w:tcW w:type="dxa" w:w="2646"/>
+          </w:tcPr>
+          <w:p>
+            <w:pPr>
+              <w:spacing w:line="240" w:lineRule="auto" w:after="0"/>
+            </w:pPr>
+            <w:r>
+              <w:rPr>
+                <w:sz w:val="20"/>
+              </w:rPr>
+            </w:r>
+            <w:r>
+              <w:rPr>
+                <w:sz w:val="20"/>
+              </w:rPr>
+              <w:t xml:space="preserve">279 </w:t>
+            </w:r>
+            <w:r>
+              <w:rPr>
+                <w:i/>
+                <w:sz w:val="20"/>
+              </w:rPr>
+              <w:t>baseline</w:t>
+            </w:r>
+            <w:r>
+              <w:rPr>
+                <w:sz w:val="20"/>
+              </w:rPr>
+              <w:t xml:space="preserve"> + 279 </w:t>
+            </w:r>
+            <w:r>
+              <w:rPr>
+                <w:i/>
+                <w:sz w:val="20"/>
+              </w:rPr>
+              <w:t>registry</w:t>
+            </w:r>
+          </w:p>
+        </w:tc>
+      </w:tr>
+    </w:tbl>
+    <w:p>
+      <w:pPr>
+        <w:ind w:firstLine="720"/>
+        <w:jc w:val="both"/>
+      </w:pPr>
+      <w:r>
+        <w:t xml:space="preserve">Penetapan </w:t>
+      </w:r>
+      <w:r>
+        <w:rPr>
+          <w:rFonts w:ascii="Courier New" w:hAnsi="Courier New"/>
+        </w:rPr>
+        <w:t>temperature=0</w:t>
+      </w:r>
+      <w:r>
+        <w:t xml:space="preserve"> dan </w:t>
+      </w:r>
+      <w:r>
+        <w:rPr>
+          <w:rFonts w:ascii="Courier New" w:hAnsi="Courier New"/>
+        </w:rPr>
+        <w:t>mode=ANY</w:t>
+      </w:r>
+      <w:r>
+        <w:t xml:space="preserve"> memaksa model bersifat deterministik dan selalu memilih tepat satu </w:t>
+      </w:r>
+      <w:r>
+        <w:rPr>
+          <w:i/>
+        </w:rPr>
+        <w:t>tool</w:t>
+      </w:r>
+      <w:r>
+        <w:t xml:space="preserve">, sehingga akurasi dapat dinilai secara biner terhadap </w:t>
+      </w:r>
+      <w:r>
+        <w:rPr>
+          <w:rFonts w:ascii="Courier New" w:hAnsi="Courier New"/>
+        </w:rPr>
+        <w:t>expected_tool</w:t>
+      </w:r>
+      <w:r>
+        <w:t xml:space="preserve">. Konfigurasi pemanggilan model diimplementasikan melalui objek </w:t>
+      </w:r>
+      <w:r>
+        <w:rPr>
+          <w:rFonts w:ascii="Courier New" w:hAnsi="Courier New"/>
+        </w:rPr>
+        <w:t>GenerateContentConfig</w:t>
+      </w:r>
+      <w:r>
+        <w:t xml:space="preserve"> sebagaimana disajikan pada Kode Program 3.4.</w:t>
+      </w:r>
+    </w:p>
+    <w:p>
+      <w:pPr>
+        <w:pStyle w:val="Caption"/>
+        <w:keepNext/>
+        <w:jc w:val="center"/>
+      </w:pPr>
+      <w:r>
+        <w:t>Kode Program 3.4 Konfigurasi Pemanggilan Gemini</w:t>
+      </w:r>
+    </w:p>
+    <w:p>
+      <w:pPr>
+        <w:keepLines/>
+        <w:spacing w:line="240" w:lineRule="auto" w:before="120" w:after="120"/>
+        <w:ind w:left="283" w:right="113"/>
+        <w:jc w:val="left"/>
+        <w:shd w:val="clear" w:color="auto" w:fill="F2F2F2"/>
+      </w:pPr>
+      <w:r>
+        <w:rPr>
+          <w:rFonts w:ascii="Courier New" w:hAnsi="Courier New" w:cs="Courier New"/>
+          <w:sz w:val="18"/>
+        </w:rPr>
+        <w:t>gen_config = types.GenerateContentConfig(</w:t>
+        <w:br/>
+      </w:r>
+      <w:r>
+        <w:rPr>
+          <w:rFonts w:ascii="Courier New" w:hAnsi="Courier New" w:cs="Courier New"/>
+          <w:sz w:val="18"/>
+        </w:rPr>
+        <w:t xml:space="preserve">    system_instruction=(</w:t>
+        <w:br/>
+      </w:r>
+      <w:r>
+        <w:rPr>
+          <w:rFonts w:ascii="Courier New" w:hAnsi="Courier New" w:cs="Courier New"/>
+          <w:sz w:val="18"/>
+        </w:rPr>
+        <w:t xml:space="preserve">        "Anda adalah router tool ERP restoran. "</w:t>
+        <w:br/>
+      </w:r>
+      <w:r>
+        <w:rPr>
+          <w:rFonts w:ascii="Courier New" w:hAnsi="Courier New" w:cs="Courier New"/>
+          <w:sz w:val="18"/>
+        </w:rPr>
+        <w:t xml:space="preserve">        "Pilih dan panggil SATU tool yang paling tepat untuk permintaan pengguna."</w:t>
+        <w:br/>
+      </w:r>
+      <w:r>
+        <w:rPr>
+          <w:rFonts w:ascii="Courier New" w:hAnsi="Courier New" w:cs="Courier New"/>
+          <w:sz w:val="18"/>
+        </w:rPr>
+        <w:t xml:space="preserve">    ),</w:t>
+        <w:br/>
+      </w:r>
+      <w:r>
+        <w:rPr>
+          <w:rFonts w:ascii="Courier New" w:hAnsi="Courier New" w:cs="Courier New"/>
+          <w:sz w:val="18"/>
+        </w:rPr>
+        <w:t xml:space="preserve">    tools=[types.Tool(function_declarations=fn_decls)],</w:t>
+        <w:br/>
+      </w:r>
+      <w:r>
+        <w:rPr>
+          <w:rFonts w:ascii="Courier New" w:hAnsi="Courier New" w:cs="Courier New"/>
+          <w:sz w:val="18"/>
+        </w:rPr>
+        <w:t xml:space="preserve">    tool_config=types.ToolConfig(</w:t>
+        <w:br/>
+      </w:r>
+      <w:r>
+        <w:rPr>
+          <w:rFonts w:ascii="Courier New" w:hAnsi="Courier New" w:cs="Courier New"/>
+          <w:sz w:val="18"/>
+        </w:rPr>
+        <w:t xml:space="preserve">        function_calling_config=types.FunctionCallingConfig(</w:t>
+        <w:br/>
+      </w:r>
+      <w:r>
+        <w:rPr>
+          <w:rFonts w:ascii="Courier New" w:hAnsi="Courier New" w:cs="Courier New"/>
+          <w:sz w:val="18"/>
+        </w:rPr>
+        <w:t xml:space="preserve">            mode="ANY",</w:t>
+        <w:br/>
+      </w:r>
+      <w:r>
+        <w:rPr>
+          <w:rFonts w:ascii="Courier New" w:hAnsi="Courier New" w:cs="Courier New"/>
+          <w:sz w:val="18"/>
+        </w:rPr>
+        <w:t xml:space="preserve">            allowed_function_names=list(tool_names),</w:t>
+        <w:br/>
+      </w:r>
+      <w:r>
+        <w:rPr>
+          <w:rFonts w:ascii="Courier New" w:hAnsi="Courier New" w:cs="Courier New"/>
+          <w:sz w:val="18"/>
+        </w:rPr>
+        <w:t xml:space="preserve">        )</w:t>
+        <w:br/>
+      </w:r>
+      <w:r>
+        <w:rPr>
+          <w:rFonts w:ascii="Courier New" w:hAnsi="Courier New" w:cs="Courier New"/>
+          <w:sz w:val="18"/>
+        </w:rPr>
+        <w:t xml:space="preserve">    ),</w:t>
+        <w:br/>
+      </w:r>
+      <w:r>
+        <w:rPr>
+          <w:rFonts w:ascii="Courier New" w:hAnsi="Courier New" w:cs="Courier New"/>
+          <w:sz w:val="18"/>
+        </w:rPr>
+        <w:t xml:space="preserve">    temperature=0,</w:t>
+        <w:br/>
+      </w:r>
+      <w:r>
+        <w:rPr>
+          <w:rFonts w:ascii="Courier New" w:hAnsi="Courier New" w:cs="Courier New"/>
+          <w:sz w:val="18"/>
+        </w:rPr>
+        <w:t xml:space="preserve">    max_output_tokens=32,</w:t>
+        <w:br/>
+      </w:r>
+      <w:r>
+        <w:rPr>
+          <w:rFonts w:ascii="Courier New" w:hAnsi="Courier New" w:cs="Courier New"/>
+          <w:sz w:val="18"/>
+        </w:rPr>
+        <w:t>)</w:t>
+      </w:r>
+    </w:p>
+    <w:p>
+      <w:pPr>
+        <w:ind w:firstLine="720"/>
+        <w:jc w:val="both"/>
+      </w:pPr>
+      <w:r>
+        <w:t xml:space="preserve">Perbedaan tunggal antara mode </w:t>
+      </w:r>
+      <w:r>
+        <w:rPr>
+          <w:i/>
+        </w:rPr>
+        <w:t>baseline</w:t>
+      </w:r>
+      <w:r>
+        <w:t xml:space="preserve"> dan </w:t>
+      </w:r>
+      <w:r>
+        <w:rPr>
+          <w:i/>
+        </w:rPr>
+        <w:t>registry</w:t>
+      </w:r>
+      <w:r>
+        <w:t xml:space="preserve"> terletak pada himpunan </w:t>
+      </w:r>
+      <w:r>
+        <w:rPr>
+          <w:rFonts w:ascii="Courier New" w:hAnsi="Courier New"/>
+        </w:rPr>
+        <w:t>fn_decls</w:t>
+      </w:r>
+      <w:r>
+        <w:t xml:space="preserve">: pada mode </w:t>
+      </w:r>
+      <w:r>
+        <w:rPr>
+          <w:i/>
+        </w:rPr>
+        <w:t>baseline</w:t>
+      </w:r>
+      <w:r>
+        <w:t xml:space="preserve">, himpunan ini berisi seluruh </w:t>
+      </w:r>
+      <w:r>
+        <w:rPr>
+          <w:i/>
+        </w:rPr>
+        <w:t>tool</w:t>
+      </w:r>
+      <w:r>
+        <w:t xml:space="preserve"> katalog (30/100/300), sedangkan pada mode </w:t>
+      </w:r>
+      <w:r>
+        <w:rPr>
+          <w:i/>
+        </w:rPr>
+        <w:t>registry</w:t>
+      </w:r>
+      <w:r>
+        <w:t xml:space="preserve"> himpunan ini merupakan keluaran </w:t>
+      </w:r>
+      <w:r>
+        <w:rPr>
+          <w:rFonts w:ascii="Courier New" w:hAnsi="Courier New"/>
+        </w:rPr>
+        <w:t>registry_filter()</w:t>
+      </w:r>
+      <w:r>
+        <w:t xml:space="preserve"> yang dibatasi 15 </w:t>
+      </w:r>
+      <w:r>
+        <w:rPr>
+          <w:i/>
+        </w:rPr>
+        <w:t>tool</w:t>
+      </w:r>
+      <w:r>
+        <w:t>. Dengan menjaga seluruh parameter lain identik, eksperimen ini mengisolasi dampak penyaringan sebagai satu-satunya perlakuan, sehingga hasil yang dianalisis pada Bab IV dapat diatribusikan secara valid kepada Tool Registry. Untuk meredam kegagalan transien akibat batas laju (</w:t>
+      </w:r>
+      <w:r>
+        <w:rPr>
+          <w:i/>
+        </w:rPr>
+        <w:t>rate limit</w:t>
+      </w:r>
+      <w:r>
+        <w:t xml:space="preserve">) layanan, </w:t>
+      </w:r>
+      <w:r>
+        <w:rPr>
+          <w:i/>
+        </w:rPr>
+        <w:t>backend</w:t>
+      </w:r>
+      <w:r>
+        <w:t xml:space="preserve"> dilengkapi mekanisme </w:t>
+      </w:r>
+      <w:r>
+        <w:rPr>
+          <w:i/>
+        </w:rPr>
+        <w:t>retry</w:t>
+      </w:r>
+      <w:r>
+        <w:t xml:space="preserve"> dengan </w:t>
+      </w:r>
+      <w:r>
+        <w:rPr>
+          <w:i/>
+        </w:rPr>
+        <w:t>exponential backoff</w:t>
+      </w:r>
+      <w:r>
+        <w:t xml:space="preserve"> hingga lima kali percobaan.</w:t>
+      </w:r>
+    </w:p>
+    <w:p>
+      <w:pPr>
+        <w:keepNext/>
+        <w:spacing w:before="240"/>
+      </w:pPr>
+      <w:r>
+        <w:rPr>
+          <w:b/>
+        </w:rPr>
+        <w:t>Referensi Bab III</w:t>
+      </w:r>
+    </w:p>
+    <w:p>
+      <w:pPr>
+        <w:keepLines/>
+        <w:spacing w:after="120"/>
+        <w:ind w:left="567" w:hanging="567"/>
+        <w:jc w:val="both"/>
+      </w:pPr>
+      <w:r>
+        <w:t xml:space="preserve">[1] A.R. Hevner, S.T. March, J. Park, dan S. Ram, "Design science in information systems research," </w:t>
+      </w:r>
+      <w:r>
+        <w:rPr>
+          <w:i/>
+        </w:rPr>
+        <w:t>MIS Quarterly</w:t>
+      </w:r>
+      <w:r>
+        <w:t>, vol. 28, no. 1, pp. 75–105, Mar. 2004.</w:t>
+      </w:r>
+    </w:p>
+    <w:p>
+      <w:pPr>
+        <w:keepLines/>
+        <w:spacing w:after="120"/>
+        <w:ind w:left="567" w:hanging="567"/>
+        <w:jc w:val="both"/>
+      </w:pPr>
+      <w:r>
+        <w:t xml:space="preserve">[2] Pydantic, "Pydantic AI — Toolsets," </w:t>
+      </w:r>
+      <w:r>
+        <w:rPr>
+          <w:i/>
+        </w:rPr>
+        <w:t>Pydantic AI Documentation</w:t>
+      </w:r>
+      <w:r>
+        <w:t>, 2025. [Online]. Tersedia: https://ai.pydantic.dev/</w:t>
+      </w:r>
+    </w:p>
+    <w:p>
+      <w:pPr>
+        <w:keepLines/>
+        <w:spacing w:after="120"/>
+        <w:ind w:left="567" w:hanging="567"/>
+        <w:jc w:val="both"/>
+      </w:pPr>
+      <w:r>
+        <w:t xml:space="preserve">[3] P. Rajasekaran, E. Dixon, C. Ryan, dan J. Hadfield, "Effective context engineering for AI agents," </w:t>
+      </w:r>
+      <w:r>
+        <w:rPr>
+          <w:i/>
+        </w:rPr>
+        <w:t>Anthropic Engineering Blog</w:t>
+      </w:r>
+      <w:r>
+        <w:t>, Sep. 2025.</w:t>
+      </w:r>
+    </w:p>
+    <w:p>
+      <w:pPr>
+        <w:keepLines/>
+        <w:spacing w:after="120"/>
+        <w:ind w:left="567" w:hanging="567"/>
+        <w:jc w:val="both"/>
+      </w:pPr>
+      <w:r>
+        <w:t xml:space="preserve">[4] Google DeepMind, "Gemini API function calling," </w:t>
+      </w:r>
+      <w:r>
+        <w:rPr>
+          <w:i/>
+        </w:rPr>
+        <w:t>Google AI Developer Documentation</w:t>
+      </w:r>
+      <w:r>
+        <w:t>, 2024. [Online]. Tersedia: https://ai.google.dev/gemini-api/docs/function-calling</w:t>
       </w:r>
     </w:p>
     <w:p>

</xml_diff>

<commit_message>
Add Bab V (Kesimpulan) answering 4 rumusan masalah with corrected framing
- 5.1 Kesimpulan: answers RQ1–RQ4 with exact official numbers (token
  −63/−84/−95%, Wilcoxon p<0.0001, Cohen's d 11.7–782; accuracy +6.3pp
  framed as directional/not-significant; latency −14% modest; sub-linear
  O(1) visible tools at 15).
- 5.2 Keterbatasan & Ancaman Validitas: condensed from threats draft, adds
  Tabel 5.1 (ancaman → mitigasi → future work).
- 5.3 Saran/Future Work: Tool RAG, two-stage hybrid, full param schema,
  multi-model harness, production integration. 3 IEEE future-work refs.
- Wire bab-5-kesimpulan.md into generator CHAPTERS; rebuild verified 5/5
  chapters, 23 captions, 0 missing images.

Co-Authored-By: Claude Opus 4.8 (1M context) <noreply@anthropic.com>
</commit_message>
<xml_diff>
--- a/draft/Draft-Tugas-Akhir-Muhammadridwan.docx
+++ b/draft/Draft-Tugas-Akhir-Muhammadridwan.docx
@@ -17580,58 +17580,1827 @@
       </w:r>
     </w:p>
     <w:p>
-      <w:r>
-        <w:rPr>
-          <w:b/>
-          <w:i/>
-        </w:rPr>
-        <w:t>[BAB V BELUM DITULIS]</w:t>
+      <w:pPr>
+        <w:pStyle w:val="Heading2"/>
+      </w:pPr>
+      <w:r>
+        <w:t>5.1 Kesimpulan</w:t>
       </w:r>
     </w:p>
     <w:p>
       <w:pPr>
+        <w:ind w:firstLine="720"/>
         <w:jc w:val="both"/>
       </w:pPr>
       <w:r>
-        <w:t>Rencana sub-bab (mengikuti sistematika UNSIA untuk skema Tugas Akhir Prototype):</w:t>
+        <w:t xml:space="preserve">Penelitian ini merancang, mengimplementasikan, dan mengevaluasi secara kuantitatif sebuah </w:t>
+      </w:r>
+      <w:r>
+        <w:rPr>
+          <w:i/>
+        </w:rPr>
+        <w:t>Tool Registry</w:t>
+      </w:r>
+      <w:r>
+        <w:t xml:space="preserve"> deterministik berbasis metadata sebagai lapisan penyaringan </w:t>
+      </w:r>
+      <w:r>
+        <w:rPr>
+          <w:i/>
+        </w:rPr>
+        <w:t>tool</w:t>
+      </w:r>
+      <w:r>
+        <w:t xml:space="preserve"> di hadapan AI Agent pada platform ERP restoran zerlo.id. Berdasarkan hasil eksperimen yang dipaparkan pada Bab IV — khususnya eksperimen resmi Gemini Native v2 dengan total n=558 rekaman — keempat rumusan masalah penelitian dapat dijawab sebagai berikut.</w:t>
       </w:r>
     </w:p>
     <w:p>
       <w:pPr>
-        <w:pStyle w:val="Heading2"/>
-      </w:pPr>
-      <w:r>
-        <w:t>5.1 Kesimpulan</w:t>
+        <w:ind w:firstLine="720"/>
+        <w:jc w:val="both"/>
+      </w:pPr>
+      <w:r>
+        <w:rPr>
+          <w:b/>
+        </w:rPr>
+        <w:t>Rumusan masalah pertama</w:t>
+      </w:r>
+      <w:r>
+        <w:t xml:space="preserve"> menyangkut perancangan Tool Registry yang mampu menyimpan metadata </w:t>
+      </w:r>
+      <w:r>
+        <w:rPr>
+          <w:i/>
+        </w:rPr>
+        <w:t>tool</w:t>
+      </w:r>
+      <w:r>
+        <w:t xml:space="preserve"> secara terstruktur. Permasalahan ini terjawab melalui perancangan </w:t>
+      </w:r>
+      <w:r>
+        <w:rPr>
+          <w:i/>
+        </w:rPr>
+        <w:t>dataclass</w:t>
+      </w:r>
+      <w:r>
+        <w:t xml:space="preserve"> </w:t>
+      </w:r>
+      <w:r>
+        <w:rPr>
+          <w:rFonts w:ascii="Courier New" w:hAnsi="Courier New"/>
+        </w:rPr>
+        <w:t>ToolMeta</w:t>
+      </w:r>
+      <w:r>
+        <w:t xml:space="preserve"> yang menyimpan lima atribut metadata per </w:t>
+      </w:r>
+      <w:r>
+        <w:rPr>
+          <w:i/>
+        </w:rPr>
+        <w:t>tool</w:t>
+      </w:r>
+      <w:r>
+        <w:t xml:space="preserve"> — modul (</w:t>
+      </w:r>
+      <w:r>
+        <w:rPr>
+          <w:i/>
+        </w:rPr>
+        <w:t>module</w:t>
+      </w:r>
+      <w:r>
+        <w:t>), tipe operasi (</w:t>
+      </w:r>
+      <w:r>
+        <w:rPr>
+          <w:i/>
+        </w:rPr>
+        <w:t>op_type</w:t>
+      </w:r>
+      <w:r>
+        <w:t>), kata kunci (</w:t>
+      </w:r>
+      <w:r>
+        <w:rPr>
+          <w:i/>
+        </w:rPr>
+        <w:t>keywords</w:t>
+      </w:r>
+      <w:r>
+        <w:t>), peran (</w:t>
+      </w:r>
+      <w:r>
+        <w:rPr>
+          <w:i/>
+        </w:rPr>
+        <w:t>role</w:t>
+      </w:r>
+      <w:r>
+        <w:t>), dan tingkat langganan (</w:t>
+      </w:r>
+      <w:r>
+        <w:rPr>
+          <w:i/>
+        </w:rPr>
+        <w:t>tier</w:t>
+      </w:r>
+      <w:r>
+        <w:t xml:space="preserve">) — serta kelas </w:t>
+      </w:r>
+      <w:r>
+        <w:rPr>
+          <w:rFonts w:ascii="Courier New" w:hAnsi="Courier New"/>
+        </w:rPr>
+        <w:t>ToolRegistry</w:t>
+      </w:r>
+      <w:r>
+        <w:t xml:space="preserve"> sebagai </w:t>
+      </w:r>
+      <w:r>
+        <w:rPr>
+          <w:i/>
+        </w:rPr>
+        <w:t>singleton</w:t>
+      </w:r>
+      <w:r>
+        <w:t xml:space="preserve"> penyimpan katalog. Rancangan ini terbukti memadai untuk merepresentasikan seluruh </w:t>
+      </w:r>
+      <w:r>
+        <w:rPr>
+          <w:i/>
+        </w:rPr>
+        <w:t>tool</w:t>
+      </w:r>
+      <w:r>
+        <w:t xml:space="preserve"> pada tiga skenario katalog (30, 100, dan 300 </w:t>
+      </w:r>
+      <w:r>
+        <w:rPr>
+          <w:i/>
+        </w:rPr>
+        <w:t>tools</w:t>
+      </w:r>
+      <w:r>
+        <w:t>) tanpa perubahan struktur, sebagaimana diuraikan pada Bab III.</w:t>
       </w:r>
     </w:p>
     <w:p>
       <w:pPr>
         <w:ind w:firstLine="720"/>
-      </w:pPr>
-      <w:r>
-        <w:rPr>
-          <w:i/>
-        </w:rPr>
-        <w:t>[konten belum ditulis]</w:t>
+        <w:jc w:val="both"/>
+      </w:pPr>
+      <w:r>
+        <w:rPr>
+          <w:b/>
+        </w:rPr>
+        <w:t>Rumusan masalah kedua</w:t>
+      </w:r>
+      <w:r>
+        <w:t xml:space="preserve"> menyangkut mekanisme penyaringan </w:t>
+      </w:r>
+      <w:r>
+        <w:rPr>
+          <w:i/>
+        </w:rPr>
+        <w:t>tool</w:t>
+      </w:r>
+      <w:r>
+        <w:t xml:space="preserve"> secara dinamis berdasarkan modul, peran, tingkat langganan, dan anggaran token. Permasalahan ini terjawab melalui fungsi </w:t>
+      </w:r>
+      <w:r>
+        <w:rPr>
+          <w:rFonts w:ascii="Courier New" w:hAnsi="Courier New"/>
+        </w:rPr>
+        <w:t>registry_filter()</w:t>
+      </w:r>
+      <w:r>
+        <w:t xml:space="preserve"> yang menjalankan </w:t>
+      </w:r>
+      <w:r>
+        <w:rPr>
+          <w:i/>
+        </w:rPr>
+        <w:t>pipeline</w:t>
+      </w:r>
+      <w:r>
+        <w:t xml:space="preserve"> penyaringan berbasis </w:t>
+      </w:r>
+      <w:r>
+        <w:rPr>
+          <w:i/>
+        </w:rPr>
+        <w:t>keyword scoring</w:t>
+      </w:r>
+      <w:r>
+        <w:t xml:space="preserve"> dengan </w:t>
+      </w:r>
+      <w:r>
+        <w:rPr>
+          <w:i/>
+        </w:rPr>
+        <w:t>budget cap</w:t>
+      </w:r>
+      <w:r>
+        <w:t xml:space="preserve"> maksimal 15 </w:t>
+      </w:r>
+      <w:r>
+        <w:rPr>
+          <w:i/>
+        </w:rPr>
+        <w:t>tools</w:t>
+      </w:r>
+      <w:r>
+        <w:t xml:space="preserve"> per panggilan. Mekanisme ini bekerja secara deterministik dan ringan — tanpa ketergantungan pada model </w:t>
+      </w:r>
+      <w:r>
+        <w:rPr>
+          <w:i/>
+        </w:rPr>
+        <w:t>embedding</w:t>
+      </w:r>
+      <w:r>
+        <w:t xml:space="preserve"> maupun basis data vektor — sehingga selaras dengan kebutuhan sistem ERP berukuran menengah seperti zerlo.id.</w:t>
       </w:r>
     </w:p>
     <w:p>
       <w:pPr>
-        <w:pStyle w:val="Heading2"/>
-      </w:pPr>
-      <w:r>
-        <w:t>5.2 Saran / Future Work</w:t>
+        <w:ind w:firstLine="720"/>
+        <w:jc w:val="both"/>
+      </w:pPr>
+      <w:r>
+        <w:rPr>
+          <w:b/>
+        </w:rPr>
+        <w:t>Rumusan masalah ketiga</w:t>
+      </w:r>
+      <w:r>
+        <w:t xml:space="preserve"> menyangkut dampak Tool Registry terhadap penggunaan token, latensi, dan akurasi pemilihan </w:t>
+      </w:r>
+      <w:r>
+        <w:rPr>
+          <w:i/>
+        </w:rPr>
+        <w:t>tool</w:t>
+      </w:r>
+      <w:r>
+        <w:t xml:space="preserve">. Hasil pengukuran menunjukkan bahwa kontribusi terkuat penelitian ini terletak pada </w:t>
+      </w:r>
+      <w:r>
+        <w:rPr>
+          <w:b/>
+        </w:rPr>
+        <w:t>penghematan token</w:t>
+      </w:r>
+      <w:r>
+        <w:t xml:space="preserve">: konsumsi token rata-rata per kueri turun dari 2.426 menjadi 893 token pada skenario S1 (−63%), dari 7.985 menjadi 1.241 token pada S2 (−84%), dan dari 23.893 menjadi 1.239 token pada S3 (−95%). Penghematan ini terbukti signifikan secara statistik dengan uji Wilcoxon </w:t>
+      </w:r>
+      <w:r>
+        <w:rPr>
+          <w:i/>
+        </w:rPr>
+        <w:t>signed-rank</w:t>
+      </w:r>
+      <w:r>
+        <w:t xml:space="preserve"> (p=0,0002 pada S1; p&lt;0,0001 pada S2 dan S3) dan ukuran efek Cohen's d yang sangat besar (11,71 hingga 782,01), jauh melampaui ambang </w:t>
+      </w:r>
+      <w:r>
+        <w:rPr>
+          <w:i/>
+        </w:rPr>
+        <w:t>large effect</w:t>
+      </w:r>
+      <w:r>
+        <w:t xml:space="preserve">. Pada dimensi akurasi, mode </w:t>
+      </w:r>
+      <w:r>
+        <w:rPr>
+          <w:i/>
+        </w:rPr>
+        <w:t>registry</w:t>
+      </w:r>
+      <w:r>
+        <w:t xml:space="preserve"> mencatat tren positif sebesar +6,3 persentase poin pada S1 (68,8% → 75,0%) dan S3 (71,4% → 77,6%), namun tanpa perubahan pada S2 (71,4% → 71,4%); peningkatan ini bersifat </w:t>
+      </w:r>
+      <w:r>
+        <w:rPr>
+          <w:i/>
+        </w:rPr>
+        <w:t>directional</w:t>
+      </w:r>
+      <w:r>
+        <w:t xml:space="preserve"> dan </w:t>
+      </w:r>
+      <w:r>
+        <w:rPr>
+          <w:b/>
+        </w:rPr>
+        <w:t>belum signifikan</w:t>
+      </w:r>
+      <w:r>
+        <w:t xml:space="preserve"> secara statistik (Wilcoxon p=0,28; 0,50; dan 0,09, seluruhnya di atas α=0,05), sehingga diposisikan sebagai tren pendukung, bukan klaim utama. Pada dimensi latensi, perbaikan bersifat moderat dan </w:t>
+      </w:r>
+      <w:r>
+        <w:rPr>
+          <w:i/>
+        </w:rPr>
+        <w:t>noisy</w:t>
+      </w:r>
+      <w:r>
+        <w:t xml:space="preserve">: latensi p50 pada S3 turun dari 992 ms menjadi 851 ms (−14%), sedangkan pada S1 mode </w:t>
+      </w:r>
+      <w:r>
+        <w:rPr>
+          <w:i/>
+        </w:rPr>
+        <w:t>registry</w:t>
+      </w:r>
+      <w:r>
+        <w:t xml:space="preserve"> justru sedikit lebih lambat — sehingga perbaikan latensi tidak dapat dinyatakan kuat.</w:t>
       </w:r>
     </w:p>
     <w:p>
       <w:pPr>
         <w:ind w:firstLine="720"/>
-      </w:pPr>
-      <w:r>
-        <w:rPr>
-          <w:i/>
-        </w:rPr>
-        <w:t>[konten belum ditulis]</w:t>
+        <w:jc w:val="both"/>
+      </w:pPr>
+      <w:r>
+        <w:rPr>
+          <w:b/>
+        </w:rPr>
+        <w:t>Rumusan masalah keempat</w:t>
+      </w:r>
+      <w:r>
+        <w:t xml:space="preserve"> menyangkut kemampuan Tool Registry mendukung skalabilitas AI Agent ketika katalog </w:t>
+      </w:r>
+      <w:r>
+        <w:rPr>
+          <w:i/>
+        </w:rPr>
+        <w:t>tool</w:t>
+      </w:r>
+      <w:r>
+        <w:t xml:space="preserve"> bertambah. Permasalahan ini terjawab melalui temuan skalabilitas </w:t>
+      </w:r>
+      <w:r>
+        <w:rPr>
+          <w:i/>
+        </w:rPr>
+        <w:t>sub-linear</w:t>
+      </w:r>
+      <w:r>
+        <w:t xml:space="preserve">: jumlah </w:t>
+      </w:r>
+      <w:r>
+        <w:rPr>
+          <w:i/>
+        </w:rPr>
+        <w:t>tool</w:t>
+      </w:r>
+      <w:r>
+        <w:t xml:space="preserve"> yang terlihat oleh LLM tetap konstan pada batas anggaran (15 </w:t>
+      </w:r>
+      <w:r>
+        <w:rPr>
+          <w:i/>
+        </w:rPr>
+        <w:t>tools</w:t>
+      </w:r>
+      <w:r>
+        <w:t xml:space="preserve"> pada S2 dan S3; 10,6 </w:t>
+      </w:r>
+      <w:r>
+        <w:rPr>
+          <w:i/>
+        </w:rPr>
+        <w:t>tools</w:t>
+      </w:r>
+      <w:r>
+        <w:t xml:space="preserve"> rata-rata pada S1) meskipun ukuran katalog tumbuh dari 30 ke 100 ke 300 </w:t>
+      </w:r>
+      <w:r>
+        <w:rPr>
+          <w:i/>
+        </w:rPr>
+        <w:t>tools</w:t>
+      </w:r>
+      <w:r>
+        <w:t xml:space="preserve">. Dengan demikian, konsumsi token mode </w:t>
+      </w:r>
+      <w:r>
+        <w:rPr>
+          <w:i/>
+        </w:rPr>
+        <w:t>registry</w:t>
+      </w:r>
+      <w:r>
+        <w:t xml:space="preserve"> praktis stabil (893–1.241 token) sementara konsumsi </w:t>
+      </w:r>
+      <w:r>
+        <w:rPr>
+          <w:i/>
+        </w:rPr>
+        <w:t>baseline</w:t>
+      </w:r>
+      <w:r>
+        <w:t xml:space="preserve"> meningkat hampir sepuluh kali lipat (2.426 → 23.893 token). Perilaku ini mengubah kompleksitas dari O(N) menjadi O(1) terhadap ukuran katalog, dengan </w:t>
+      </w:r>
+      <w:r>
+        <w:rPr>
+          <w:i/>
+        </w:rPr>
+        <w:t>overhead</w:t>
+      </w:r>
+      <w:r>
+        <w:t xml:space="preserve"> memori yang tetap kecil dan linear (22 KB pada S1, 70 KB pada S2, 201 KB pada S3). Proyeksi deterministik pada skenario S4 (1.000 </w:t>
+      </w:r>
+      <w:r>
+        <w:rPr>
+          <w:i/>
+        </w:rPr>
+        <w:t>tools</w:t>
+      </w:r>
+      <w:r>
+        <w:t>) memperkuat pola ini, dengan estimasi penghematan token mencapai −98%.</w:t>
+      </w:r>
+    </w:p>
+    <w:p>
+      <w:pPr>
+        <w:ind w:firstLine="720"/>
+        <w:jc w:val="both"/>
+      </w:pPr>
+      <w:r>
+        <w:t xml:space="preserve">Secara keseluruhan, penelitian ini membuktikan bahwa Tool Registry deterministik berbasis metadata merupakan solusi </w:t>
+      </w:r>
+      <w:r>
+        <w:rPr>
+          <w:i/>
+        </w:rPr>
+        <w:t>tool management</w:t>
+      </w:r>
+      <w:r>
+        <w:t xml:space="preserve"> yang efektif dan dapat diskalakan untuk AI Agent multi-modul. Kontribusi utama yang terbukti kuat secara statistik adalah penghematan token sebesar 63–95% yang memungkinkan platform zerlo.id diskalakan ke ratusan modul tanpa mengalami lonjakan biaya inferensi proporsional maupun degradasi konteks (</w:t>
+      </w:r>
+      <w:r>
+        <w:rPr>
+          <w:i/>
+        </w:rPr>
+        <w:t>context rot</w:t>
+      </w:r>
+      <w:r>
+        <w:t>), sementara perbaikan akurasi dan latensi merupakan manfaat tambahan yang konsisten meskipun belum signifikan secara statistik.</w:t>
+      </w:r>
+    </w:p>
+    <w:p>
+      <w:pPr>
+        <w:pStyle w:val="Heading2"/>
+      </w:pPr>
+      <w:r>
+        <w:t>5.2 Keterbatasan dan Ancaman Terhadap Validitas</w:t>
+      </w:r>
+    </w:p>
+    <w:p>
+      <w:pPr>
+        <w:ind w:firstLine="720"/>
+        <w:jc w:val="both"/>
+      </w:pPr>
+      <w:r>
+        <w:t>Hasil penelitian ini perlu ditafsirkan dalam kerangka keterbatasan eksperimen yang dirancang untuk kondisi terkontrol dan dapat direproduksi. Beberapa keterbatasan dan ancaman terhadap validitas diakui secara eksplisit demi menjaga kejujuran ilmiah.</w:t>
+      </w:r>
+    </w:p>
+    <w:p>
+      <w:pPr>
+        <w:ind w:firstLine="720"/>
+        <w:jc w:val="both"/>
+      </w:pPr>
+      <w:r>
+        <w:rPr>
+          <w:b/>
+        </w:rPr>
+        <w:t>Katalog dan skema *tool* yang sintetis.</w:t>
+      </w:r>
+      <w:r>
+        <w:t xml:space="preserve"> Katalog </w:t>
+      </w:r>
+      <w:r>
+        <w:rPr>
+          <w:i/>
+        </w:rPr>
+        <w:t>tool</w:t>
+      </w:r>
+      <w:r>
+        <w:t xml:space="preserve"> dibangun secara sintetis menggunakan generator berbasis modul dengan skema parameter dikosongkan (</w:t>
+      </w:r>
+      <w:r>
+        <w:rPr>
+          <w:rFonts w:ascii="Courier New" w:hAnsi="Courier New"/>
+        </w:rPr>
+        <w:t>properties: {}</w:t>
+      </w:r>
+      <w:r>
+        <w:t xml:space="preserve">) dan deskripsi berpola seragam. Akibatnya, model hanya dapat membedakan </w:t>
+      </w:r>
+      <w:r>
+        <w:rPr>
+          <w:i/>
+        </w:rPr>
+        <w:t>tool</w:t>
+      </w:r>
+      <w:r>
+        <w:t xml:space="preserve"> berdasarkan teks deskripsi pendek tanpa sinyal struktur parameter. Kondisi ini menekan akurasi absolut kedua mode secara setara sehingga akurasi yang terukur merupakan </w:t>
+      </w:r>
+      <w:r>
+        <w:rPr>
+          <w:i/>
+        </w:rPr>
+        <w:t>lower bound</w:t>
+      </w:r>
+      <w:r>
+        <w:t xml:space="preserve">; klaim keunggulan </w:t>
+      </w:r>
+      <w:r>
+        <w:rPr>
+          <w:i/>
+        </w:rPr>
+        <w:t>registry</w:t>
+      </w:r>
+      <w:r>
+        <w:t xml:space="preserve"> tetap valid karena kondisi ini berlaku identik pada </w:t>
+      </w:r>
+      <w:r>
+        <w:rPr>
+          <w:i/>
+        </w:rPr>
+        <w:t>baseline</w:t>
+      </w:r>
+      <w:r>
+        <w:t xml:space="preserve"> maupun </w:t>
+      </w:r>
+      <w:r>
+        <w:rPr>
+          <w:i/>
+        </w:rPr>
+        <w:t>registry</w:t>
+      </w:r>
+      <w:r>
+        <w:t>.</w:t>
+      </w:r>
+    </w:p>
+    <w:p>
+      <w:pPr>
+        <w:ind w:firstLine="720"/>
+        <w:jc w:val="both"/>
+      </w:pPr>
+      <w:r>
+        <w:rPr>
+          <w:b/>
+        </w:rPr>
+        <w:t>Kegagalan deterministik sebagai *confounding variable*.</w:t>
+      </w:r>
+      <w:r>
+        <w:t xml:space="preserve"> Sebagaimana dianalisis pada Subbab 4.9, empat hingga lima pola kueri gagal secara konsisten di seluruh pengulangan pada kedua mode. Seluruh </w:t>
+      </w:r>
+      <w:r>
+        <w:rPr>
+          <w:i/>
+        </w:rPr>
+        <w:t>tool</w:t>
+      </w:r>
+      <w:r>
+        <w:t xml:space="preserve"> yang keliru dipilih berada di modul yang sama dengan </w:t>
+      </w:r>
+      <w:r>
+        <w:rPr>
+          <w:i/>
+        </w:rPr>
+        <w:t>tool</w:t>
+      </w:r>
+      <w:r>
+        <w:t xml:space="preserve"> yang diharapkan — membuktikan penyaringan modul berfungsi benar, namun model gagal membedakan antar-</w:t>
+      </w:r>
+      <w:r>
+        <w:rPr>
+          <w:i/>
+        </w:rPr>
+        <w:t>tool</w:t>
+      </w:r>
+      <w:r>
+        <w:t xml:space="preserve"> intra-modul akibat deskripsi yang mirip. Kegagalan ini merupakan keterbatasan format deskripsi </w:t>
+      </w:r>
+      <w:r>
+        <w:rPr>
+          <w:i/>
+        </w:rPr>
+        <w:t>tool</w:t>
+      </w:r>
+      <w:r>
+        <w:t>, bukan kegagalan Tool Registry.</w:t>
+      </w:r>
+    </w:p>
+    <w:p>
+      <w:pPr>
+        <w:ind w:firstLine="720"/>
+        <w:jc w:val="both"/>
+      </w:pPr>
+      <w:r>
+        <w:rPr>
+          <w:b/>
+        </w:rPr>
+        <w:t>Cakupan eksperimen yang terbatas.</w:t>
+      </w:r>
+      <w:r>
+        <w:t xml:space="preserve"> Eksperimen utama menggunakan satu penyedia LLM (Gemini 2.5 Flash Lite), 100 kueri evaluasi, dan tiga pengulangan per kueri. Validasi multi-model pada MiniMax-M2.7 dan GLM-4.5-Flash melalui </w:t>
+      </w:r>
+      <w:r>
+        <w:rPr>
+          <w:i/>
+        </w:rPr>
+        <w:t>gateway</w:t>
+      </w:r>
+      <w:r>
+        <w:t xml:space="preserve"> ADACODE tidak dapat diperbandingkan secara valid karena keterbatasan </w:t>
+      </w:r>
+      <w:r>
+        <w:rPr>
+          <w:i/>
+        </w:rPr>
+        <w:t>harness</w:t>
+      </w:r>
+      <w:r>
+        <w:t xml:space="preserve"> pengukuran token dan ekstraksi pemanggilan </w:t>
+      </w:r>
+      <w:r>
+        <w:rPr>
+          <w:i/>
+        </w:rPr>
+        <w:t>tool</w:t>
+      </w:r>
+      <w:r>
+        <w:t xml:space="preserve"> (Subbab 4.10). Pengukuran latensi juga mencakup latensi jaringan ke API sehingga bukan ukuran murni latensi inferensi. Hasil resmi penelitian ini, dengan demikian, bersifat spesifik terhadap mekanisme </w:t>
+      </w:r>
+      <w:r>
+        <w:rPr>
+          <w:i/>
+        </w:rPr>
+        <w:t>native function calling</w:t>
+      </w:r>
+      <w:r>
+        <w:t xml:space="preserve"> Gemini 2.5 Flash Lite pada periode pengujian.</w:t>
+      </w:r>
+    </w:p>
+    <w:p>
+      <w:pPr>
+        <w:ind w:firstLine="720"/>
+        <w:jc w:val="both"/>
+      </w:pPr>
+      <w:r>
+        <w:rPr>
+          <w:b/>
+        </w:rPr>
+        <w:t>Validitas konstruk.</w:t>
+      </w:r>
+      <w:r>
+        <w:t xml:space="preserve"> Akurasi didefinisikan secara biner sebagai kecocokan nama fungsi (</w:t>
+      </w:r>
+      <w:r>
+        <w:rPr>
+          <w:rFonts w:ascii="Courier New" w:hAnsi="Courier New"/>
+        </w:rPr>
+        <w:t>selected_tool == expected_tool</w:t>
+      </w:r>
+      <w:r>
+        <w:t xml:space="preserve">), dengan asumsi setiap kueri memiliki tepat satu </w:t>
+      </w:r>
+      <w:r>
+        <w:rPr>
+          <w:i/>
+        </w:rPr>
+        <w:t>tool</w:t>
+      </w:r>
+      <w:r>
+        <w:t xml:space="preserve"> yang benar — sebuah penyederhanaan terhadap kondisi nyata yang dapat melibatkan beberapa </w:t>
+      </w:r>
+      <w:r>
+        <w:rPr>
+          <w:i/>
+        </w:rPr>
+        <w:t>tool</w:t>
+      </w:r>
+      <w:r>
+        <w:t xml:space="preserve"> alternatif atau rangkaian </w:t>
+      </w:r>
+      <w:r>
+        <w:rPr>
+          <w:i/>
+        </w:rPr>
+        <w:t>tool</w:t>
+      </w:r>
+      <w:r>
+        <w:t xml:space="preserve">. Token usage yang diukur berasal dari </w:t>
+      </w:r>
+      <w:r>
+        <w:rPr>
+          <w:rFonts w:ascii="Courier New" w:hAnsi="Courier New"/>
+        </w:rPr>
+        <w:t>usage_metadata</w:t>
+      </w:r>
+      <w:r>
+        <w:t xml:space="preserve"> API dan belum mencakup </w:t>
+      </w:r>
+      <w:r>
+        <w:rPr>
+          <w:i/>
+        </w:rPr>
+        <w:t>overhead</w:t>
+      </w:r>
+      <w:r>
+        <w:t xml:space="preserve"> dari </w:t>
+      </w:r>
+      <w:r>
+        <w:rPr>
+          <w:i/>
+        </w:rPr>
+        <w:t>system prompt</w:t>
+      </w:r>
+      <w:r>
+        <w:t xml:space="preserve"> maupun riwayat percakapan pada sistem </w:t>
+      </w:r>
+      <w:r>
+        <w:rPr>
+          <w:i/>
+        </w:rPr>
+        <w:t>production</w:t>
+      </w:r>
+      <w:r>
+        <w:t>.</w:t>
+      </w:r>
+    </w:p>
+    <w:p>
+      <w:pPr>
+        <w:ind w:firstLine="720"/>
+        <w:jc w:val="both"/>
+      </w:pPr>
+      <w:r>
+        <w:t>Tabel 5.1 merangkum pemetaan antara ancaman terhadap validitas, mitigasi yang diterapkan pada penelitian ini, dan arah penyempurnaan pada penelitian lanjutan.</w:t>
+      </w:r>
+    </w:p>
+    <w:p>
+      <w:pPr>
+        <w:pStyle w:val="Caption"/>
+        <w:keepNext/>
+        <w:jc w:val="center"/>
+      </w:pPr>
+      <w:r>
+        <w:t>Tabel 5.</w:t>
+      </w:r>
+      <w:fldSimple w:instr=" SEQ Tabel \* ARABIC \s 1 ">
+        <w:r>
+          <w:t>1</w:t>
+        </w:r>
+      </w:fldSimple>
+      <w:r>
+        <w:t xml:space="preserve"> Ancaman Terhadap Validitas, Mitigasi, dan Penelitian Lanjutan</w:t>
+      </w:r>
+    </w:p>
+    <w:tbl>
+      <w:tblPr>
+        <w:tblW w:type="auto" w:w="0"/>
+        <w:jc w:val="center"/>
+        <w:tblLook w:firstColumn="1" w:firstRow="1" w:lastColumn="0" w:lastRow="0" w:noHBand="0" w:noVBand="1" w:val="04A0"/>
+        <w:tblBorders>
+          <w:top w:val="single" w:sz="8" w:space="0" w:color="000000"/>
+          <w:bottom w:val="single" w:sz="8" w:space="0" w:color="000000"/>
+          <w:left w:val="none"/>
+          <w:right w:val="none"/>
+          <w:insideH w:val="none"/>
+          <w:insideV w:val="none"/>
+        </w:tblBorders>
+      </w:tblPr>
+      <w:tblGrid>
+        <w:gridCol w:w="2646"/>
+        <w:gridCol w:w="2646"/>
+        <w:gridCol w:w="2646"/>
+      </w:tblGrid>
+      <w:tr>
+        <w:trPr>
+          <w:cantSplit/>
+          <w:tblHeader/>
+        </w:trPr>
+        <w:tc>
+          <w:tcPr>
+            <w:tcW w:type="dxa" w:w="2646"/>
+            <w:tcBorders>
+              <w:top w:val="none"/>
+              <w:bottom w:val="single" w:sz="8" w:space="0" w:color="000000"/>
+              <w:left w:val="none"/>
+              <w:right w:val="none"/>
+            </w:tcBorders>
+          </w:tcPr>
+          <w:p>
+            <w:pPr>
+              <w:spacing w:line="240" w:lineRule="auto" w:after="0"/>
+            </w:pPr>
+            <w:r>
+              <w:rPr>
+                <w:b/>
+                <w:sz w:val="20"/>
+              </w:rPr>
+            </w:r>
+            <w:r>
+              <w:rPr>
+                <w:b/>
+                <w:sz w:val="20"/>
+              </w:rPr>
+              <w:t>Ancaman</w:t>
+            </w:r>
+          </w:p>
+        </w:tc>
+        <w:tc>
+          <w:tcPr>
+            <w:tcW w:type="dxa" w:w="2646"/>
+            <w:tcBorders>
+              <w:top w:val="none"/>
+              <w:bottom w:val="single" w:sz="8" w:space="0" w:color="000000"/>
+              <w:left w:val="none"/>
+              <w:right w:val="none"/>
+            </w:tcBorders>
+          </w:tcPr>
+          <w:p>
+            <w:pPr>
+              <w:spacing w:line="240" w:lineRule="auto" w:after="0"/>
+            </w:pPr>
+            <w:r>
+              <w:rPr>
+                <w:b/>
+                <w:sz w:val="20"/>
+              </w:rPr>
+            </w:r>
+            <w:r>
+              <w:rPr>
+                <w:b/>
+                <w:sz w:val="20"/>
+              </w:rPr>
+              <w:t>Mitigasi pada Penelitian Ini</w:t>
+            </w:r>
+          </w:p>
+        </w:tc>
+        <w:tc>
+          <w:tcPr>
+            <w:tcW w:type="dxa" w:w="2646"/>
+            <w:tcBorders>
+              <w:top w:val="none"/>
+              <w:bottom w:val="single" w:sz="8" w:space="0" w:color="000000"/>
+              <w:left w:val="none"/>
+              <w:right w:val="none"/>
+            </w:tcBorders>
+          </w:tcPr>
+          <w:p>
+            <w:pPr>
+              <w:spacing w:line="240" w:lineRule="auto" w:after="0"/>
+            </w:pPr>
+            <w:r>
+              <w:rPr>
+                <w:b/>
+                <w:sz w:val="20"/>
+              </w:rPr>
+            </w:r>
+            <w:r>
+              <w:rPr>
+                <w:b/>
+                <w:sz w:val="20"/>
+              </w:rPr>
+              <w:t>Penelitian Lanjutan</w:t>
+            </w:r>
+          </w:p>
+        </w:tc>
+      </w:tr>
+      <w:tr>
+        <w:trPr>
+          <w:cantSplit/>
+        </w:trPr>
+        <w:tc>
+          <w:tcPr>
+            <w:tcW w:type="dxa" w:w="2646"/>
+          </w:tcPr>
+          <w:p>
+            <w:pPr>
+              <w:spacing w:line="240" w:lineRule="auto" w:after="0"/>
+            </w:pPr>
+            <w:r>
+              <w:rPr>
+                <w:sz w:val="20"/>
+              </w:rPr>
+            </w:r>
+            <w:r>
+              <w:rPr>
+                <w:sz w:val="20"/>
+              </w:rPr>
+              <w:t xml:space="preserve">Katalog </w:t>
+            </w:r>
+            <w:r>
+              <w:rPr>
+                <w:i/>
+                <w:sz w:val="20"/>
+              </w:rPr>
+              <w:t>tool</w:t>
+            </w:r>
+            <w:r>
+              <w:rPr>
+                <w:sz w:val="20"/>
+              </w:rPr>
+              <w:t xml:space="preserve"> sintetis</w:t>
+            </w:r>
+          </w:p>
+        </w:tc>
+        <w:tc>
+          <w:tcPr>
+            <w:tcW w:type="dxa" w:w="2646"/>
+          </w:tcPr>
+          <w:p>
+            <w:pPr>
+              <w:spacing w:line="240" w:lineRule="auto" w:after="0"/>
+            </w:pPr>
+            <w:r>
+              <w:rPr>
+                <w:sz w:val="20"/>
+              </w:rPr>
+            </w:r>
+            <w:r>
+              <w:rPr>
+                <w:i/>
+                <w:sz w:val="20"/>
+              </w:rPr>
+              <w:t>Tool</w:t>
+            </w:r>
+            <w:r>
+              <w:rPr>
+                <w:sz w:val="20"/>
+              </w:rPr>
+              <w:t xml:space="preserve"> menyerupai domain ERP; skema seragam dikontrol antar-mode</w:t>
+            </w:r>
+          </w:p>
+        </w:tc>
+        <w:tc>
+          <w:tcPr>
+            <w:tcW w:type="dxa" w:w="2646"/>
+          </w:tcPr>
+          <w:p>
+            <w:pPr>
+              <w:spacing w:line="240" w:lineRule="auto" w:after="0"/>
+            </w:pPr>
+            <w:r>
+              <w:rPr>
+                <w:sz w:val="20"/>
+              </w:rPr>
+            </w:r>
+            <w:r>
+              <w:rPr>
+                <w:sz w:val="20"/>
+              </w:rPr>
+              <w:t xml:space="preserve">Uji dengan katalog </w:t>
+            </w:r>
+            <w:r>
+              <w:rPr>
+                <w:i/>
+                <w:sz w:val="20"/>
+              </w:rPr>
+              <w:t>production</w:t>
+            </w:r>
+            <w:r>
+              <w:rPr>
+                <w:sz w:val="20"/>
+              </w:rPr>
+              <w:t xml:space="preserve"> zerlo.id yang sesungguhnya</w:t>
+            </w:r>
+          </w:p>
+        </w:tc>
+      </w:tr>
+      <w:tr>
+        <w:trPr>
+          <w:cantSplit/>
+        </w:trPr>
+        <w:tc>
+          <w:tcPr>
+            <w:tcW w:type="dxa" w:w="2646"/>
+          </w:tcPr>
+          <w:p>
+            <w:pPr>
+              <w:spacing w:line="240" w:lineRule="auto" w:after="0"/>
+            </w:pPr>
+            <w:r>
+              <w:rPr>
+                <w:sz w:val="20"/>
+              </w:rPr>
+            </w:r>
+            <w:r>
+              <w:rPr>
+                <w:sz w:val="20"/>
+              </w:rPr>
+              <w:t>Skema parameter kosong</w:t>
+            </w:r>
+          </w:p>
+        </w:tc>
+        <w:tc>
+          <w:tcPr>
+            <w:tcW w:type="dxa" w:w="2646"/>
+          </w:tcPr>
+          <w:p>
+            <w:pPr>
+              <w:spacing w:line="240" w:lineRule="auto" w:after="0"/>
+            </w:pPr>
+            <w:r>
+              <w:rPr>
+                <w:sz w:val="20"/>
+              </w:rPr>
+            </w:r>
+            <w:r>
+              <w:rPr>
+                <w:sz w:val="20"/>
+              </w:rPr>
+              <w:t xml:space="preserve">Kondisi identik pada </w:t>
+            </w:r>
+            <w:r>
+              <w:rPr>
+                <w:i/>
+                <w:sz w:val="20"/>
+              </w:rPr>
+              <w:t>baseline</w:t>
+            </w:r>
+            <w:r>
+              <w:rPr>
+                <w:sz w:val="20"/>
+              </w:rPr>
+              <w:t xml:space="preserve"> dan </w:t>
+            </w:r>
+            <w:r>
+              <w:rPr>
+                <w:i/>
+                <w:sz w:val="20"/>
+              </w:rPr>
+              <w:t>registry</w:t>
+            </w:r>
+            <w:r>
+              <w:rPr>
+                <w:sz w:val="20"/>
+              </w:rPr>
+              <w:t>; klaim tetap valid</w:t>
+            </w:r>
+          </w:p>
+        </w:tc>
+        <w:tc>
+          <w:tcPr>
+            <w:tcW w:type="dxa" w:w="2646"/>
+          </w:tcPr>
+          <w:p>
+            <w:pPr>
+              <w:spacing w:line="240" w:lineRule="auto" w:after="0"/>
+            </w:pPr>
+            <w:r>
+              <w:rPr>
+                <w:sz w:val="20"/>
+              </w:rPr>
+            </w:r>
+            <w:r>
+              <w:rPr>
+                <w:sz w:val="20"/>
+              </w:rPr>
+              <w:t>Tambahkan skema parameter lengkap untuk mengukur dampaknya</w:t>
+            </w:r>
+          </w:p>
+        </w:tc>
+      </w:tr>
+      <w:tr>
+        <w:trPr>
+          <w:cantSplit/>
+        </w:trPr>
+        <w:tc>
+          <w:tcPr>
+            <w:tcW w:type="dxa" w:w="2646"/>
+          </w:tcPr>
+          <w:p>
+            <w:pPr>
+              <w:spacing w:line="240" w:lineRule="auto" w:after="0"/>
+            </w:pPr>
+            <w:r>
+              <w:rPr>
+                <w:sz w:val="20"/>
+              </w:rPr>
+            </w:r>
+            <w:r>
+              <w:rPr>
+                <w:sz w:val="20"/>
+              </w:rPr>
+              <w:t>Dataset evaluasi kecil</w:t>
+            </w:r>
+          </w:p>
+        </w:tc>
+        <w:tc>
+          <w:tcPr>
+            <w:tcW w:type="dxa" w:w="2646"/>
+          </w:tcPr>
+          <w:p>
+            <w:pPr>
+              <w:spacing w:line="240" w:lineRule="auto" w:after="0"/>
+            </w:pPr>
+            <w:r>
+              <w:rPr>
+                <w:sz w:val="20"/>
+              </w:rPr>
+            </w:r>
+            <w:r>
+              <w:rPr>
+                <w:sz w:val="20"/>
+              </w:rPr>
+              <w:t>100 kueri (50/30/20), 3 pengulangan, uji Wilcoxon + Cohen's d + CI 95%</w:t>
+            </w:r>
+          </w:p>
+        </w:tc>
+        <w:tc>
+          <w:tcPr>
+            <w:tcW w:type="dxa" w:w="2646"/>
+          </w:tcPr>
+          <w:p>
+            <w:pPr>
+              <w:spacing w:line="240" w:lineRule="auto" w:after="0"/>
+            </w:pPr>
+            <w:r>
+              <w:rPr>
+                <w:sz w:val="20"/>
+              </w:rPr>
+            </w:r>
+            <w:r>
+              <w:rPr>
+                <w:sz w:val="20"/>
+              </w:rPr>
+              <w:t>Perluas ke 300+ kueri dengan distribusi lebih representatif</w:t>
+            </w:r>
+          </w:p>
+        </w:tc>
+      </w:tr>
+      <w:tr>
+        <w:trPr>
+          <w:cantSplit/>
+        </w:trPr>
+        <w:tc>
+          <w:tcPr>
+            <w:tcW w:type="dxa" w:w="2646"/>
+          </w:tcPr>
+          <w:p>
+            <w:pPr>
+              <w:spacing w:line="240" w:lineRule="auto" w:after="0"/>
+            </w:pPr>
+            <w:r>
+              <w:rPr>
+                <w:sz w:val="20"/>
+              </w:rPr>
+            </w:r>
+            <w:r>
+              <w:rPr>
+                <w:sz w:val="20"/>
+              </w:rPr>
+              <w:t>Satu penyedia LLM</w:t>
+            </w:r>
+          </w:p>
+        </w:tc>
+        <w:tc>
+          <w:tcPr>
+            <w:tcW w:type="dxa" w:w="2646"/>
+          </w:tcPr>
+          <w:p>
+            <w:pPr>
+              <w:spacing w:line="240" w:lineRule="auto" w:after="0"/>
+            </w:pPr>
+            <w:r>
+              <w:rPr>
+                <w:sz w:val="20"/>
+              </w:rPr>
+            </w:r>
+            <w:r>
+              <w:rPr>
+                <w:sz w:val="20"/>
+              </w:rPr>
+              <w:t xml:space="preserve">Fokus pada Gemini sesuai </w:t>
+            </w:r>
+            <w:r>
+              <w:rPr>
+                <w:i/>
+                <w:sz w:val="20"/>
+              </w:rPr>
+              <w:t>stack production</w:t>
+            </w:r>
+            <w:r>
+              <w:rPr>
+                <w:sz w:val="20"/>
+              </w:rPr>
+              <w:t xml:space="preserve"> zerlo.id</w:t>
+            </w:r>
+          </w:p>
+        </w:tc>
+        <w:tc>
+          <w:tcPr>
+            <w:tcW w:type="dxa" w:w="2646"/>
+          </w:tcPr>
+          <w:p>
+            <w:pPr>
+              <w:spacing w:line="240" w:lineRule="auto" w:after="0"/>
+            </w:pPr>
+            <w:r>
+              <w:rPr>
+                <w:sz w:val="20"/>
+              </w:rPr>
+            </w:r>
+            <w:r>
+              <w:rPr>
+                <w:sz w:val="20"/>
+              </w:rPr>
+              <w:t xml:space="preserve">Validasi lintas model (Claude, GPT-4o, MiniMax) dengan </w:t>
+            </w:r>
+            <w:r>
+              <w:rPr>
+                <w:i/>
+                <w:sz w:val="20"/>
+              </w:rPr>
+              <w:t>harness</w:t>
+            </w:r>
+            <w:r>
+              <w:rPr>
+                <w:sz w:val="20"/>
+              </w:rPr>
+              <w:t xml:space="preserve"> per-penyedia</w:t>
+            </w:r>
+          </w:p>
+        </w:tc>
+      </w:tr>
+      <w:tr>
+        <w:trPr>
+          <w:cantSplit/>
+        </w:trPr>
+        <w:tc>
+          <w:tcPr>
+            <w:tcW w:type="dxa" w:w="2646"/>
+          </w:tcPr>
+          <w:p>
+            <w:pPr>
+              <w:spacing w:line="240" w:lineRule="auto" w:after="0"/>
+            </w:pPr>
+            <w:r>
+              <w:rPr>
+                <w:sz w:val="20"/>
+              </w:rPr>
+            </w:r>
+            <w:r>
+              <w:rPr>
+                <w:sz w:val="20"/>
+              </w:rPr>
+              <w:t>Kegagalan deterministik</w:t>
+            </w:r>
+          </w:p>
+        </w:tc>
+        <w:tc>
+          <w:tcPr>
+            <w:tcW w:type="dxa" w:w="2646"/>
+          </w:tcPr>
+          <w:p>
+            <w:pPr>
+              <w:spacing w:line="240" w:lineRule="auto" w:after="0"/>
+            </w:pPr>
+            <w:r>
+              <w:rPr>
+                <w:sz w:val="20"/>
+              </w:rPr>
+            </w:r>
+            <w:r>
+              <w:rPr>
+                <w:sz w:val="20"/>
+              </w:rPr>
+              <w:t xml:space="preserve">Dianalisis per kueri; didokumentasikan sebagai </w:t>
+            </w:r>
+            <w:r>
+              <w:rPr>
+                <w:i/>
+                <w:sz w:val="20"/>
+              </w:rPr>
+              <w:t>threat</w:t>
+            </w:r>
+          </w:p>
+        </w:tc>
+        <w:tc>
+          <w:tcPr>
+            <w:tcW w:type="dxa" w:w="2646"/>
+          </w:tcPr>
+          <w:p>
+            <w:pPr>
+              <w:spacing w:line="240" w:lineRule="auto" w:after="0"/>
+            </w:pPr>
+            <w:r>
+              <w:rPr>
+                <w:sz w:val="20"/>
+              </w:rPr>
+            </w:r>
+            <w:r>
+              <w:rPr>
+                <w:i/>
+                <w:sz w:val="20"/>
+              </w:rPr>
+              <w:t>Two-stage</w:t>
+            </w:r>
+            <w:r>
+              <w:rPr>
+                <w:sz w:val="20"/>
+              </w:rPr>
+              <w:t xml:space="preserve">: penyaringan </w:t>
+            </w:r>
+            <w:r>
+              <w:rPr>
+                <w:i/>
+                <w:sz w:val="20"/>
+              </w:rPr>
+              <w:t>registry</w:t>
+            </w:r>
+            <w:r>
+              <w:rPr>
+                <w:sz w:val="20"/>
+              </w:rPr>
+              <w:t xml:space="preserve"> → </w:t>
+            </w:r>
+            <w:r>
+              <w:rPr>
+                <w:i/>
+                <w:sz w:val="20"/>
+              </w:rPr>
+              <w:t>intent</w:t>
+            </w:r>
+            <w:r>
+              <w:rPr>
+                <w:sz w:val="20"/>
+              </w:rPr>
+              <w:t xml:space="preserve"> unik per </w:t>
+            </w:r>
+            <w:r>
+              <w:rPr>
+                <w:i/>
+                <w:sz w:val="20"/>
+              </w:rPr>
+              <w:t>tool</w:t>
+            </w:r>
+          </w:p>
+        </w:tc>
+      </w:tr>
+      <w:tr>
+        <w:trPr>
+          <w:cantSplit/>
+        </w:trPr>
+        <w:tc>
+          <w:tcPr>
+            <w:tcW w:type="dxa" w:w="2646"/>
+          </w:tcPr>
+          <w:p>
+            <w:pPr>
+              <w:spacing w:line="240" w:lineRule="auto" w:after="0"/>
+            </w:pPr>
+            <w:r>
+              <w:rPr>
+                <w:sz w:val="20"/>
+              </w:rPr>
+            </w:r>
+            <w:r>
+              <w:rPr>
+                <w:sz w:val="20"/>
+              </w:rPr>
+              <w:t>Latensi jaringan</w:t>
+            </w:r>
+          </w:p>
+        </w:tc>
+        <w:tc>
+          <w:tcPr>
+            <w:tcW w:type="dxa" w:w="2646"/>
+          </w:tcPr>
+          <w:p>
+            <w:pPr>
+              <w:spacing w:line="240" w:lineRule="auto" w:after="0"/>
+            </w:pPr>
+            <w:r>
+              <w:rPr>
+                <w:sz w:val="20"/>
+              </w:rPr>
+            </w:r>
+            <w:r>
+              <w:rPr>
+                <w:sz w:val="20"/>
+              </w:rPr>
+              <w:t xml:space="preserve">Dilaporkan sebagai p50/p95 </w:t>
+            </w:r>
+            <w:r>
+              <w:rPr>
+                <w:i/>
+                <w:sz w:val="20"/>
+              </w:rPr>
+              <w:t>wall-clock</w:t>
+            </w:r>
+            <w:r>
+              <w:rPr>
+                <w:sz w:val="20"/>
+              </w:rPr>
+              <w:t>; metrik komparatif tetap valid</w:t>
+            </w:r>
+          </w:p>
+        </w:tc>
+        <w:tc>
+          <w:tcPr>
+            <w:tcW w:type="dxa" w:w="2646"/>
+          </w:tcPr>
+          <w:p>
+            <w:pPr>
+              <w:spacing w:line="240" w:lineRule="auto" w:after="0"/>
+            </w:pPr>
+            <w:r>
+              <w:rPr>
+                <w:sz w:val="20"/>
+              </w:rPr>
+            </w:r>
+            <w:r>
+              <w:rPr>
+                <w:sz w:val="20"/>
+              </w:rPr>
+              <w:t>Pisahkan latensi jaringan dari latensi inferensi</w:t>
+            </w:r>
+          </w:p>
+        </w:tc>
+      </w:tr>
+    </w:tbl>
+    <w:p>
+      <w:pPr>
+        <w:pStyle w:val="Heading2"/>
+      </w:pPr>
+      <w:r>
+        <w:t>5.3 Saran / Future Work</w:t>
+      </w:r>
+    </w:p>
+    <w:p>
+      <w:pPr>
+        <w:ind w:firstLine="720"/>
+        <w:jc w:val="both"/>
+      </w:pPr>
+      <w:r>
+        <w:t>Berdasarkan temuan dan keterbatasan di atas, beberapa arah penelitian lanjutan direkomendasikan.</w:t>
+      </w:r>
+    </w:p>
+    <w:p>
+      <w:pPr>
+        <w:ind w:left="567" w:hanging="283"/>
+        <w:jc w:val="both"/>
+      </w:pPr>
+      <w:r>
+        <w:t xml:space="preserve">1. </w:t>
+      </w:r>
+      <w:r>
+        <w:rPr>
+          <w:b/>
+        </w:rPr>
+        <w:t>Integrasi *Tool RAG* berbasis vektor untuk skala ribuan *tool*.</w:t>
+      </w:r>
+      <w:r>
+        <w:t xml:space="preserve"> Tool Registry deterministik efektif pada skala ratusan </w:t>
+      </w:r>
+      <w:r>
+        <w:rPr>
+          <w:i/>
+        </w:rPr>
+        <w:t>tool</w:t>
+      </w:r>
+      <w:r>
+        <w:t xml:space="preserve">, tetapi pada skala ribuan </w:t>
+      </w:r>
+      <w:r>
+        <w:rPr>
+          <w:i/>
+        </w:rPr>
+        <w:t>tool</w:t>
+      </w:r>
+      <w:r>
+        <w:t xml:space="preserve"> — sebagaimana dilaporkan MCP-Flow dengan 11.536 </w:t>
+      </w:r>
+      <w:r>
+        <w:rPr>
+          <w:i/>
+        </w:rPr>
+        <w:t>tools</w:t>
+      </w:r>
+      <w:r>
+        <w:t xml:space="preserve"> [1] — penyaringan berbasis kata kunci dapat menjadi kurang presisi. Penggabungan dengan pendekatan </w:t>
+      </w:r>
+      <w:r>
+        <w:rPr>
+          <w:i/>
+        </w:rPr>
+        <w:t>Retrieval-Augmented Generation</w:t>
+      </w:r>
+      <w:r>
+        <w:t xml:space="preserve"> berbasis </w:t>
+      </w:r>
+      <w:r>
+        <w:rPr>
+          <w:i/>
+        </w:rPr>
+        <w:t>embedding</w:t>
+      </w:r>
+      <w:r>
+        <w:t xml:space="preserve"> seperti Gorilla [2] dan Toolshed [3] berpotensi mempertahankan presisi pada skala yang jauh lebih besar.</w:t>
+      </w:r>
+    </w:p>
+    <w:p>
+      <w:pPr>
+        <w:ind w:left="567" w:hanging="283"/>
+        <w:jc w:val="both"/>
+      </w:pPr>
+      <w:r>
+        <w:t xml:space="preserve">2. </w:t>
+      </w:r>
+      <w:r>
+        <w:rPr>
+          <w:b/>
+        </w:rPr>
+        <w:t>Pendekatan hibrida *two-stage*: penyaringan *registry* diikuti deskripsi kaya per *tool*.</w:t>
+      </w:r>
+      <w:r>
+        <w:t xml:space="preserve"> Eksperimen Gemini Rich (Subbab 4.1) menunjukkan bahwa </w:t>
+      </w:r>
+      <w:r>
+        <w:rPr>
+          <w:i/>
+        </w:rPr>
+        <w:t>template intent</w:t>
+      </w:r>
+      <w:r>
+        <w:t xml:space="preserve"> generik justru menurunkan akurasi </w:t>
+      </w:r>
+      <w:r>
+        <w:rPr>
+          <w:i/>
+        </w:rPr>
+        <w:t>registry</w:t>
+      </w:r>
+      <w:r>
+        <w:t xml:space="preserve"> sebesar 9–11 persentase poin karena identik untuk seluruh </w:t>
+      </w:r>
+      <w:r>
+        <w:rPr>
+          <w:i/>
+        </w:rPr>
+        <w:t>tool</w:t>
+      </w:r>
+      <w:r>
+        <w:t xml:space="preserve"> dengan </w:t>
+      </w:r>
+      <w:r>
+        <w:rPr>
+          <w:i/>
+        </w:rPr>
+        <w:t>op_type</w:t>
+      </w:r>
+      <w:r>
+        <w:t xml:space="preserve"> yang sama. Temuan ini menegaskan bahwa kualitas deskripsi berarti </w:t>
+      </w:r>
+      <w:r>
+        <w:rPr>
+          <w:b/>
+        </w:rPr>
+        <w:t>keunikan per *tool</w:t>
+      </w:r>
+      <w:r>
+        <w:rPr>
+          <w:i/>
+        </w:rPr>
+        <w:t xml:space="preserve">, bukan panjang teks. Penelitian lanjutan dapat menguji arsitektur dua tahap: tahap pertama menyaring kandidat dengan </w:t>
+      </w:r>
+      <w:r>
+        <w:t>registry</w:t>
+      </w:r>
+      <w:r>
+        <w:rPr>
+          <w:i/>
+        </w:rPr>
+        <w:t xml:space="preserve"> (penghematan token besar), tahap kedua menyuntikkan </w:t>
+      </w:r>
+      <w:r>
+        <w:t>docstring</w:t>
+      </w:r>
+      <w:r>
+        <w:rPr>
+          <w:i/>
+        </w:rPr>
+        <w:t xml:space="preserve"> unik per </w:t>
+      </w:r>
+      <w:r>
+        <w:t>tool* hanya untuk kandidat terpilih — sehingga akurasi intra-modul meningkat tanpa membengkakkan token.</w:t>
+      </w:r>
+    </w:p>
+    <w:p>
+      <w:pPr>
+        <w:ind w:left="567" w:hanging="283"/>
+        <w:jc w:val="both"/>
+      </w:pPr>
+      <w:r>
+        <w:t xml:space="preserve">3. </w:t>
+      </w:r>
+      <w:r>
+        <w:rPr>
+          <w:b/>
+        </w:rPr>
+        <w:t>Penambahan skema parameter lengkap.</w:t>
+      </w:r>
+      <w:r>
+        <w:t xml:space="preserve"> Pengisian skema parameter yang bertipe dan bernama spesifik diharapkan dapat menaikkan </w:t>
+      </w:r>
+      <w:r>
+        <w:rPr>
+          <w:i/>
+        </w:rPr>
+        <w:t>ceiling</w:t>
+      </w:r>
+      <w:r>
+        <w:t xml:space="preserve"> akurasi yang pada eksperimen ini tertahan oleh skema kosong, sekaligus mengatasi sebagian besar kegagalan deterministik intra-modul.</w:t>
+      </w:r>
+    </w:p>
+    <w:p>
+      <w:pPr>
+        <w:ind w:left="567" w:hanging="283"/>
+        <w:jc w:val="both"/>
+      </w:pPr>
+      <w:r>
+        <w:t xml:space="preserve">4. </w:t>
+      </w:r>
+      <w:r>
+        <w:rPr>
+          <w:b/>
+        </w:rPr>
+        <w:t>Validasi multi-model dengan *harness* pengukuran per-penyedia.</w:t>
+      </w:r>
+      <w:r>
+        <w:t xml:space="preserve"> Perbandingan lintas penyedia LLM (Claude Sonnet 4.6, GPT-4o, MiniMax-M2.7, GLM-4.5-Flash) memerlukan adaptasi </w:t>
+      </w:r>
+      <w:r>
+        <w:rPr>
+          <w:i/>
+        </w:rPr>
+        <w:t>harness</w:t>
+      </w:r>
+      <w:r>
+        <w:t xml:space="preserve"> penghitungan token dan ekstraksi pemanggilan </w:t>
+      </w:r>
+      <w:r>
+        <w:rPr>
+          <w:i/>
+        </w:rPr>
+        <w:t>tool</w:t>
+      </w:r>
+      <w:r>
+        <w:t xml:space="preserve"> agar setara dengan </w:t>
+      </w:r>
+      <w:r>
+        <w:rPr>
+          <w:i/>
+        </w:rPr>
+        <w:t>native function calling</w:t>
+      </w:r>
+      <w:r>
+        <w:t xml:space="preserve"> Gemini, sehingga generalisabilitas temuan dapat diuji secara valid.</w:t>
+      </w:r>
+    </w:p>
+    <w:p>
+      <w:pPr>
+        <w:ind w:left="567" w:hanging="283"/>
+        <w:jc w:val="both"/>
+      </w:pPr>
+      <w:r>
+        <w:t xml:space="preserve">5. </w:t>
+      </w:r>
+      <w:r>
+        <w:rPr>
+          <w:b/>
+        </w:rPr>
+        <w:t>Integrasi produksi penuh dan evaluasi berkelanjutan.</w:t>
+      </w:r>
+      <w:r>
+        <w:t xml:space="preserve"> Penerapan Tool Registry pada lingkungan </w:t>
+      </w:r>
+      <w:r>
+        <w:rPr>
+          <w:i/>
+        </w:rPr>
+        <w:t>production</w:t>
+      </w:r>
+      <w:r>
+        <w:t xml:space="preserve"> zerlo.id secara penuh — mencakup penyaringan berbasis </w:t>
+      </w:r>
+      <w:r>
+        <w:rPr>
+          <w:i/>
+        </w:rPr>
+        <w:t>role</w:t>
+      </w:r>
+      <w:r>
+        <w:t xml:space="preserve"> (RBAC), </w:t>
+      </w:r>
+      <w:r>
+        <w:rPr>
+          <w:i/>
+        </w:rPr>
+        <w:t>gating</w:t>
+      </w:r>
+      <w:r>
+        <w:t xml:space="preserve"> berdasarkan </w:t>
+      </w:r>
+      <w:r>
+        <w:rPr>
+          <w:i/>
+        </w:rPr>
+        <w:t>tier</w:t>
+      </w:r>
+      <w:r>
+        <w:t xml:space="preserve"> langganan, dan 80+ </w:t>
+      </w:r>
+      <w:r>
+        <w:rPr>
+          <w:i/>
+        </w:rPr>
+        <w:t>tool</w:t>
+      </w:r>
+      <w:r>
+        <w:t xml:space="preserve"> aktif — perlu dievaluasi menggunakan </w:t>
+      </w:r>
+      <w:r>
+        <w:rPr>
+          <w:i/>
+        </w:rPr>
+        <w:t>log</w:t>
+      </w:r>
+      <w:r>
+        <w:t xml:space="preserve"> kueri pengguna nyata secara berkelanjutan, untuk memvalidasi temuan eksperimen pada distribusi kueri produksi yang sesungguhnya.</w:t>
+      </w:r>
+    </w:p>
+    <w:p>
+      <w:pPr>
+        <w:keepNext/>
+        <w:spacing w:before="240"/>
+      </w:pPr>
+      <w:r>
+        <w:rPr>
+          <w:b/>
+        </w:rPr>
+        <w:t>Referensi Bab V</w:t>
+      </w:r>
+    </w:p>
+    <w:p>
+      <w:pPr>
+        <w:keepLines/>
+        <w:spacing w:after="120"/>
+        <w:ind w:left="567" w:hanging="567"/>
+        <w:jc w:val="both"/>
+      </w:pPr>
+      <w:r>
+        <w:t xml:space="preserve">[1] W. Wang et al., "MCP-Flow: Facilitating LLM agents to master real-world, diverse and scaling MCP tools," in </w:t>
+      </w:r>
+      <w:r>
+        <w:rPr>
+          <w:i/>
+        </w:rPr>
+        <w:t>Proc. Assoc. Comput. Linguistics (ACL)</w:t>
+      </w:r>
+      <w:r>
+        <w:t>, 2026. arXiv:2510.24284.</w:t>
+      </w:r>
+    </w:p>
+    <w:p>
+      <w:pPr>
+        <w:keepLines/>
+        <w:spacing w:after="120"/>
+        <w:ind w:left="567" w:hanging="567"/>
+        <w:jc w:val="both"/>
+      </w:pPr>
+      <w:r>
+        <w:t xml:space="preserve">[2] S.G. Patil, T. Zhang, X. Wang, dan J.E. Gonzalez, "Gorilla: Large language model connected with massive APIs," in </w:t>
+      </w:r>
+      <w:r>
+        <w:rPr>
+          <w:i/>
+        </w:rPr>
+        <w:t>Proc. Adv. Neural Inf. Process. Syst. (NeurIPS)</w:t>
+      </w:r>
+      <w:r>
+        <w:t>, 2024. arXiv:2305.15334.</w:t>
+      </w:r>
+    </w:p>
+    <w:p>
+      <w:pPr>
+        <w:keepLines/>
+        <w:spacing w:after="120"/>
+        <w:ind w:left="567" w:hanging="567"/>
+        <w:jc w:val="both"/>
+      </w:pPr>
+      <w:r>
+        <w:t>[3] E. Lumer, "Toolshed: Scale tool-equipped agents with advanced RAG-tool fusion and tool knowledge bases," arXiv:2410.14594, 2024.</w:t>
       </w:r>
     </w:p>
     <w:p>

</xml_diff>